<commit_message>
Actualizar codigo y documentos
</commit_message>
<xml_diff>
--- a/Documentos/Informe_Final_MarcoVásquez.docx
+++ b/Documentos/Informe_Final_MarcoVásquez.docx
@@ -175,15 +175,7 @@
                                 <w:sz w:val="52"/>
                                 <w:lang w:val="es-ES"/>
                               </w:rPr>
-                              <w:t xml:space="preserve">Semana: </w:t>
-                            </w:r>
-                            <w:r>
-                              <w:rPr>
-                                <w:color w:val="D9D9D9" w:themeColor="background1" w:themeShade="D9"/>
-                                <w:sz w:val="52"/>
-                                <w:lang w:val="es-ES"/>
-                              </w:rPr>
-                              <w:t>9</w:t>
+                              <w:t>Semana: 9</w:t>
                             </w:r>
                           </w:p>
                           <w:p>
@@ -751,7 +743,11 @@
     <w:sdt>
       <w:sdtPr>
         <w:rPr>
-          <w:lang w:val="es-ES"/>
+          <w:rFonts w:asciiTheme="minorHAnsi" w:eastAsiaTheme="minorHAnsi" w:hAnsiTheme="minorHAnsi" w:cstheme="minorBidi"/>
+          <w:color w:val="auto"/>
+          <w:sz w:val="22"/>
+          <w:szCs w:val="22"/>
+          <w:lang w:val="es-ES" w:eastAsia="en-US"/>
         </w:rPr>
         <w:id w:val="-1348483805"/>
         <w:docPartObj>
@@ -761,13 +757,8 @@
       </w:sdtPr>
       <w:sdtEndPr>
         <w:rPr>
-          <w:rFonts w:asciiTheme="minorHAnsi" w:eastAsiaTheme="minorHAnsi" w:hAnsiTheme="minorHAnsi" w:cstheme="minorBidi"/>
           <w:b/>
           <w:bCs/>
-          <w:color w:val="auto"/>
-          <w:sz w:val="22"/>
-          <w:szCs w:val="22"/>
-          <w:lang w:eastAsia="en-US"/>
         </w:rPr>
       </w:sdtEndPr>
       <w:sdtContent>
@@ -789,7 +780,13 @@
               <w:tab w:val="right" w:leader="dot" w:pos="8828"/>
             </w:tabs>
             <w:rPr>
+              <w:rFonts w:eastAsiaTheme="minorEastAsia"/>
               <w:noProof/>
+              <w:kern w:val="2"/>
+              <w:sz w:val="24"/>
+              <w:szCs w:val="24"/>
+              <w:lang w:eastAsia="es-HN"/>
+              <w14:ligatures w14:val="standardContextual"/>
             </w:rPr>
           </w:pPr>
           <w:r>
@@ -801,10 +798,11 @@
           <w:r>
             <w:fldChar w:fldCharType="separate"/>
           </w:r>
-          <w:hyperlink w:anchor="_Toc240640906" w:history="1">
+          <w:hyperlink w:anchor="_Toc240650642" w:history="1">
             <w:r>
               <w:rPr>
                 <w:rStyle w:val="Hipervnculo"/>
+                <w:rFonts w:ascii="Times New Roman" w:hAnsi="Times New Roman" w:cs="Times New Roman"/>
                 <w:noProof/>
               </w:rPr>
               <w:t>Introducción</w:t>
@@ -828,7 +826,7 @@
                 <w:noProof/>
                 <w:webHidden/>
               </w:rPr>
-              <w:instrText xml:space="preserve"> PAGEREF _Toc240640906 \h </w:instrText>
+              <w:instrText xml:space="preserve"> PAGEREF _Toc240650642 \h </w:instrText>
             </w:r>
             <w:r>
               <w:rPr>
@@ -866,13 +864,20 @@
               <w:tab w:val="right" w:leader="dot" w:pos="8828"/>
             </w:tabs>
             <w:rPr>
+              <w:rFonts w:eastAsiaTheme="minorEastAsia"/>
               <w:noProof/>
+              <w:kern w:val="2"/>
+              <w:sz w:val="24"/>
+              <w:szCs w:val="24"/>
+              <w:lang w:eastAsia="es-HN"/>
+              <w14:ligatures w14:val="standardContextual"/>
             </w:rPr>
           </w:pPr>
-          <w:hyperlink w:anchor="_Toc240640907" w:history="1">
+          <w:hyperlink w:anchor="_Toc240650643" w:history="1">
             <w:r>
               <w:rPr>
                 <w:rStyle w:val="Hipervnculo"/>
+                <w:rFonts w:ascii="Times New Roman" w:hAnsi="Times New Roman" w:cs="Times New Roman"/>
                 <w:noProof/>
               </w:rPr>
               <w:t>Justificación</w:t>
@@ -896,7 +901,7 @@
                 <w:noProof/>
                 <w:webHidden/>
               </w:rPr>
-              <w:instrText xml:space="preserve"> PAGEREF _Toc240640907 \h </w:instrText>
+              <w:instrText xml:space="preserve"> PAGEREF _Toc240650643 \h </w:instrText>
             </w:r>
             <w:r>
               <w:rPr>
@@ -934,13 +939,20 @@
               <w:tab w:val="right" w:leader="dot" w:pos="8828"/>
             </w:tabs>
             <w:rPr>
+              <w:rFonts w:eastAsiaTheme="minorEastAsia"/>
               <w:noProof/>
+              <w:kern w:val="2"/>
+              <w:sz w:val="24"/>
+              <w:szCs w:val="24"/>
+              <w:lang w:eastAsia="es-HN"/>
+              <w14:ligatures w14:val="standardContextual"/>
             </w:rPr>
           </w:pPr>
-          <w:hyperlink w:anchor="_Toc240640908" w:history="1">
+          <w:hyperlink w:anchor="_Toc240650644" w:history="1">
             <w:r>
               <w:rPr>
                 <w:rStyle w:val="Hipervnculo"/>
+                <w:rFonts w:ascii="Times New Roman" w:hAnsi="Times New Roman" w:cs="Times New Roman"/>
                 <w:noProof/>
               </w:rPr>
               <w:t>Objetivos</w:t>
@@ -964,7 +976,7 @@
                 <w:noProof/>
                 <w:webHidden/>
               </w:rPr>
-              <w:instrText xml:space="preserve"> PAGEREF _Toc240640908 \h </w:instrText>
+              <w:instrText xml:space="preserve"> PAGEREF _Toc240650644 \h </w:instrText>
             </w:r>
             <w:r>
               <w:rPr>
@@ -1002,13 +1014,20 @@
               <w:tab w:val="right" w:leader="dot" w:pos="8828"/>
             </w:tabs>
             <w:rPr>
+              <w:rFonts w:eastAsiaTheme="minorEastAsia"/>
               <w:noProof/>
+              <w:kern w:val="2"/>
+              <w:sz w:val="24"/>
+              <w:szCs w:val="24"/>
+              <w:lang w:eastAsia="es-HN"/>
+              <w14:ligatures w14:val="standardContextual"/>
             </w:rPr>
           </w:pPr>
-          <w:hyperlink w:anchor="_Toc240640909" w:history="1">
+          <w:hyperlink w:anchor="_Toc240650645" w:history="1">
             <w:r>
               <w:rPr>
                 <w:rStyle w:val="Hipervnculo"/>
+                <w:rFonts w:ascii="Times New Roman" w:hAnsi="Times New Roman" w:cs="Times New Roman"/>
                 <w:noProof/>
               </w:rPr>
               <w:t>Descripción general del proyecto</w:t>
@@ -1032,7 +1051,7 @@
                 <w:noProof/>
                 <w:webHidden/>
               </w:rPr>
-              <w:instrText xml:space="preserve"> PAGEREF _Toc240640909 \h </w:instrText>
+              <w:instrText xml:space="preserve"> PAGEREF _Toc240650645 \h </w:instrText>
             </w:r>
             <w:r>
               <w:rPr>
@@ -1070,13 +1089,20 @@
               <w:tab w:val="right" w:leader="dot" w:pos="8828"/>
             </w:tabs>
             <w:rPr>
+              <w:rFonts w:eastAsiaTheme="minorEastAsia"/>
               <w:noProof/>
+              <w:kern w:val="2"/>
+              <w:sz w:val="24"/>
+              <w:szCs w:val="24"/>
+              <w:lang w:eastAsia="es-HN"/>
+              <w14:ligatures w14:val="standardContextual"/>
             </w:rPr>
           </w:pPr>
-          <w:hyperlink w:anchor="_Toc240640910" w:history="1">
+          <w:hyperlink w:anchor="_Toc240650646" w:history="1">
             <w:r>
               <w:rPr>
                 <w:rStyle w:val="Hipervnculo"/>
+                <w:rFonts w:ascii="Times New Roman" w:hAnsi="Times New Roman" w:cs="Times New Roman"/>
                 <w:noProof/>
               </w:rPr>
               <w:t>Funcionalidades disponibles para el usuario</w:t>
@@ -1100,7 +1126,7 @@
                 <w:noProof/>
                 <w:webHidden/>
               </w:rPr>
-              <w:instrText xml:space="preserve"> PAGEREF _Toc240640910 \h </w:instrText>
+              <w:instrText xml:space="preserve"> PAGEREF _Toc240650646 \h </w:instrText>
             </w:r>
             <w:r>
               <w:rPr>
@@ -1138,13 +1164,20 @@
               <w:tab w:val="right" w:leader="dot" w:pos="8828"/>
             </w:tabs>
             <w:rPr>
+              <w:rFonts w:eastAsiaTheme="minorEastAsia"/>
               <w:noProof/>
+              <w:kern w:val="2"/>
+              <w:sz w:val="24"/>
+              <w:szCs w:val="24"/>
+              <w:lang w:eastAsia="es-HN"/>
+              <w14:ligatures w14:val="standardContextual"/>
             </w:rPr>
           </w:pPr>
-          <w:hyperlink w:anchor="_Toc240640911" w:history="1">
+          <w:hyperlink w:anchor="_Toc240650647" w:history="1">
             <w:r>
               <w:rPr>
                 <w:rStyle w:val="Hipervnculo"/>
+                <w:rFonts w:ascii="Times New Roman" w:hAnsi="Times New Roman" w:cs="Times New Roman"/>
                 <w:noProof/>
               </w:rPr>
               <w:t>Clases y responsabilidades de cada una</w:t>
@@ -1168,7 +1201,7 @@
                 <w:noProof/>
                 <w:webHidden/>
               </w:rPr>
-              <w:instrText xml:space="preserve"> PAGEREF _Toc240640911 \h </w:instrText>
+              <w:instrText xml:space="preserve"> PAGEREF _Toc240650647 \h </w:instrText>
             </w:r>
             <w:r>
               <w:rPr>
@@ -1206,13 +1239,20 @@
               <w:tab w:val="right" w:leader="dot" w:pos="8828"/>
             </w:tabs>
             <w:rPr>
+              <w:rFonts w:eastAsiaTheme="minorEastAsia"/>
               <w:noProof/>
+              <w:kern w:val="2"/>
+              <w:sz w:val="24"/>
+              <w:szCs w:val="24"/>
+              <w:lang w:eastAsia="es-HN"/>
+              <w14:ligatures w14:val="standardContextual"/>
             </w:rPr>
           </w:pPr>
-          <w:hyperlink w:anchor="_Toc240640912" w:history="1">
+          <w:hyperlink w:anchor="_Toc240650648" w:history="1">
             <w:r>
               <w:rPr>
                 <w:rStyle w:val="Hipervnculo"/>
+                <w:rFonts w:ascii="Times New Roman" w:hAnsi="Times New Roman" w:cs="Times New Roman"/>
                 <w:noProof/>
               </w:rPr>
               <w:t>Relación entre las clases</w:t>
@@ -1236,7 +1276,7 @@
                 <w:noProof/>
                 <w:webHidden/>
               </w:rPr>
-              <w:instrText xml:space="preserve"> PAGEREF _Toc240640912 \h </w:instrText>
+              <w:instrText xml:space="preserve"> PAGEREF _Toc240650648 \h </w:instrText>
             </w:r>
             <w:r>
               <w:rPr>
@@ -1274,13 +1314,20 @@
               <w:tab w:val="right" w:leader="dot" w:pos="8828"/>
             </w:tabs>
             <w:rPr>
+              <w:rFonts w:eastAsiaTheme="minorEastAsia"/>
               <w:noProof/>
+              <w:kern w:val="2"/>
+              <w:sz w:val="24"/>
+              <w:szCs w:val="24"/>
+              <w:lang w:eastAsia="es-HN"/>
+              <w14:ligatures w14:val="standardContextual"/>
             </w:rPr>
           </w:pPr>
-          <w:hyperlink w:anchor="_Toc240640913" w:history="1">
+          <w:hyperlink w:anchor="_Toc240650649" w:history="1">
             <w:r>
               <w:rPr>
                 <w:rStyle w:val="Hipervnculo"/>
+                <w:rFonts w:ascii="Times New Roman" w:hAnsi="Times New Roman" w:cs="Times New Roman"/>
                 <w:noProof/>
               </w:rPr>
               <w:t>Diagramas de Lógica</w:t>
@@ -1304,7 +1351,7 @@
                 <w:noProof/>
                 <w:webHidden/>
               </w:rPr>
-              <w:instrText xml:space="preserve"> PAGEREF _Toc240640913 \h </w:instrText>
+              <w:instrText xml:space="preserve"> PAGEREF _Toc240650649 \h </w:instrText>
             </w:r>
             <w:r>
               <w:rPr>
@@ -1342,13 +1389,20 @@
               <w:tab w:val="right" w:leader="dot" w:pos="8828"/>
             </w:tabs>
             <w:rPr>
+              <w:rFonts w:eastAsiaTheme="minorEastAsia"/>
               <w:noProof/>
+              <w:kern w:val="2"/>
+              <w:sz w:val="24"/>
+              <w:szCs w:val="24"/>
+              <w:lang w:eastAsia="es-HN"/>
+              <w14:ligatures w14:val="standardContextual"/>
             </w:rPr>
           </w:pPr>
-          <w:hyperlink w:anchor="_Toc240640914" w:history="1">
+          <w:hyperlink w:anchor="_Toc240650650" w:history="1">
             <w:r>
               <w:rPr>
                 <w:rStyle w:val="Hipervnculo"/>
+                <w:rFonts w:ascii="Times New Roman" w:hAnsi="Times New Roman" w:cs="Times New Roman"/>
                 <w:noProof/>
               </w:rPr>
               <w:t>Investigación realizada</w:t>
@@ -1372,7 +1426,7 @@
                 <w:noProof/>
                 <w:webHidden/>
               </w:rPr>
-              <w:instrText xml:space="preserve"> PAGEREF _Toc240640914 \h </w:instrText>
+              <w:instrText xml:space="preserve"> PAGEREF _Toc240650650 \h </w:instrText>
             </w:r>
             <w:r>
               <w:rPr>
@@ -1410,13 +1464,20 @@
               <w:tab w:val="right" w:leader="dot" w:pos="8828"/>
             </w:tabs>
             <w:rPr>
+              <w:rFonts w:eastAsiaTheme="minorEastAsia"/>
               <w:noProof/>
+              <w:kern w:val="2"/>
+              <w:sz w:val="24"/>
+              <w:szCs w:val="24"/>
+              <w:lang w:eastAsia="es-HN"/>
+              <w14:ligatures w14:val="standardContextual"/>
             </w:rPr>
           </w:pPr>
-          <w:hyperlink w:anchor="_Toc240640915" w:history="1">
+          <w:hyperlink w:anchor="_Toc240650651" w:history="1">
             <w:r>
               <w:rPr>
                 <w:rStyle w:val="Hipervnculo"/>
+                <w:rFonts w:ascii="Times New Roman" w:hAnsi="Times New Roman" w:cs="Times New Roman"/>
                 <w:noProof/>
               </w:rPr>
               <w:t>Cifrado y descifrado César</w:t>
@@ -1440,7 +1501,7 @@
                 <w:noProof/>
                 <w:webHidden/>
               </w:rPr>
-              <w:instrText xml:space="preserve"> PAGEREF _Toc240640915 \h </w:instrText>
+              <w:instrText xml:space="preserve"> PAGEREF _Toc240650651 \h </w:instrText>
             </w:r>
             <w:r>
               <w:rPr>
@@ -1478,13 +1539,20 @@
               <w:tab w:val="right" w:leader="dot" w:pos="8828"/>
             </w:tabs>
             <w:rPr>
+              <w:rFonts w:eastAsiaTheme="minorEastAsia"/>
               <w:noProof/>
+              <w:kern w:val="2"/>
+              <w:sz w:val="24"/>
+              <w:szCs w:val="24"/>
+              <w:lang w:eastAsia="es-HN"/>
+              <w14:ligatures w14:val="standardContextual"/>
             </w:rPr>
           </w:pPr>
-          <w:hyperlink w:anchor="_Toc240640916" w:history="1">
+          <w:hyperlink w:anchor="_Toc240650652" w:history="1">
             <w:r>
               <w:rPr>
                 <w:rStyle w:val="Hipervnculo"/>
+                <w:rFonts w:ascii="Times New Roman" w:hAnsi="Times New Roman" w:cs="Times New Roman"/>
                 <w:noProof/>
               </w:rPr>
               <w:t>Cifrado y descifrado XOR</w:t>
@@ -1508,7 +1576,7 @@
                 <w:noProof/>
                 <w:webHidden/>
               </w:rPr>
-              <w:instrText xml:space="preserve"> PAGEREF _Toc240640916 \h </w:instrText>
+              <w:instrText xml:space="preserve"> PAGEREF _Toc240650652 \h </w:instrText>
             </w:r>
             <w:r>
               <w:rPr>
@@ -1546,16 +1614,23 @@
               <w:tab w:val="right" w:leader="dot" w:pos="8828"/>
             </w:tabs>
             <w:rPr>
+              <w:rFonts w:eastAsiaTheme="minorEastAsia"/>
               <w:noProof/>
+              <w:kern w:val="2"/>
+              <w:sz w:val="24"/>
+              <w:szCs w:val="24"/>
+              <w:lang w:eastAsia="es-HN"/>
+              <w14:ligatures w14:val="standardContextual"/>
             </w:rPr>
           </w:pPr>
-          <w:hyperlink w:anchor="_Toc240640917" w:history="1">
+          <w:hyperlink w:anchor="_Toc240650653" w:history="1">
             <w:r>
               <w:rPr>
                 <w:rStyle w:val="Hipervnculo"/>
-                <w:noProof/>
-              </w:rPr>
-              <w:t>Cifrado Vigenère</w:t>
+                <w:rFonts w:ascii="Times New Roman" w:hAnsi="Times New Roman" w:cs="Times New Roman"/>
+                <w:noProof/>
+              </w:rPr>
+              <w:t>Cifrado y descifrado Vigenère</w:t>
             </w:r>
             <w:r>
               <w:rPr>
@@ -1576,7 +1651,7 @@
                 <w:noProof/>
                 <w:webHidden/>
               </w:rPr>
-              <w:instrText xml:space="preserve"> PAGEREF _Toc240640917 \h </w:instrText>
+              <w:instrText xml:space="preserve"> PAGEREF _Toc240650653 \h </w:instrText>
             </w:r>
             <w:r>
               <w:rPr>
@@ -1614,13 +1689,20 @@
               <w:tab w:val="right" w:leader="dot" w:pos="8828"/>
             </w:tabs>
             <w:rPr>
+              <w:rFonts w:eastAsiaTheme="minorEastAsia"/>
               <w:noProof/>
+              <w:kern w:val="2"/>
+              <w:sz w:val="24"/>
+              <w:szCs w:val="24"/>
+              <w:lang w:eastAsia="es-HN"/>
+              <w14:ligatures w14:val="standardContextual"/>
             </w:rPr>
           </w:pPr>
-          <w:hyperlink w:anchor="_Toc240640918" w:history="1">
+          <w:hyperlink w:anchor="_Toc240650654" w:history="1">
             <w:r>
               <w:rPr>
                 <w:rStyle w:val="Hipervnculo"/>
+                <w:rFonts w:ascii="Times New Roman" w:hAnsi="Times New Roman" w:cs="Times New Roman"/>
                 <w:noProof/>
               </w:rPr>
               <w:t>Generalización a bytes (para archivos e imágenes)</w:t>
@@ -1644,7 +1726,7 @@
                 <w:noProof/>
                 <w:webHidden/>
               </w:rPr>
-              <w:instrText xml:space="preserve"> PAGEREF _Toc240640918 \h </w:instrText>
+              <w:instrText xml:space="preserve"> PAGEREF _Toc240650654 \h </w:instrText>
             </w:r>
             <w:r>
               <w:rPr>
@@ -1682,13 +1764,20 @@
               <w:tab w:val="right" w:leader="dot" w:pos="8828"/>
             </w:tabs>
             <w:rPr>
+              <w:rFonts w:eastAsiaTheme="minorEastAsia"/>
               <w:noProof/>
+              <w:kern w:val="2"/>
+              <w:sz w:val="24"/>
+              <w:szCs w:val="24"/>
+              <w:lang w:eastAsia="es-HN"/>
+              <w14:ligatures w14:val="standardContextual"/>
             </w:rPr>
           </w:pPr>
-          <w:hyperlink w:anchor="_Toc240640919" w:history="1">
+          <w:hyperlink w:anchor="_Toc240650655" w:history="1">
             <w:r>
               <w:rPr>
                 <w:rStyle w:val="Hipervnculo"/>
+                <w:rFonts w:ascii="Times New Roman" w:hAnsi="Times New Roman" w:cs="Times New Roman"/>
                 <w:noProof/>
               </w:rPr>
               <w:t>Elementos de investigación propia</w:t>
@@ -1712,7 +1801,7 @@
                 <w:noProof/>
                 <w:webHidden/>
               </w:rPr>
-              <w:instrText xml:space="preserve"> PAGEREF _Toc240640919 \h </w:instrText>
+              <w:instrText xml:space="preserve"> PAGEREF _Toc240650655 \h </w:instrText>
             </w:r>
             <w:r>
               <w:rPr>
@@ -1751,26 +1840,40 @@
               <w:tab w:val="right" w:leader="dot" w:pos="8828"/>
             </w:tabs>
             <w:rPr>
+              <w:rFonts w:eastAsiaTheme="minorEastAsia"/>
               <w:noProof/>
+              <w:kern w:val="2"/>
+              <w:sz w:val="24"/>
+              <w:szCs w:val="24"/>
+              <w:lang w:eastAsia="es-HN"/>
+              <w14:ligatures w14:val="standardContextual"/>
             </w:rPr>
           </w:pPr>
-          <w:hyperlink w:anchor="_Toc240640920" w:history="1">
+          <w:hyperlink w:anchor="_Toc240650656" w:history="1">
             <w:r>
               <w:rPr>
                 <w:rStyle w:val="Hipervnculo"/>
+                <w:rFonts w:ascii="Times New Roman" w:hAnsi="Times New Roman" w:cs="Times New Roman"/>
                 <w:noProof/>
               </w:rPr>
               <w:t>1.</w:t>
             </w:r>
             <w:r>
               <w:rPr>
-                <w:noProof/>
+                <w:rFonts w:eastAsiaTheme="minorEastAsia"/>
+                <w:noProof/>
+                <w:kern w:val="2"/>
+                <w:sz w:val="24"/>
+                <w:szCs w:val="24"/>
+                <w:lang w:eastAsia="es-HN"/>
+                <w14:ligatures w14:val="standardContextual"/>
               </w:rPr>
               <w:tab/>
             </w:r>
             <w:r>
               <w:rPr>
                 <w:rStyle w:val="Hipervnculo"/>
+                <w:rFonts w:ascii="Times New Roman" w:hAnsi="Times New Roman" w:cs="Times New Roman"/>
                 <w:noProof/>
               </w:rPr>
               <w:t>Librería &lt;ctime&gt;</w:t>
@@ -1794,7 +1897,7 @@
                 <w:noProof/>
                 <w:webHidden/>
               </w:rPr>
-              <w:instrText xml:space="preserve"> PAGEREF _Toc240640920 \h </w:instrText>
+              <w:instrText xml:space="preserve"> PAGEREF _Toc240650656 \h </w:instrText>
             </w:r>
             <w:r>
               <w:rPr>
@@ -1833,26 +1936,40 @@
               <w:tab w:val="right" w:leader="dot" w:pos="8828"/>
             </w:tabs>
             <w:rPr>
+              <w:rFonts w:eastAsiaTheme="minorEastAsia"/>
               <w:noProof/>
+              <w:kern w:val="2"/>
+              <w:sz w:val="24"/>
+              <w:szCs w:val="24"/>
+              <w:lang w:eastAsia="es-HN"/>
+              <w14:ligatures w14:val="standardContextual"/>
             </w:rPr>
           </w:pPr>
-          <w:hyperlink w:anchor="_Toc240640921" w:history="1">
+          <w:hyperlink w:anchor="_Toc240650657" w:history="1">
             <w:r>
               <w:rPr>
                 <w:rStyle w:val="Hipervnculo"/>
+                <w:rFonts w:ascii="Times New Roman" w:hAnsi="Times New Roman" w:cs="Times New Roman"/>
                 <w:noProof/>
               </w:rPr>
               <w:t>2.</w:t>
             </w:r>
             <w:r>
               <w:rPr>
-                <w:noProof/>
+                <w:rFonts w:eastAsiaTheme="minorEastAsia"/>
+                <w:noProof/>
+                <w:kern w:val="2"/>
+                <w:sz w:val="24"/>
+                <w:szCs w:val="24"/>
+                <w:lang w:eastAsia="es-HN"/>
+                <w14:ligatures w14:val="standardContextual"/>
               </w:rPr>
               <w:tab/>
             </w:r>
             <w:r>
               <w:rPr>
                 <w:rStyle w:val="Hipervnculo"/>
+                <w:rFonts w:ascii="Times New Roman" w:hAnsi="Times New Roman" w:cs="Times New Roman"/>
                 <w:noProof/>
               </w:rPr>
               <w:t>Explorador nativo de Windows (&lt;commdlg.h&gt;)</w:t>
@@ -1876,7 +1993,7 @@
                 <w:noProof/>
                 <w:webHidden/>
               </w:rPr>
-              <w:instrText xml:space="preserve"> PAGEREF _Toc240640921 \h </w:instrText>
+              <w:instrText xml:space="preserve"> PAGEREF _Toc240650657 \h </w:instrText>
             </w:r>
             <w:r>
               <w:rPr>
@@ -1915,26 +2032,40 @@
               <w:tab w:val="right" w:leader="dot" w:pos="8828"/>
             </w:tabs>
             <w:rPr>
+              <w:rFonts w:eastAsiaTheme="minorEastAsia"/>
               <w:noProof/>
+              <w:kern w:val="2"/>
+              <w:sz w:val="24"/>
+              <w:szCs w:val="24"/>
+              <w:lang w:eastAsia="es-HN"/>
+              <w14:ligatures w14:val="standardContextual"/>
             </w:rPr>
           </w:pPr>
-          <w:hyperlink w:anchor="_Toc240640922" w:history="1">
+          <w:hyperlink w:anchor="_Toc240650658" w:history="1">
             <w:r>
               <w:rPr>
                 <w:rStyle w:val="Hipervnculo"/>
+                <w:rFonts w:ascii="Times New Roman" w:hAnsi="Times New Roman" w:cs="Times New Roman"/>
                 <w:noProof/>
               </w:rPr>
               <w:t>3.</w:t>
             </w:r>
             <w:r>
               <w:rPr>
-                <w:noProof/>
+                <w:rFonts w:eastAsiaTheme="minorEastAsia"/>
+                <w:noProof/>
+                <w:kern w:val="2"/>
+                <w:sz w:val="24"/>
+                <w:szCs w:val="24"/>
+                <w:lang w:eastAsia="es-HN"/>
+                <w14:ligatures w14:val="standardContextual"/>
               </w:rPr>
               <w:tab/>
             </w:r>
             <w:r>
               <w:rPr>
                 <w:rStyle w:val="Hipervnculo"/>
+                <w:rFonts w:ascii="Times New Roman" w:hAnsi="Times New Roman" w:cs="Times New Roman"/>
                 <w:noProof/>
               </w:rPr>
               <w:t>Personalización de consola</w:t>
@@ -1958,7 +2089,7 @@
                 <w:noProof/>
                 <w:webHidden/>
               </w:rPr>
-              <w:instrText xml:space="preserve"> PAGEREF _Toc240640922 \h </w:instrText>
+              <w:instrText xml:space="preserve"> PAGEREF _Toc240650658 \h </w:instrText>
             </w:r>
             <w:r>
               <w:rPr>
@@ -1997,26 +2128,40 @@
               <w:tab w:val="right" w:leader="dot" w:pos="8828"/>
             </w:tabs>
             <w:rPr>
+              <w:rFonts w:eastAsiaTheme="minorEastAsia"/>
               <w:noProof/>
+              <w:kern w:val="2"/>
+              <w:sz w:val="24"/>
+              <w:szCs w:val="24"/>
+              <w:lang w:eastAsia="es-HN"/>
+              <w14:ligatures w14:val="standardContextual"/>
             </w:rPr>
           </w:pPr>
-          <w:hyperlink w:anchor="_Toc240640923" w:history="1">
+          <w:hyperlink w:anchor="_Toc240650659" w:history="1">
             <w:r>
               <w:rPr>
                 <w:rStyle w:val="Hipervnculo"/>
+                <w:rFonts w:ascii="Times New Roman" w:hAnsi="Times New Roman" w:cs="Times New Roman"/>
                 <w:noProof/>
               </w:rPr>
               <w:t>4.</w:t>
             </w:r>
             <w:r>
               <w:rPr>
-                <w:noProof/>
+                <w:rFonts w:eastAsiaTheme="minorEastAsia"/>
+                <w:noProof/>
+                <w:kern w:val="2"/>
+                <w:sz w:val="24"/>
+                <w:szCs w:val="24"/>
+                <w:lang w:eastAsia="es-HN"/>
+                <w14:ligatures w14:val="standardContextual"/>
               </w:rPr>
               <w:tab/>
             </w:r>
             <w:r>
               <w:rPr>
                 <w:rStyle w:val="Hipervnculo"/>
+                <w:rFonts w:ascii="Times New Roman" w:hAnsi="Times New Roman" w:cs="Times New Roman"/>
                 <w:noProof/>
               </w:rPr>
               <w:t>Manejo de archivos binarios</w:t>
@@ -2040,7 +2185,7 @@
                 <w:noProof/>
                 <w:webHidden/>
               </w:rPr>
-              <w:instrText xml:space="preserve"> PAGEREF _Toc240640923 \h </w:instrText>
+              <w:instrText xml:space="preserve"> PAGEREF _Toc240650659 \h </w:instrText>
             </w:r>
             <w:r>
               <w:rPr>
@@ -2060,7 +2205,7 @@
                 <w:noProof/>
                 <w:webHidden/>
               </w:rPr>
-              <w:t>13</w:t>
+              <w:t>12</w:t>
             </w:r>
             <w:r>
               <w:rPr>
@@ -2079,26 +2224,40 @@
               <w:tab w:val="right" w:leader="dot" w:pos="8828"/>
             </w:tabs>
             <w:rPr>
+              <w:rFonts w:eastAsiaTheme="minorEastAsia"/>
               <w:noProof/>
+              <w:kern w:val="2"/>
+              <w:sz w:val="24"/>
+              <w:szCs w:val="24"/>
+              <w:lang w:eastAsia="es-HN"/>
+              <w14:ligatures w14:val="standardContextual"/>
             </w:rPr>
           </w:pPr>
-          <w:hyperlink w:anchor="_Toc240640924" w:history="1">
+          <w:hyperlink w:anchor="_Toc240650660" w:history="1">
             <w:r>
               <w:rPr>
                 <w:rStyle w:val="Hipervnculo"/>
+                <w:rFonts w:ascii="Times New Roman" w:hAnsi="Times New Roman" w:cs="Times New Roman"/>
                 <w:noProof/>
               </w:rPr>
               <w:t>5.</w:t>
             </w:r>
             <w:r>
               <w:rPr>
-                <w:noProof/>
+                <w:rFonts w:eastAsiaTheme="minorEastAsia"/>
+                <w:noProof/>
+                <w:kern w:val="2"/>
+                <w:sz w:val="24"/>
+                <w:szCs w:val="24"/>
+                <w:lang w:eastAsia="es-HN"/>
+                <w14:ligatures w14:val="standardContextual"/>
               </w:rPr>
               <w:tab/>
             </w:r>
             <w:r>
               <w:rPr>
                 <w:rStyle w:val="Hipervnculo"/>
+                <w:rFonts w:ascii="Times New Roman" w:hAnsi="Times New Roman" w:cs="Times New Roman"/>
                 <w:noProof/>
               </w:rPr>
               <w:t>Compilación estática (static)</w:t>
@@ -2122,7 +2281,7 @@
                 <w:noProof/>
                 <w:webHidden/>
               </w:rPr>
-              <w:instrText xml:space="preserve"> PAGEREF _Toc240640924 \h </w:instrText>
+              <w:instrText xml:space="preserve"> PAGEREF _Toc240650660 \h </w:instrText>
             </w:r>
             <w:r>
               <w:rPr>
@@ -2161,26 +2320,40 @@
               <w:tab w:val="right" w:leader="dot" w:pos="8828"/>
             </w:tabs>
             <w:rPr>
+              <w:rFonts w:eastAsiaTheme="minorEastAsia"/>
               <w:noProof/>
+              <w:kern w:val="2"/>
+              <w:sz w:val="24"/>
+              <w:szCs w:val="24"/>
+              <w:lang w:eastAsia="es-HN"/>
+              <w14:ligatures w14:val="standardContextual"/>
             </w:rPr>
           </w:pPr>
-          <w:hyperlink w:anchor="_Toc240640925" w:history="1">
+          <w:hyperlink w:anchor="_Toc240650661" w:history="1">
             <w:r>
               <w:rPr>
                 <w:rStyle w:val="Hipervnculo"/>
+                <w:rFonts w:ascii="Times New Roman" w:hAnsi="Times New Roman" w:cs="Times New Roman"/>
                 <w:noProof/>
               </w:rPr>
               <w:t>6.</w:t>
             </w:r>
             <w:r>
               <w:rPr>
-                <w:noProof/>
+                <w:rFonts w:eastAsiaTheme="minorEastAsia"/>
+                <w:noProof/>
+                <w:kern w:val="2"/>
+                <w:sz w:val="24"/>
+                <w:szCs w:val="24"/>
+                <w:lang w:eastAsia="es-HN"/>
+                <w14:ligatures w14:val="standardContextual"/>
               </w:rPr>
               <w:tab/>
             </w:r>
             <w:r>
               <w:rPr>
                 <w:rStyle w:val="Hipervnculo"/>
+                <w:rFonts w:ascii="Times New Roman" w:hAnsi="Times New Roman" w:cs="Times New Roman"/>
                 <w:noProof/>
               </w:rPr>
               <w:t>Funciones virtuales</w:t>
@@ -2204,7 +2377,7 @@
                 <w:noProof/>
                 <w:webHidden/>
               </w:rPr>
-              <w:instrText xml:space="preserve"> PAGEREF _Toc240640925 \h </w:instrText>
+              <w:instrText xml:space="preserve"> PAGEREF _Toc240650661 \h </w:instrText>
             </w:r>
             <w:r>
               <w:rPr>
@@ -2242,13 +2415,20 @@
               <w:tab w:val="right" w:leader="dot" w:pos="8828"/>
             </w:tabs>
             <w:rPr>
+              <w:rFonts w:eastAsiaTheme="minorEastAsia"/>
               <w:noProof/>
+              <w:kern w:val="2"/>
+              <w:sz w:val="24"/>
+              <w:szCs w:val="24"/>
+              <w:lang w:eastAsia="es-HN"/>
+              <w14:ligatures w14:val="standardContextual"/>
             </w:rPr>
           </w:pPr>
-          <w:hyperlink w:anchor="_Toc240640926" w:history="1">
+          <w:hyperlink w:anchor="_Toc240650662" w:history="1">
             <w:r>
               <w:rPr>
                 <w:rStyle w:val="Hipervnculo"/>
+                <w:rFonts w:ascii="Times New Roman" w:hAnsi="Times New Roman" w:cs="Times New Roman"/>
                 <w:noProof/>
               </w:rPr>
               <w:t>Manual Técnico</w:t>
@@ -2272,7 +2452,7 @@
                 <w:noProof/>
                 <w:webHidden/>
               </w:rPr>
-              <w:instrText xml:space="preserve"> PAGEREF _Toc240640926 \h </w:instrText>
+              <w:instrText xml:space="preserve"> PAGEREF _Toc240650662 \h </w:instrText>
             </w:r>
             <w:r>
               <w:rPr>
@@ -2310,13 +2490,20 @@
               <w:tab w:val="right" w:leader="dot" w:pos="8828"/>
             </w:tabs>
             <w:rPr>
+              <w:rFonts w:eastAsiaTheme="minorEastAsia"/>
               <w:noProof/>
+              <w:kern w:val="2"/>
+              <w:sz w:val="24"/>
+              <w:szCs w:val="24"/>
+              <w:lang w:eastAsia="es-HN"/>
+              <w14:ligatures w14:val="standardContextual"/>
             </w:rPr>
           </w:pPr>
-          <w:hyperlink w:anchor="_Toc240640927" w:history="1">
+          <w:hyperlink w:anchor="_Toc240650663" w:history="1">
             <w:r>
               <w:rPr>
                 <w:rStyle w:val="Hipervnculo"/>
+                <w:rFonts w:ascii="Times New Roman" w:hAnsi="Times New Roman" w:cs="Times New Roman"/>
                 <w:noProof/>
               </w:rPr>
               <w:t>Arquitectura de clases y principios de POO</w:t>
@@ -2340,7 +2527,7 @@
                 <w:noProof/>
                 <w:webHidden/>
               </w:rPr>
-              <w:instrText xml:space="preserve"> PAGEREF _Toc240640927 \h </w:instrText>
+              <w:instrText xml:space="preserve"> PAGEREF _Toc240650663 \h </w:instrText>
             </w:r>
             <w:r>
               <w:rPr>
@@ -2378,13 +2565,20 @@
               <w:tab w:val="right" w:leader="dot" w:pos="8828"/>
             </w:tabs>
             <w:rPr>
+              <w:rFonts w:eastAsiaTheme="minorEastAsia"/>
               <w:noProof/>
+              <w:kern w:val="2"/>
+              <w:sz w:val="24"/>
+              <w:szCs w:val="24"/>
+              <w:lang w:eastAsia="es-HN"/>
+              <w14:ligatures w14:val="standardContextual"/>
             </w:rPr>
           </w:pPr>
-          <w:hyperlink w:anchor="_Toc240640928" w:history="1">
+          <w:hyperlink w:anchor="_Toc240650664" w:history="1">
             <w:r>
               <w:rPr>
                 <w:rStyle w:val="Hipervnculo"/>
+                <w:rFonts w:ascii="Times New Roman" w:hAnsi="Times New Roman" w:cs="Times New Roman"/>
                 <w:noProof/>
               </w:rPr>
               <w:t>Abstracción (clase Cifrador)</w:t>
@@ -2408,7 +2602,7 @@
                 <w:noProof/>
                 <w:webHidden/>
               </w:rPr>
-              <w:instrText xml:space="preserve"> PAGEREF _Toc240640928 \h </w:instrText>
+              <w:instrText xml:space="preserve"> PAGEREF _Toc240650664 \h </w:instrText>
             </w:r>
             <w:r>
               <w:rPr>
@@ -2446,13 +2640,20 @@
               <w:tab w:val="right" w:leader="dot" w:pos="8828"/>
             </w:tabs>
             <w:rPr>
+              <w:rFonts w:eastAsiaTheme="minorEastAsia"/>
               <w:noProof/>
+              <w:kern w:val="2"/>
+              <w:sz w:val="24"/>
+              <w:szCs w:val="24"/>
+              <w:lang w:eastAsia="es-HN"/>
+              <w14:ligatures w14:val="standardContextual"/>
             </w:rPr>
           </w:pPr>
-          <w:hyperlink w:anchor="_Toc240640929" w:history="1">
+          <w:hyperlink w:anchor="_Toc240650665" w:history="1">
             <w:r>
               <w:rPr>
                 <w:rStyle w:val="Hipervnculo"/>
+                <w:rFonts w:ascii="Times New Roman" w:hAnsi="Times New Roman" w:cs="Times New Roman"/>
                 <w:noProof/>
               </w:rPr>
               <w:t>Uso de modificador protected</w:t>
@@ -2476,7 +2677,7 @@
                 <w:noProof/>
                 <w:webHidden/>
               </w:rPr>
-              <w:instrText xml:space="preserve"> PAGEREF _Toc240640929 \h </w:instrText>
+              <w:instrText xml:space="preserve"> PAGEREF _Toc240650665 \h </w:instrText>
             </w:r>
             <w:r>
               <w:rPr>
@@ -2514,13 +2715,20 @@
               <w:tab w:val="right" w:leader="dot" w:pos="8828"/>
             </w:tabs>
             <w:rPr>
+              <w:rFonts w:eastAsiaTheme="minorEastAsia"/>
               <w:noProof/>
+              <w:kern w:val="2"/>
+              <w:sz w:val="24"/>
+              <w:szCs w:val="24"/>
+              <w:lang w:eastAsia="es-HN"/>
+              <w14:ligatures w14:val="standardContextual"/>
             </w:rPr>
           </w:pPr>
-          <w:hyperlink w:anchor="_Toc240640930" w:history="1">
+          <w:hyperlink w:anchor="_Toc240650666" w:history="1">
             <w:r>
               <w:rPr>
                 <w:rStyle w:val="Hipervnculo"/>
+                <w:rFonts w:ascii="Times New Roman" w:hAnsi="Times New Roman" w:cs="Times New Roman"/>
                 <w:noProof/>
               </w:rPr>
               <w:t>Herencia y encapsulamiento</w:t>
@@ -2544,7 +2752,7 @@
                 <w:noProof/>
                 <w:webHidden/>
               </w:rPr>
-              <w:instrText xml:space="preserve"> PAGEREF _Toc240640930 \h </w:instrText>
+              <w:instrText xml:space="preserve"> PAGEREF _Toc240650666 \h </w:instrText>
             </w:r>
             <w:r>
               <w:rPr>
@@ -2582,13 +2790,20 @@
               <w:tab w:val="right" w:leader="dot" w:pos="8828"/>
             </w:tabs>
             <w:rPr>
+              <w:rFonts w:eastAsiaTheme="minorEastAsia"/>
               <w:noProof/>
+              <w:kern w:val="2"/>
+              <w:sz w:val="24"/>
+              <w:szCs w:val="24"/>
+              <w:lang w:eastAsia="es-HN"/>
+              <w14:ligatures w14:val="standardContextual"/>
             </w:rPr>
           </w:pPr>
-          <w:hyperlink w:anchor="_Toc240640931" w:history="1">
+          <w:hyperlink w:anchor="_Toc240650667" w:history="1">
             <w:r>
               <w:rPr>
                 <w:rStyle w:val="Hipervnculo"/>
+                <w:rFonts w:ascii="Times New Roman" w:hAnsi="Times New Roman" w:cs="Times New Roman"/>
                 <w:noProof/>
               </w:rPr>
               <w:t>Polimorfismo</w:t>
@@ -2612,7 +2827,7 @@
                 <w:noProof/>
                 <w:webHidden/>
               </w:rPr>
-              <w:instrText xml:space="preserve"> PAGEREF _Toc240640931 \h </w:instrText>
+              <w:instrText xml:space="preserve"> PAGEREF _Toc240650667 \h </w:instrText>
             </w:r>
             <w:r>
               <w:rPr>
@@ -2650,13 +2865,20 @@
               <w:tab w:val="right" w:leader="dot" w:pos="8828"/>
             </w:tabs>
             <w:rPr>
+              <w:rFonts w:eastAsiaTheme="minorEastAsia"/>
               <w:noProof/>
+              <w:kern w:val="2"/>
+              <w:sz w:val="24"/>
+              <w:szCs w:val="24"/>
+              <w:lang w:eastAsia="es-HN"/>
+              <w14:ligatures w14:val="standardContextual"/>
             </w:rPr>
           </w:pPr>
-          <w:hyperlink w:anchor="_Toc240640932" w:history="1">
+          <w:hyperlink w:anchor="_Toc240650668" w:history="1">
             <w:r>
               <w:rPr>
                 <w:rStyle w:val="Hipervnculo"/>
+                <w:rFonts w:ascii="Times New Roman" w:hAnsi="Times New Roman" w:cs="Times New Roman"/>
                 <w:noProof/>
               </w:rPr>
               <w:t>Uso técnico de punteros dentro del sistema</w:t>
@@ -2680,7 +2902,7 @@
                 <w:noProof/>
                 <w:webHidden/>
               </w:rPr>
-              <w:instrText xml:space="preserve"> PAGEREF _Toc240640932 \h </w:instrText>
+              <w:instrText xml:space="preserve"> PAGEREF _Toc240650668 \h </w:instrText>
             </w:r>
             <w:r>
               <w:rPr>
@@ -2719,26 +2941,40 @@
               <w:tab w:val="right" w:leader="dot" w:pos="8828"/>
             </w:tabs>
             <w:rPr>
+              <w:rFonts w:eastAsiaTheme="minorEastAsia"/>
               <w:noProof/>
+              <w:kern w:val="2"/>
+              <w:sz w:val="24"/>
+              <w:szCs w:val="24"/>
+              <w:lang w:eastAsia="es-HN"/>
+              <w14:ligatures w14:val="standardContextual"/>
             </w:rPr>
           </w:pPr>
-          <w:hyperlink w:anchor="_Toc240640933" w:history="1">
+          <w:hyperlink w:anchor="_Toc240650669" w:history="1">
             <w:r>
               <w:rPr>
                 <w:rStyle w:val="Hipervnculo"/>
+                <w:rFonts w:ascii="Times New Roman" w:hAnsi="Times New Roman" w:cs="Times New Roman"/>
                 <w:noProof/>
               </w:rPr>
               <w:t>1.</w:t>
             </w:r>
             <w:r>
               <w:rPr>
-                <w:noProof/>
+                <w:rFonts w:eastAsiaTheme="minorEastAsia"/>
+                <w:noProof/>
+                <w:kern w:val="2"/>
+                <w:sz w:val="24"/>
+                <w:szCs w:val="24"/>
+                <w:lang w:eastAsia="es-HN"/>
+                <w14:ligatures w14:val="standardContextual"/>
               </w:rPr>
               <w:tab/>
             </w:r>
             <w:r>
               <w:rPr>
                 <w:rStyle w:val="Hipervnculo"/>
+                <w:rFonts w:ascii="Times New Roman" w:hAnsi="Times New Roman" w:cs="Times New Roman"/>
                 <w:noProof/>
               </w:rPr>
               <w:t>Buffer para procesamiento de archivos (unsigned char* buffer)</w:t>
@@ -2762,7 +2998,7 @@
                 <w:noProof/>
                 <w:webHidden/>
               </w:rPr>
-              <w:instrText xml:space="preserve"> PAGEREF _Toc240640933 \h </w:instrText>
+              <w:instrText xml:space="preserve"> PAGEREF _Toc240650669 \h </w:instrText>
             </w:r>
             <w:r>
               <w:rPr>
@@ -2801,26 +3037,40 @@
               <w:tab w:val="right" w:leader="dot" w:pos="8828"/>
             </w:tabs>
             <w:rPr>
+              <w:rFonts w:eastAsiaTheme="minorEastAsia"/>
               <w:noProof/>
+              <w:kern w:val="2"/>
+              <w:sz w:val="24"/>
+              <w:szCs w:val="24"/>
+              <w:lang w:eastAsia="es-HN"/>
+              <w14:ligatures w14:val="standardContextual"/>
             </w:rPr>
           </w:pPr>
-          <w:hyperlink w:anchor="_Toc240640934" w:history="1">
+          <w:hyperlink w:anchor="_Toc240650670" w:history="1">
             <w:r>
               <w:rPr>
                 <w:rStyle w:val="Hipervnculo"/>
+                <w:rFonts w:ascii="Times New Roman" w:hAnsi="Times New Roman" w:cs="Times New Roman"/>
                 <w:noProof/>
               </w:rPr>
               <w:t>2.</w:t>
             </w:r>
             <w:r>
               <w:rPr>
-                <w:noProof/>
+                <w:rFonts w:eastAsiaTheme="minorEastAsia"/>
+                <w:noProof/>
+                <w:kern w:val="2"/>
+                <w:sz w:val="24"/>
+                <w:szCs w:val="24"/>
+                <w:lang w:eastAsia="es-HN"/>
+                <w14:ligatures w14:val="standardContextual"/>
               </w:rPr>
               <w:tab/>
             </w:r>
             <w:r>
               <w:rPr>
                 <w:rStyle w:val="Hipervnculo"/>
+                <w:rFonts w:ascii="Times New Roman" w:hAnsi="Times New Roman" w:cs="Times New Roman"/>
                 <w:noProof/>
               </w:rPr>
               <w:t>Puntero polimórfico (Cifrador* miCifrador)</w:t>
@@ -2844,7 +3094,7 @@
                 <w:noProof/>
                 <w:webHidden/>
               </w:rPr>
-              <w:instrText xml:space="preserve"> PAGEREF _Toc240640934 \h </w:instrText>
+              <w:instrText xml:space="preserve"> PAGEREF _Toc240650670 \h </w:instrText>
             </w:r>
             <w:r>
               <w:rPr>
@@ -2883,26 +3133,40 @@
               <w:tab w:val="right" w:leader="dot" w:pos="8828"/>
             </w:tabs>
             <w:rPr>
+              <w:rFonts w:eastAsiaTheme="minorEastAsia"/>
               <w:noProof/>
+              <w:kern w:val="2"/>
+              <w:sz w:val="24"/>
+              <w:szCs w:val="24"/>
+              <w:lang w:eastAsia="es-HN"/>
+              <w14:ligatures w14:val="standardContextual"/>
             </w:rPr>
           </w:pPr>
-          <w:hyperlink w:anchor="_Toc240640935" w:history="1">
+          <w:hyperlink w:anchor="_Toc240650671" w:history="1">
             <w:r>
               <w:rPr>
                 <w:rStyle w:val="Hipervnculo"/>
+                <w:rFonts w:ascii="Times New Roman" w:hAnsi="Times New Roman" w:cs="Times New Roman"/>
                 <w:noProof/>
               </w:rPr>
               <w:t>3.</w:t>
             </w:r>
             <w:r>
               <w:rPr>
-                <w:noProof/>
+                <w:rFonts w:eastAsiaTheme="minorEastAsia"/>
+                <w:noProof/>
+                <w:kern w:val="2"/>
+                <w:sz w:val="24"/>
+                <w:szCs w:val="24"/>
+                <w:lang w:eastAsia="es-HN"/>
+                <w14:ligatures w14:val="standardContextual"/>
               </w:rPr>
               <w:tab/>
             </w:r>
             <w:r>
               <w:rPr>
                 <w:rStyle w:val="Hipervnculo"/>
+                <w:rFonts w:ascii="Times New Roman" w:hAnsi="Times New Roman" w:cs="Times New Roman"/>
                 <w:noProof/>
               </w:rPr>
               <w:t>Doble puntero (Usuario** listaUsuarios)</w:t>
@@ -2926,7 +3190,7 @@
                 <w:noProof/>
                 <w:webHidden/>
               </w:rPr>
-              <w:instrText xml:space="preserve"> PAGEREF _Toc240640935 \h </w:instrText>
+              <w:instrText xml:space="preserve"> PAGEREF _Toc240650671 \h </w:instrText>
             </w:r>
             <w:r>
               <w:rPr>
@@ -2964,13 +3228,20 @@
               <w:tab w:val="right" w:leader="dot" w:pos="8828"/>
             </w:tabs>
             <w:rPr>
+              <w:rFonts w:eastAsiaTheme="minorEastAsia"/>
               <w:noProof/>
+              <w:kern w:val="2"/>
+              <w:sz w:val="24"/>
+              <w:szCs w:val="24"/>
+              <w:lang w:eastAsia="es-HN"/>
+              <w14:ligatures w14:val="standardContextual"/>
             </w:rPr>
           </w:pPr>
-          <w:hyperlink w:anchor="_Toc240640936" w:history="1">
+          <w:hyperlink w:anchor="_Toc240650672" w:history="1">
             <w:r>
               <w:rPr>
                 <w:rStyle w:val="Hipervnculo"/>
+                <w:rFonts w:ascii="Times New Roman" w:hAnsi="Times New Roman" w:cs="Times New Roman"/>
                 <w:noProof/>
               </w:rPr>
               <w:t>Optimización de memoria</w:t>
@@ -2994,7 +3265,7 @@
                 <w:noProof/>
                 <w:webHidden/>
               </w:rPr>
-              <w:instrText xml:space="preserve"> PAGEREF _Toc240640936 \h </w:instrText>
+              <w:instrText xml:space="preserve"> PAGEREF _Toc240650672 \h </w:instrText>
             </w:r>
             <w:r>
               <w:rPr>
@@ -3033,26 +3304,40 @@
               <w:tab w:val="right" w:leader="dot" w:pos="8828"/>
             </w:tabs>
             <w:rPr>
+              <w:rFonts w:eastAsiaTheme="minorEastAsia"/>
               <w:noProof/>
+              <w:kern w:val="2"/>
+              <w:sz w:val="24"/>
+              <w:szCs w:val="24"/>
+              <w:lang w:eastAsia="es-HN"/>
+              <w14:ligatures w14:val="standardContextual"/>
             </w:rPr>
           </w:pPr>
-          <w:hyperlink w:anchor="_Toc240640937" w:history="1">
+          <w:hyperlink w:anchor="_Toc240650673" w:history="1">
             <w:r>
               <w:rPr>
                 <w:rStyle w:val="Hipervnculo"/>
+                <w:rFonts w:ascii="Times New Roman" w:hAnsi="Times New Roman" w:cs="Times New Roman"/>
                 <w:noProof/>
               </w:rPr>
               <w:t>1.</w:t>
             </w:r>
             <w:r>
               <w:rPr>
-                <w:noProof/>
+                <w:rFonts w:eastAsiaTheme="minorEastAsia"/>
+                <w:noProof/>
+                <w:kern w:val="2"/>
+                <w:sz w:val="24"/>
+                <w:szCs w:val="24"/>
+                <w:lang w:eastAsia="es-HN"/>
+                <w14:ligatures w14:val="standardContextual"/>
               </w:rPr>
               <w:tab/>
             </w:r>
             <w:r>
               <w:rPr>
                 <w:rStyle w:val="Hipervnculo"/>
+                <w:rFonts w:ascii="Times New Roman" w:hAnsi="Times New Roman" w:cs="Times New Roman"/>
                 <w:noProof/>
               </w:rPr>
               <w:t>Arreglos dinámicos “inteligentes”</w:t>
@@ -3076,7 +3361,7 @@
                 <w:noProof/>
                 <w:webHidden/>
               </w:rPr>
-              <w:instrText xml:space="preserve"> PAGEREF _Toc240640937 \h </w:instrText>
+              <w:instrText xml:space="preserve"> PAGEREF _Toc240650673 \h </w:instrText>
             </w:r>
             <w:r>
               <w:rPr>
@@ -3115,26 +3400,40 @@
               <w:tab w:val="right" w:leader="dot" w:pos="8828"/>
             </w:tabs>
             <w:rPr>
+              <w:rFonts w:eastAsiaTheme="minorEastAsia"/>
               <w:noProof/>
+              <w:kern w:val="2"/>
+              <w:sz w:val="24"/>
+              <w:szCs w:val="24"/>
+              <w:lang w:eastAsia="es-HN"/>
+              <w14:ligatures w14:val="standardContextual"/>
             </w:rPr>
           </w:pPr>
-          <w:hyperlink w:anchor="_Toc240640938" w:history="1">
+          <w:hyperlink w:anchor="_Toc240650674" w:history="1">
             <w:r>
               <w:rPr>
                 <w:rStyle w:val="Hipervnculo"/>
+                <w:rFonts w:ascii="Times New Roman" w:hAnsi="Times New Roman" w:cs="Times New Roman"/>
                 <w:noProof/>
               </w:rPr>
               <w:t>2.</w:t>
             </w:r>
             <w:r>
               <w:rPr>
-                <w:noProof/>
+                <w:rFonts w:eastAsiaTheme="minorEastAsia"/>
+                <w:noProof/>
+                <w:kern w:val="2"/>
+                <w:sz w:val="24"/>
+                <w:szCs w:val="24"/>
+                <w:lang w:eastAsia="es-HN"/>
+                <w14:ligatures w14:val="standardContextual"/>
               </w:rPr>
               <w:tab/>
             </w:r>
             <w:r>
               <w:rPr>
                 <w:rStyle w:val="Hipervnculo"/>
+                <w:rFonts w:ascii="Times New Roman" w:hAnsi="Times New Roman" w:cs="Times New Roman"/>
                 <w:noProof/>
               </w:rPr>
               <w:t>Reserva exacta de bytes</w:t>
@@ -3158,7 +3457,7 @@
                 <w:noProof/>
                 <w:webHidden/>
               </w:rPr>
-              <w:instrText xml:space="preserve"> PAGEREF _Toc240640938 \h </w:instrText>
+              <w:instrText xml:space="preserve"> PAGEREF _Toc240650674 \h </w:instrText>
             </w:r>
             <w:r>
               <w:rPr>
@@ -3196,13 +3495,20 @@
               <w:tab w:val="right" w:leader="dot" w:pos="8828"/>
             </w:tabs>
             <w:rPr>
+              <w:rFonts w:eastAsiaTheme="minorEastAsia"/>
               <w:noProof/>
+              <w:kern w:val="2"/>
+              <w:sz w:val="24"/>
+              <w:szCs w:val="24"/>
+              <w:lang w:eastAsia="es-HN"/>
+              <w14:ligatures w14:val="standardContextual"/>
             </w:rPr>
           </w:pPr>
-          <w:hyperlink w:anchor="_Toc240640939" w:history="1">
+          <w:hyperlink w:anchor="_Toc240650675" w:history="1">
             <w:r>
               <w:rPr>
                 <w:rStyle w:val="Hipervnculo"/>
+                <w:rFonts w:ascii="Times New Roman" w:hAnsi="Times New Roman" w:cs="Times New Roman"/>
                 <w:noProof/>
               </w:rPr>
               <w:t>Módulo de historial, auditoría y ordenamiento (Nivel 4)</w:t>
@@ -3226,7 +3532,7 @@
                 <w:noProof/>
                 <w:webHidden/>
               </w:rPr>
-              <w:instrText xml:space="preserve"> PAGEREF _Toc240640939 \h </w:instrText>
+              <w:instrText xml:space="preserve"> PAGEREF _Toc240650675 \h </w:instrText>
             </w:r>
             <w:r>
               <w:rPr>
@@ -3264,13 +3570,20 @@
               <w:tab w:val="right" w:leader="dot" w:pos="8828"/>
             </w:tabs>
             <w:rPr>
+              <w:rFonts w:eastAsiaTheme="minorEastAsia"/>
               <w:noProof/>
+              <w:kern w:val="2"/>
+              <w:sz w:val="24"/>
+              <w:szCs w:val="24"/>
+              <w:lang w:eastAsia="es-HN"/>
+              <w14:ligatures w14:val="standardContextual"/>
             </w:rPr>
           </w:pPr>
-          <w:hyperlink w:anchor="_Toc240640940" w:history="1">
+          <w:hyperlink w:anchor="_Toc240650676" w:history="1">
             <w:r>
               <w:rPr>
                 <w:rStyle w:val="Hipervnculo"/>
+                <w:rFonts w:ascii="Times New Roman" w:hAnsi="Times New Roman" w:cs="Times New Roman"/>
                 <w:noProof/>
               </w:rPr>
               <w:t>Entidad Operacion</w:t>
@@ -3294,7 +3607,7 @@
                 <w:noProof/>
                 <w:webHidden/>
               </w:rPr>
-              <w:instrText xml:space="preserve"> PAGEREF _Toc240640940 \h </w:instrText>
+              <w:instrText xml:space="preserve"> PAGEREF _Toc240650676 \h </w:instrText>
             </w:r>
             <w:r>
               <w:rPr>
@@ -3332,13 +3645,20 @@
               <w:tab w:val="right" w:leader="dot" w:pos="8828"/>
             </w:tabs>
             <w:rPr>
+              <w:rFonts w:eastAsiaTheme="minorEastAsia"/>
               <w:noProof/>
+              <w:kern w:val="2"/>
+              <w:sz w:val="24"/>
+              <w:szCs w:val="24"/>
+              <w:lang w:eastAsia="es-HN"/>
+              <w14:ligatures w14:val="standardContextual"/>
             </w:rPr>
           </w:pPr>
-          <w:hyperlink w:anchor="_Toc240640941" w:history="1">
+          <w:hyperlink w:anchor="_Toc240650677" w:history="1">
             <w:r>
               <w:rPr>
                 <w:rStyle w:val="Hipervnculo"/>
+                <w:rFonts w:ascii="Times New Roman" w:hAnsi="Times New Roman" w:cs="Times New Roman"/>
                 <w:noProof/>
               </w:rPr>
               <w:t>Algoritmo de ordenamiento por fecha (Burbúja)</w:t>
@@ -3362,7 +3682,7 @@
                 <w:noProof/>
                 <w:webHidden/>
               </w:rPr>
-              <w:instrText xml:space="preserve"> PAGEREF _Toc240640941 \h </w:instrText>
+              <w:instrText xml:space="preserve"> PAGEREF _Toc240650677 \h </w:instrText>
             </w:r>
             <w:r>
               <w:rPr>
@@ -3400,13 +3720,20 @@
               <w:tab w:val="right" w:leader="dot" w:pos="8828"/>
             </w:tabs>
             <w:rPr>
+              <w:rFonts w:eastAsiaTheme="minorEastAsia"/>
               <w:noProof/>
+              <w:kern w:val="2"/>
+              <w:sz w:val="24"/>
+              <w:szCs w:val="24"/>
+              <w:lang w:eastAsia="es-HN"/>
+              <w14:ligatures w14:val="standardContextual"/>
             </w:rPr>
           </w:pPr>
-          <w:hyperlink w:anchor="_Toc240640942" w:history="1">
+          <w:hyperlink w:anchor="_Toc240650678" w:history="1">
             <w:r>
               <w:rPr>
                 <w:rStyle w:val="Hipervnculo"/>
+                <w:rFonts w:ascii="Times New Roman" w:hAnsi="Times New Roman" w:cs="Times New Roman"/>
                 <w:noProof/>
               </w:rPr>
               <w:t>Implementación de búsqueda lineal</w:t>
@@ -3430,7 +3757,7 @@
                 <w:noProof/>
                 <w:webHidden/>
               </w:rPr>
-              <w:instrText xml:space="preserve"> PAGEREF _Toc240640942 \h </w:instrText>
+              <w:instrText xml:space="preserve"> PAGEREF _Toc240650678 \h </w:instrText>
             </w:r>
             <w:r>
               <w:rPr>
@@ -3468,13 +3795,20 @@
               <w:tab w:val="right" w:leader="dot" w:pos="8828"/>
             </w:tabs>
             <w:rPr>
+              <w:rFonts w:eastAsiaTheme="minorEastAsia"/>
               <w:noProof/>
+              <w:kern w:val="2"/>
+              <w:sz w:val="24"/>
+              <w:szCs w:val="24"/>
+              <w:lang w:eastAsia="es-HN"/>
+              <w14:ligatures w14:val="standardContextual"/>
             </w:rPr>
           </w:pPr>
-          <w:hyperlink w:anchor="_Toc240640943" w:history="1">
+          <w:hyperlink w:anchor="_Toc240650679" w:history="1">
             <w:r>
               <w:rPr>
                 <w:rStyle w:val="Hipervnculo"/>
+                <w:rFonts w:ascii="Times New Roman" w:hAnsi="Times New Roman" w:cs="Times New Roman"/>
                 <w:noProof/>
               </w:rPr>
               <w:t>Pruebas y resultados</w:t>
@@ -3498,7 +3832,7 @@
                 <w:noProof/>
                 <w:webHidden/>
               </w:rPr>
-              <w:instrText xml:space="preserve"> PAGEREF _Toc240640943 \h </w:instrText>
+              <w:instrText xml:space="preserve"> PAGEREF _Toc240650679 \h </w:instrText>
             </w:r>
             <w:r>
               <w:rPr>
@@ -3536,13 +3870,20 @@
               <w:tab w:val="right" w:leader="dot" w:pos="8828"/>
             </w:tabs>
             <w:rPr>
+              <w:rFonts w:eastAsiaTheme="minorEastAsia"/>
               <w:noProof/>
+              <w:kern w:val="2"/>
+              <w:sz w:val="24"/>
+              <w:szCs w:val="24"/>
+              <w:lang w:eastAsia="es-HN"/>
+              <w14:ligatures w14:val="standardContextual"/>
             </w:rPr>
           </w:pPr>
-          <w:hyperlink w:anchor="_Toc240640944" w:history="1">
+          <w:hyperlink w:anchor="_Toc240650680" w:history="1">
             <w:r>
               <w:rPr>
                 <w:rStyle w:val="Hipervnculo"/>
+                <w:rFonts w:ascii="Times New Roman" w:hAnsi="Times New Roman" w:cs="Times New Roman"/>
                 <w:noProof/>
               </w:rPr>
               <w:t>Pruebas con datos inválidos</w:t>
@@ -3566,7 +3907,7 @@
                 <w:noProof/>
                 <w:webHidden/>
               </w:rPr>
-              <w:instrText xml:space="preserve"> PAGEREF _Toc240640944 \h </w:instrText>
+              <w:instrText xml:space="preserve"> PAGEREF _Toc240650680 \h </w:instrText>
             </w:r>
             <w:r>
               <w:rPr>
@@ -3604,13 +3945,20 @@
               <w:tab w:val="right" w:leader="dot" w:pos="8828"/>
             </w:tabs>
             <w:rPr>
+              <w:rFonts w:eastAsiaTheme="minorEastAsia"/>
               <w:noProof/>
+              <w:kern w:val="2"/>
+              <w:sz w:val="24"/>
+              <w:szCs w:val="24"/>
+              <w:lang w:eastAsia="es-HN"/>
+              <w14:ligatures w14:val="standardContextual"/>
             </w:rPr>
           </w:pPr>
-          <w:hyperlink w:anchor="_Toc240640945" w:history="1">
+          <w:hyperlink w:anchor="_Toc240650681" w:history="1">
             <w:r>
               <w:rPr>
                 <w:rStyle w:val="Hipervnculo"/>
+                <w:rFonts w:ascii="Times New Roman" w:hAnsi="Times New Roman" w:cs="Times New Roman"/>
                 <w:noProof/>
               </w:rPr>
               <w:t>Prueba con datos válidos</w:t>
@@ -3634,7 +3982,7 @@
                 <w:noProof/>
                 <w:webHidden/>
               </w:rPr>
-              <w:instrText xml:space="preserve"> PAGEREF _Toc240640945 \h </w:instrText>
+              <w:instrText xml:space="preserve"> PAGEREF _Toc240650681 \h </w:instrText>
             </w:r>
             <w:r>
               <w:rPr>
@@ -3672,13 +4020,20 @@
               <w:tab w:val="right" w:leader="dot" w:pos="8828"/>
             </w:tabs>
             <w:rPr>
+              <w:rFonts w:eastAsiaTheme="minorEastAsia"/>
               <w:noProof/>
+              <w:kern w:val="2"/>
+              <w:sz w:val="24"/>
+              <w:szCs w:val="24"/>
+              <w:lang w:eastAsia="es-HN"/>
+              <w14:ligatures w14:val="standardContextual"/>
             </w:rPr>
           </w:pPr>
-          <w:hyperlink w:anchor="_Toc240640946" w:history="1">
+          <w:hyperlink w:anchor="_Toc240650682" w:history="1">
             <w:r>
               <w:rPr>
                 <w:rStyle w:val="Hipervnculo"/>
+                <w:rFonts w:ascii="Times New Roman" w:hAnsi="Times New Roman" w:cs="Times New Roman"/>
                 <w:noProof/>
               </w:rPr>
               <w:t>Evidencia de validaciones y del historial</w:t>
@@ -3702,7 +4057,7 @@
                 <w:noProof/>
                 <w:webHidden/>
               </w:rPr>
-              <w:instrText xml:space="preserve"> PAGEREF _Toc240640946 \h </w:instrText>
+              <w:instrText xml:space="preserve"> PAGEREF _Toc240650682 \h </w:instrText>
             </w:r>
             <w:r>
               <w:rPr>
@@ -3740,13 +4095,20 @@
               <w:tab w:val="right" w:leader="dot" w:pos="8828"/>
             </w:tabs>
             <w:rPr>
+              <w:rFonts w:eastAsiaTheme="minorEastAsia"/>
               <w:noProof/>
+              <w:kern w:val="2"/>
+              <w:sz w:val="24"/>
+              <w:szCs w:val="24"/>
+              <w:lang w:eastAsia="es-HN"/>
+              <w14:ligatures w14:val="standardContextual"/>
             </w:rPr>
           </w:pPr>
-          <w:hyperlink w:anchor="_Toc240640947" w:history="1">
+          <w:hyperlink w:anchor="_Toc240650683" w:history="1">
             <w:r>
               <w:rPr>
                 <w:rStyle w:val="Hipervnculo"/>
+                <w:rFonts w:ascii="Times New Roman" w:hAnsi="Times New Roman" w:cs="Times New Roman"/>
                 <w:noProof/>
               </w:rPr>
               <w:t>Resultado final obtenido</w:t>
@@ -3770,7 +4132,7 @@
                 <w:noProof/>
                 <w:webHidden/>
               </w:rPr>
-              <w:instrText xml:space="preserve"> PAGEREF _Toc240640947 \h </w:instrText>
+              <w:instrText xml:space="preserve"> PAGEREF _Toc240650683 \h </w:instrText>
             </w:r>
             <w:r>
               <w:rPr>
@@ -3808,13 +4170,20 @@
               <w:tab w:val="right" w:leader="dot" w:pos="8828"/>
             </w:tabs>
             <w:rPr>
+              <w:rFonts w:eastAsiaTheme="minorEastAsia"/>
               <w:noProof/>
+              <w:kern w:val="2"/>
+              <w:sz w:val="24"/>
+              <w:szCs w:val="24"/>
+              <w:lang w:eastAsia="es-HN"/>
+              <w14:ligatures w14:val="standardContextual"/>
             </w:rPr>
           </w:pPr>
-          <w:hyperlink w:anchor="_Toc240640948" w:history="1">
+          <w:hyperlink w:anchor="_Toc240650684" w:history="1">
             <w:r>
               <w:rPr>
                 <w:rStyle w:val="Hipervnculo"/>
+                <w:rFonts w:ascii="Times New Roman" w:hAnsi="Times New Roman" w:cs="Times New Roman"/>
                 <w:noProof/>
               </w:rPr>
               <w:t>Manual de Usuario</w:t>
@@ -3838,7 +4207,7 @@
                 <w:noProof/>
                 <w:webHidden/>
               </w:rPr>
-              <w:instrText xml:space="preserve"> PAGEREF _Toc240640948 \h </w:instrText>
+              <w:instrText xml:space="preserve"> PAGEREF _Toc240650684 \h </w:instrText>
             </w:r>
             <w:r>
               <w:rPr>
@@ -3876,13 +4245,20 @@
               <w:tab w:val="right" w:leader="dot" w:pos="8828"/>
             </w:tabs>
             <w:rPr>
+              <w:rFonts w:eastAsiaTheme="minorEastAsia"/>
               <w:noProof/>
+              <w:kern w:val="2"/>
+              <w:sz w:val="24"/>
+              <w:szCs w:val="24"/>
+              <w:lang w:eastAsia="es-HN"/>
+              <w14:ligatures w14:val="standardContextual"/>
             </w:rPr>
           </w:pPr>
-          <w:hyperlink w:anchor="_Toc240640949" w:history="1">
+          <w:hyperlink w:anchor="_Toc240650685" w:history="1">
             <w:r>
               <w:rPr>
                 <w:rStyle w:val="Hipervnculo"/>
+                <w:rFonts w:ascii="Times New Roman" w:hAnsi="Times New Roman" w:cs="Times New Roman"/>
                 <w:noProof/>
               </w:rPr>
               <w:t>Introducción y propósito del sistema</w:t>
@@ -3906,7 +4282,7 @@
                 <w:noProof/>
                 <w:webHidden/>
               </w:rPr>
-              <w:instrText xml:space="preserve"> PAGEREF _Toc240640949 \h </w:instrText>
+              <w:instrText xml:space="preserve"> PAGEREF _Toc240650685 \h </w:instrText>
             </w:r>
             <w:r>
               <w:rPr>
@@ -3944,13 +4320,20 @@
               <w:tab w:val="right" w:leader="dot" w:pos="8828"/>
             </w:tabs>
             <w:rPr>
+              <w:rFonts w:eastAsiaTheme="minorEastAsia"/>
               <w:noProof/>
+              <w:kern w:val="2"/>
+              <w:sz w:val="24"/>
+              <w:szCs w:val="24"/>
+              <w:lang w:eastAsia="es-HN"/>
+              <w14:ligatures w14:val="standardContextual"/>
             </w:rPr>
           </w:pPr>
-          <w:hyperlink w:anchor="_Toc240640950" w:history="1">
+          <w:hyperlink w:anchor="_Toc240650686" w:history="1">
             <w:r>
               <w:rPr>
                 <w:rStyle w:val="Hipervnculo"/>
+                <w:rFonts w:ascii="Times New Roman" w:hAnsi="Times New Roman" w:cs="Times New Roman"/>
                 <w:noProof/>
               </w:rPr>
               <w:t>Requisitos de ejecución y guía de inicio rápido</w:t>
@@ -3974,7 +4357,7 @@
                 <w:noProof/>
                 <w:webHidden/>
               </w:rPr>
-              <w:instrText xml:space="preserve"> PAGEREF _Toc240640950 \h </w:instrText>
+              <w:instrText xml:space="preserve"> PAGEREF _Toc240650686 \h </w:instrText>
             </w:r>
             <w:r>
               <w:rPr>
@@ -4012,13 +4395,20 @@
               <w:tab w:val="right" w:leader="dot" w:pos="8828"/>
             </w:tabs>
             <w:rPr>
+              <w:rFonts w:eastAsiaTheme="minorEastAsia"/>
               <w:noProof/>
+              <w:kern w:val="2"/>
+              <w:sz w:val="24"/>
+              <w:szCs w:val="24"/>
+              <w:lang w:eastAsia="es-HN"/>
+              <w14:ligatures w14:val="standardContextual"/>
             </w:rPr>
           </w:pPr>
-          <w:hyperlink w:anchor="_Toc240640951" w:history="1">
+          <w:hyperlink w:anchor="_Toc240650687" w:history="1">
             <w:r>
               <w:rPr>
                 <w:rStyle w:val="Hipervnculo"/>
+                <w:rFonts w:ascii="Times New Roman" w:hAnsi="Times New Roman" w:cs="Times New Roman"/>
                 <w:noProof/>
               </w:rPr>
               <w:t>Guía de pasos de inicio rápido</w:t>
@@ -4042,7 +4432,7 @@
                 <w:noProof/>
                 <w:webHidden/>
               </w:rPr>
-              <w:instrText xml:space="preserve"> PAGEREF _Toc240640951 \h </w:instrText>
+              <w:instrText xml:space="preserve"> PAGEREF _Toc240650687 \h </w:instrText>
             </w:r>
             <w:r>
               <w:rPr>
@@ -4080,13 +4470,20 @@
               <w:tab w:val="right" w:leader="dot" w:pos="8828"/>
             </w:tabs>
             <w:rPr>
+              <w:rFonts w:eastAsiaTheme="minorEastAsia"/>
               <w:noProof/>
+              <w:kern w:val="2"/>
+              <w:sz w:val="24"/>
+              <w:szCs w:val="24"/>
+              <w:lang w:eastAsia="es-HN"/>
+              <w14:ligatures w14:val="standardContextual"/>
             </w:rPr>
           </w:pPr>
-          <w:hyperlink w:anchor="_Toc240640952" w:history="1">
+          <w:hyperlink w:anchor="_Toc240650688" w:history="1">
             <w:r>
               <w:rPr>
                 <w:rStyle w:val="Hipervnculo"/>
+                <w:rFonts w:ascii="Times New Roman" w:hAnsi="Times New Roman" w:cs="Times New Roman"/>
                 <w:noProof/>
               </w:rPr>
               <w:t>Control de acceso y gestión de usuarios</w:t>
@@ -4110,7 +4507,7 @@
                 <w:noProof/>
                 <w:webHidden/>
               </w:rPr>
-              <w:instrText xml:space="preserve"> PAGEREF _Toc240640952 \h </w:instrText>
+              <w:instrText xml:space="preserve"> PAGEREF _Toc240650688 \h </w:instrText>
             </w:r>
             <w:r>
               <w:rPr>
@@ -4148,13 +4545,20 @@
               <w:tab w:val="right" w:leader="dot" w:pos="8828"/>
             </w:tabs>
             <w:rPr>
+              <w:rFonts w:eastAsiaTheme="minorEastAsia"/>
               <w:noProof/>
+              <w:kern w:val="2"/>
+              <w:sz w:val="24"/>
+              <w:szCs w:val="24"/>
+              <w:lang w:eastAsia="es-HN"/>
+              <w14:ligatures w14:val="standardContextual"/>
             </w:rPr>
           </w:pPr>
-          <w:hyperlink w:anchor="_Toc240640953" w:history="1">
+          <w:hyperlink w:anchor="_Toc240650689" w:history="1">
             <w:r>
               <w:rPr>
                 <w:rStyle w:val="Hipervnculo"/>
+                <w:rFonts w:ascii="Times New Roman" w:hAnsi="Times New Roman" w:cs="Times New Roman"/>
                 <w:noProof/>
               </w:rPr>
               <w:t>Operaciones en consola y menú principal (opciones 1-6)</w:t>
@@ -4178,7 +4582,7 @@
                 <w:noProof/>
                 <w:webHidden/>
               </w:rPr>
-              <w:instrText xml:space="preserve"> PAGEREF _Toc240640953 \h </w:instrText>
+              <w:instrText xml:space="preserve"> PAGEREF _Toc240650689 \h </w:instrText>
             </w:r>
             <w:r>
               <w:rPr>
@@ -4216,13 +4620,20 @@
               <w:tab w:val="right" w:leader="dot" w:pos="8828"/>
             </w:tabs>
             <w:rPr>
+              <w:rFonts w:eastAsiaTheme="minorEastAsia"/>
               <w:noProof/>
+              <w:kern w:val="2"/>
+              <w:sz w:val="24"/>
+              <w:szCs w:val="24"/>
+              <w:lang w:eastAsia="es-HN"/>
+              <w14:ligatures w14:val="standardContextual"/>
             </w:rPr>
           </w:pPr>
-          <w:hyperlink w:anchor="_Toc240640954" w:history="1">
+          <w:hyperlink w:anchor="_Toc240650690" w:history="1">
             <w:r>
               <w:rPr>
                 <w:rStyle w:val="Hipervnculo"/>
+                <w:rFonts w:ascii="Times New Roman" w:hAnsi="Times New Roman" w:cs="Times New Roman"/>
                 <w:noProof/>
               </w:rPr>
               <w:t>Operaciones de archivos y auditoría (opciones 7 a 9)</w:t>
@@ -4246,7 +4657,7 @@
                 <w:noProof/>
                 <w:webHidden/>
               </w:rPr>
-              <w:instrText xml:space="preserve"> PAGEREF _Toc240640954 \h </w:instrText>
+              <w:instrText xml:space="preserve"> PAGEREF _Toc240650690 \h </w:instrText>
             </w:r>
             <w:r>
               <w:rPr>
@@ -4284,13 +4695,20 @@
               <w:tab w:val="right" w:leader="dot" w:pos="8828"/>
             </w:tabs>
             <w:rPr>
+              <w:rFonts w:eastAsiaTheme="minorEastAsia"/>
               <w:noProof/>
+              <w:kern w:val="2"/>
+              <w:sz w:val="24"/>
+              <w:szCs w:val="24"/>
+              <w:lang w:eastAsia="es-HN"/>
+              <w14:ligatures w14:val="standardContextual"/>
             </w:rPr>
           </w:pPr>
-          <w:hyperlink w:anchor="_Toc240640955" w:history="1">
+          <w:hyperlink w:anchor="_Toc240650691" w:history="1">
             <w:r>
               <w:rPr>
                 <w:rStyle w:val="Hipervnculo"/>
+                <w:rFonts w:ascii="Times New Roman" w:hAnsi="Times New Roman" w:cs="Times New Roman"/>
                 <w:noProof/>
               </w:rPr>
               <w:t>Opción7: Copiar archivo binario</w:t>
@@ -4314,7 +4732,7 @@
                 <w:noProof/>
                 <w:webHidden/>
               </w:rPr>
-              <w:instrText xml:space="preserve"> PAGEREF _Toc240640955 \h </w:instrText>
+              <w:instrText xml:space="preserve"> PAGEREF _Toc240650691 \h </w:instrText>
             </w:r>
             <w:r>
               <w:rPr>
@@ -4352,13 +4770,20 @@
               <w:tab w:val="right" w:leader="dot" w:pos="8828"/>
             </w:tabs>
             <w:rPr>
+              <w:rFonts w:eastAsiaTheme="minorEastAsia"/>
               <w:noProof/>
+              <w:kern w:val="2"/>
+              <w:sz w:val="24"/>
+              <w:szCs w:val="24"/>
+              <w:lang w:eastAsia="es-HN"/>
+              <w14:ligatures w14:val="standardContextual"/>
             </w:rPr>
           </w:pPr>
-          <w:hyperlink w:anchor="_Toc240640956" w:history="1">
+          <w:hyperlink w:anchor="_Toc240650692" w:history="1">
             <w:r>
               <w:rPr>
                 <w:rStyle w:val="Hipervnculo"/>
+                <w:rFonts w:ascii="Times New Roman" w:hAnsi="Times New Roman" w:cs="Times New Roman"/>
                 <w:noProof/>
               </w:rPr>
               <w:t>Opción 8: Cifrar/Descifrar archivo</w:t>
@@ -4382,7 +4807,7 @@
                 <w:noProof/>
                 <w:webHidden/>
               </w:rPr>
-              <w:instrText xml:space="preserve"> PAGEREF _Toc240640956 \h </w:instrText>
+              <w:instrText xml:space="preserve"> PAGEREF _Toc240650692 \h </w:instrText>
             </w:r>
             <w:r>
               <w:rPr>
@@ -4420,13 +4845,20 @@
               <w:tab w:val="right" w:leader="dot" w:pos="8828"/>
             </w:tabs>
             <w:rPr>
+              <w:rFonts w:eastAsiaTheme="minorEastAsia"/>
               <w:noProof/>
+              <w:kern w:val="2"/>
+              <w:sz w:val="24"/>
+              <w:szCs w:val="24"/>
+              <w:lang w:eastAsia="es-HN"/>
+              <w14:ligatures w14:val="standardContextual"/>
             </w:rPr>
           </w:pPr>
-          <w:hyperlink w:anchor="_Toc240640957" w:history="1">
+          <w:hyperlink w:anchor="_Toc240650693" w:history="1">
             <w:r>
               <w:rPr>
                 <w:rStyle w:val="Hipervnculo"/>
+                <w:rFonts w:ascii="Times New Roman" w:hAnsi="Times New Roman" w:cs="Times New Roman"/>
                 <w:noProof/>
               </w:rPr>
               <w:t>Opción 9: Historial y reportes (submenú)</w:t>
@@ -4450,7 +4882,7 @@
                 <w:noProof/>
                 <w:webHidden/>
               </w:rPr>
-              <w:instrText xml:space="preserve"> PAGEREF _Toc240640957 \h </w:instrText>
+              <w:instrText xml:space="preserve"> PAGEREF _Toc240650693 \h </w:instrText>
             </w:r>
             <w:r>
               <w:rPr>
@@ -4470,7 +4902,7 @@
                 <w:noProof/>
                 <w:webHidden/>
               </w:rPr>
-              <w:t>24</w:t>
+              <w:t>23</w:t>
             </w:r>
             <w:r>
               <w:rPr>
@@ -4488,13 +4920,20 @@
               <w:tab w:val="right" w:leader="dot" w:pos="8828"/>
             </w:tabs>
             <w:rPr>
+              <w:rFonts w:eastAsiaTheme="minorEastAsia"/>
               <w:noProof/>
+              <w:kern w:val="2"/>
+              <w:sz w:val="24"/>
+              <w:szCs w:val="24"/>
+              <w:lang w:eastAsia="es-HN"/>
+              <w14:ligatures w14:val="standardContextual"/>
             </w:rPr>
           </w:pPr>
-          <w:hyperlink w:anchor="_Toc240640958" w:history="1">
+          <w:hyperlink w:anchor="_Toc240650694" w:history="1">
             <w:r>
               <w:rPr>
                 <w:rStyle w:val="Hipervnculo"/>
+                <w:rFonts w:ascii="Times New Roman" w:hAnsi="Times New Roman" w:cs="Times New Roman"/>
                 <w:noProof/>
               </w:rPr>
               <w:t>Solución de problemas</w:t>
@@ -4518,7 +4957,7 @@
                 <w:noProof/>
                 <w:webHidden/>
               </w:rPr>
-              <w:instrText xml:space="preserve"> PAGEREF _Toc240640958 \h </w:instrText>
+              <w:instrText xml:space="preserve"> PAGEREF _Toc240650694 \h </w:instrText>
             </w:r>
             <w:r>
               <w:rPr>
@@ -4556,13 +4995,20 @@
               <w:tab w:val="right" w:leader="dot" w:pos="8828"/>
             </w:tabs>
             <w:rPr>
+              <w:rFonts w:eastAsiaTheme="minorEastAsia"/>
               <w:noProof/>
+              <w:kern w:val="2"/>
+              <w:sz w:val="24"/>
+              <w:szCs w:val="24"/>
+              <w:lang w:eastAsia="es-HN"/>
+              <w14:ligatures w14:val="standardContextual"/>
             </w:rPr>
           </w:pPr>
-          <w:hyperlink w:anchor="_Toc240640959" w:history="1">
+          <w:hyperlink w:anchor="_Toc240650695" w:history="1">
             <w:r>
               <w:rPr>
                 <w:rStyle w:val="Hipervnculo"/>
+                <w:rFonts w:ascii="Times New Roman" w:hAnsi="Times New Roman" w:cs="Times New Roman"/>
                 <w:noProof/>
               </w:rPr>
               <w:t>Conclusiones</w:t>
@@ -4586,7 +5032,7 @@
                 <w:noProof/>
                 <w:webHidden/>
               </w:rPr>
-              <w:instrText xml:space="preserve"> PAGEREF _Toc240640959 \h </w:instrText>
+              <w:instrText xml:space="preserve"> PAGEREF _Toc240650695 \h </w:instrText>
             </w:r>
             <w:r>
               <w:rPr>
@@ -4624,13 +5070,20 @@
               <w:tab w:val="right" w:leader="dot" w:pos="8828"/>
             </w:tabs>
             <w:rPr>
+              <w:rFonts w:eastAsiaTheme="minorEastAsia"/>
               <w:noProof/>
+              <w:kern w:val="2"/>
+              <w:sz w:val="24"/>
+              <w:szCs w:val="24"/>
+              <w:lang w:eastAsia="es-HN"/>
+              <w14:ligatures w14:val="standardContextual"/>
             </w:rPr>
           </w:pPr>
-          <w:hyperlink w:anchor="_Toc240640960" w:history="1">
+          <w:hyperlink w:anchor="_Toc240650696" w:history="1">
             <w:r>
               <w:rPr>
                 <w:rStyle w:val="Hipervnculo"/>
+                <w:rFonts w:ascii="Times New Roman" w:hAnsi="Times New Roman" w:cs="Times New Roman"/>
                 <w:noProof/>
               </w:rPr>
               <w:t>Bibliografías/Referencias</w:t>
@@ -4654,7 +5107,7 @@
                 <w:noProof/>
                 <w:webHidden/>
               </w:rPr>
-              <w:instrText xml:space="preserve"> PAGEREF _Toc240640960 \h </w:instrText>
+              <w:instrText xml:space="preserve"> PAGEREF _Toc240650696 \h </w:instrText>
             </w:r>
             <w:r>
               <w:rPr>
@@ -4674,7 +5127,7 @@
                 <w:noProof/>
                 <w:webHidden/>
               </w:rPr>
-              <w:t>26</w:t>
+              <w:t>25</w:t>
             </w:r>
             <w:r>
               <w:rPr>
@@ -4692,13 +5145,20 @@
               <w:tab w:val="right" w:leader="dot" w:pos="8828"/>
             </w:tabs>
             <w:rPr>
+              <w:rFonts w:eastAsiaTheme="minorEastAsia"/>
               <w:noProof/>
+              <w:kern w:val="2"/>
+              <w:sz w:val="24"/>
+              <w:szCs w:val="24"/>
+              <w:lang w:eastAsia="es-HN"/>
+              <w14:ligatures w14:val="standardContextual"/>
             </w:rPr>
           </w:pPr>
-          <w:hyperlink w:anchor="_Toc240640961" w:history="1">
+          <w:hyperlink w:anchor="_Toc240650697" w:history="1">
             <w:r>
               <w:rPr>
                 <w:rStyle w:val="Hipervnculo"/>
+                <w:rFonts w:ascii="Times New Roman" w:hAnsi="Times New Roman" w:cs="Times New Roman"/>
                 <w:noProof/>
               </w:rPr>
               <w:t>Anexos</w:t>
@@ -4722,7 +5182,7 @@
                 <w:noProof/>
                 <w:webHidden/>
               </w:rPr>
-              <w:instrText xml:space="preserve"> PAGEREF _Toc240640961 \h </w:instrText>
+              <w:instrText xml:space="preserve"> PAGEREF _Toc240650697 \h </w:instrText>
             </w:r>
             <w:r>
               <w:rPr>
@@ -4779,7 +5239,7 @@
         </w:rPr>
       </w:pPr>
       <w:bookmarkStart w:id="1" w:name="_Toc240593474"/>
-      <w:bookmarkStart w:id="2" w:name="_Toc240640906"/>
+      <w:bookmarkStart w:id="2" w:name="_Toc240650642"/>
       <w:r>
         <w:rPr>
           <w:rFonts w:ascii="Times New Roman" w:hAnsi="Times New Roman" w:cs="Times New Roman"/>
@@ -4841,7 +5301,7 @@
         </w:rPr>
       </w:pPr>
       <w:bookmarkStart w:id="3" w:name="_Toc240593475"/>
-      <w:bookmarkStart w:id="4" w:name="_Toc240640907"/>
+      <w:bookmarkStart w:id="4" w:name="_Toc240650643"/>
       <w:r>
         <w:rPr>
           <w:rFonts w:ascii="Times New Roman" w:hAnsi="Times New Roman" w:cs="Times New Roman"/>
@@ -4874,7 +5334,7 @@
         </w:rPr>
       </w:pPr>
       <w:bookmarkStart w:id="5" w:name="_Toc240593476"/>
-      <w:bookmarkStart w:id="6" w:name="_Toc240640908"/>
+      <w:bookmarkStart w:id="6" w:name="_Toc240650644"/>
       <w:r>
         <w:rPr>
           <w:rFonts w:ascii="Times New Roman" w:hAnsi="Times New Roman" w:cs="Times New Roman"/>
@@ -5045,7 +5505,7 @@
         </w:rPr>
       </w:pPr>
       <w:bookmarkStart w:id="7" w:name="_Toc240593477"/>
-      <w:bookmarkStart w:id="8" w:name="_Toc240640909"/>
+      <w:bookmarkStart w:id="8" w:name="_Toc240650645"/>
       <w:r>
         <w:rPr>
           <w:rFonts w:ascii="Times New Roman" w:hAnsi="Times New Roman" w:cs="Times New Roman"/>
@@ -5341,7 +5801,7 @@
           <w:rFonts w:ascii="Times New Roman" w:hAnsi="Times New Roman" w:cs="Times New Roman"/>
         </w:rPr>
       </w:pPr>
-      <w:bookmarkStart w:id="9" w:name="_Toc240640910"/>
+      <w:bookmarkStart w:id="9" w:name="_Toc240650646"/>
       <w:r>
         <w:rPr>
           <w:rFonts w:ascii="Times New Roman" w:hAnsi="Times New Roman" w:cs="Times New Roman"/>
@@ -5361,13 +5821,7 @@
         <w:rPr>
           <w:rFonts w:ascii="Times New Roman" w:hAnsi="Times New Roman" w:cs="Times New Roman"/>
         </w:rPr>
-        <w:t>E</w:t>
-      </w:r>
-      <w:r>
-        <w:rPr>
-          <w:rFonts w:ascii="Times New Roman" w:hAnsi="Times New Roman" w:cs="Times New Roman"/>
-        </w:rPr>
-        <w:t>l usuario dispone al ejecutar el programa son: Iniciar sesión, registrarse, encriptar y desencriptar mensajes en consola, copiar archivos binarios (validar que no haya problemas con archivos), cifrar/descifrar archivos mediante el explorador nativo de Windows, ver el historial completo tabulado, ordenar el historial de manera cronológica, buscar operaciones por filtros de nombre (nombre de usuario) y generar reporte de estadística de uso de los algoritmos.</w:t>
+        <w:t>El usuario dispone al ejecutar el programa son: Iniciar sesión, registrarse, encriptar y desencriptar mensajes en consola, copiar archivos binarios (validar que no haya problemas con archivos), cifrar/descifrar archivos mediante el explorador nativo de Windows, ver el historial completo tabulado, ordenar el historial de manera cronológica, buscar operaciones por filtros de nombre (nombre de usuario) y generar reporte de estadística de uso de los algoritmos.</w:t>
       </w:r>
       <w:r>
         <w:rPr>
@@ -5384,7 +5838,7 @@
           <w:rFonts w:ascii="Times New Roman" w:hAnsi="Times New Roman" w:cs="Times New Roman"/>
         </w:rPr>
       </w:pPr>
-      <w:bookmarkStart w:id="10" w:name="_Toc240640911"/>
+      <w:bookmarkStart w:id="10" w:name="_Toc240650647"/>
       <w:r>
         <w:rPr>
           <w:rFonts w:ascii="Times New Roman" w:hAnsi="Times New Roman" w:cs="Times New Roman"/>
@@ -5935,7 +6389,7 @@
           <w:rFonts w:ascii="Times New Roman" w:hAnsi="Times New Roman" w:cs="Times New Roman"/>
         </w:rPr>
       </w:pPr>
-      <w:bookmarkStart w:id="11" w:name="_Toc240640912"/>
+      <w:bookmarkStart w:id="11" w:name="_Toc240650648"/>
       <w:r>
         <w:rPr>
           <w:rFonts w:ascii="Times New Roman" w:hAnsi="Times New Roman" w:cs="Times New Roman"/>
@@ -6066,7 +6520,7 @@
           <w:rFonts w:ascii="Times New Roman" w:hAnsi="Times New Roman" w:cs="Times New Roman"/>
         </w:rPr>
       </w:pPr>
-      <w:bookmarkStart w:id="12" w:name="_Toc240640913"/>
+      <w:bookmarkStart w:id="12" w:name="_Toc240650649"/>
       <w:r>
         <w:rPr>
           <w:rFonts w:ascii="Times New Roman" w:hAnsi="Times New Roman" w:cs="Times New Roman"/>
@@ -6157,6 +6611,22 @@
         </w:rPr>
         <w:t xml:space="preserve">El siguiente diagrama ilustra la lógica detrás del cifrado César mediante dos ruedas: la exterior representa el alfabeto original y la interior el alfabeto desplazado según la clave elegida. </w:t>
       </w:r>
+    </w:p>
+    <w:p>
+      <w:pPr>
+        <w:jc w:val="both"/>
+        <w:rPr>
+          <w:rFonts w:ascii="Times New Roman" w:hAnsi="Times New Roman" w:cs="Times New Roman"/>
+        </w:rPr>
+      </w:pPr>
+    </w:p>
+    <w:p>
+      <w:pPr>
+        <w:jc w:val="both"/>
+        <w:rPr>
+          <w:rFonts w:ascii="Times New Roman" w:hAnsi="Times New Roman" w:cs="Times New Roman"/>
+        </w:rPr>
+      </w:pPr>
     </w:p>
     <w:p>
       <w:pPr>
@@ -6330,121 +6800,475 @@
         </w:rPr>
         <w:t>El siguiente diagrama resume el flujo general del sistema: desde el ingreso del usuario, pasando por la selección del algoritmo y la acción a realizar, hasta la lectura, transformación byte a byte y la escritura del archivo resultante.</w:t>
       </w:r>
-    </w:p>
-    <w:p>
-      <w:pPr>
-        <w:jc w:val="both"/>
-        <w:rPr>
-          <w:rFonts w:ascii="Times New Roman" w:hAnsi="Times New Roman" w:cs="Times New Roman"/>
-        </w:rPr>
-      </w:pPr>
-      <w:r>
-        <w:rPr>
-          <w:rFonts w:ascii="Times New Roman" w:hAnsi="Times New Roman" w:cs="Times New Roman"/>
-        </w:rPr>
-        <w:t xml:space="preserve">  </w:t>
-      </w:r>
-    </w:p>
-    <w:p>
-      <w:pPr>
-        <w:pStyle w:val="Ttulo1"/>
-        <w:jc w:val="both"/>
-        <w:rPr>
-          <w:rFonts w:ascii="Times New Roman" w:hAnsi="Times New Roman" w:cs="Times New Roman"/>
-        </w:rPr>
-      </w:pPr>
-      <w:bookmarkStart w:id="13" w:name="_Toc240640914"/>
-      <w:r>
-        <w:rPr>
-          <w:rFonts w:ascii="Times New Roman" w:hAnsi="Times New Roman" w:cs="Times New Roman"/>
-        </w:rPr>
-        <w:t>Investigación realizada</w:t>
-      </w:r>
-      <w:bookmarkEnd w:id="13"/>
-    </w:p>
-    <w:p>
-      <w:pPr>
-        <w:jc w:val="both"/>
-        <w:rPr>
-          <w:rFonts w:ascii="Times New Roman" w:hAnsi="Times New Roman" w:cs="Times New Roman"/>
-        </w:rPr>
-      </w:pPr>
-      <w:r>
-        <w:rPr>
-          <w:rFonts w:ascii="Times New Roman" w:hAnsi="Times New Roman" w:cs="Times New Roman"/>
-        </w:rPr>
-        <w:t>A continuación, se documentan los algoritmos investigados para el correcto funcionamiento del sistema, así como los elementos investigados por cuenta propia que no fueron desarrollados en su totalidad dentro del marco teórico de la clase.</w:t>
-      </w:r>
-    </w:p>
-    <w:p>
-      <w:pPr>
-        <w:pStyle w:val="Ttulo2"/>
-        <w:jc w:val="both"/>
-        <w:rPr>
-          <w:rFonts w:ascii="Times New Roman" w:hAnsi="Times New Roman" w:cs="Times New Roman"/>
-        </w:rPr>
-      </w:pPr>
-      <w:bookmarkStart w:id="14" w:name="_Toc240640915"/>
-      <w:r>
-        <w:rPr>
-          <w:rFonts w:ascii="Times New Roman" w:hAnsi="Times New Roman" w:cs="Times New Roman"/>
-        </w:rPr>
-        <w:t>Cifrado y descifrado César</w:t>
-      </w:r>
-      <w:bookmarkEnd w:id="14"/>
-    </w:p>
-    <w:p>
-      <w:pPr>
-        <w:jc w:val="both"/>
-        <w:rPr>
-          <w:rFonts w:ascii="Times New Roman" w:hAnsi="Times New Roman" w:cs="Times New Roman"/>
-        </w:rPr>
-      </w:pPr>
-      <w:r>
-        <w:rPr>
-          <w:rFonts w:ascii="Times New Roman" w:hAnsi="Times New Roman" w:cs="Times New Roman"/>
-        </w:rPr>
-        <w:t xml:space="preserve">El cifrado César consta de una clave (entre 1 – 26 para el alfabeto inglés y del 1 – 27 para el alfabeto español) para desplazar el abecedario esa cantidad de posiciones. Podemos tener una clave 3 (espacios) y nuestro abecedario se desplaza esa cantidad a la derecha para obtener una letra ya cifrada. Un ejemplo, siempre con clave 3, la letra A pasa a ser la letra D, la B pasa a la letra E, la C para a la letra F y así sucesivamente con el resto del alfabeto. Si el número de desplazamiento llega al final del abecedario y ya no hay más letras, las letras que sobran siguen avanzando las posiciones que deben, pero el inicio del abecedario. Ejemplo: la letra Z (clave 3) pasaría a ser C. La imagen de abajo es un sistema visual de </w:t>
-      </w:r>
-      <w:proofErr w:type="spellStart"/>
-      <w:r>
-        <w:rPr>
-          <w:rFonts w:ascii="Times New Roman" w:hAnsi="Times New Roman" w:cs="Times New Roman"/>
-        </w:rPr>
-        <w:t>como</w:t>
-      </w:r>
-      <w:proofErr w:type="spellEnd"/>
-      <w:r>
-        <w:rPr>
-          <w:rFonts w:ascii="Times New Roman" w:hAnsi="Times New Roman" w:cs="Times New Roman"/>
-        </w:rPr>
-        <w:t xml:space="preserve"> hacer el cifrado/descifrado César (moviendo el circulo interior las posiciones deseadas).</w:t>
-      </w:r>
-    </w:p>
-    <w:p>
-      <w:pPr>
-        <w:jc w:val="both"/>
-        <w:rPr>
-          <w:rFonts w:ascii="Times New Roman" w:hAnsi="Times New Roman" w:cs="Times New Roman"/>
-        </w:rPr>
-      </w:pPr>
-      <w:r>
-        <w:rPr>
-          <w:rFonts w:ascii="Times New Roman" w:hAnsi="Times New Roman" w:cs="Times New Roman"/>
+      <w:r>
+        <w:rPr>
+          <w:rFonts w:ascii="Times New Roman" w:hAnsi="Times New Roman" w:cs="Times New Roman"/>
+        </w:rPr>
+        <w:t xml:space="preserve"> </w:t>
+      </w:r>
+    </w:p>
+    <w:p>
+      <w:pPr>
+        <w:jc w:val="both"/>
+        <w:rPr>
+          <w:rFonts w:ascii="Times New Roman" w:hAnsi="Times New Roman" w:cs="Times New Roman"/>
+        </w:rPr>
+      </w:pPr>
+    </w:p>
+    <w:p>
+      <w:pPr>
+        <w:jc w:val="both"/>
+        <w:rPr>
+          <w:rFonts w:ascii="Times New Roman" w:hAnsi="Times New Roman" w:cs="Times New Roman"/>
+        </w:rPr>
+      </w:pPr>
+    </w:p>
+    <w:p>
+      <w:pPr>
+        <w:jc w:val="both"/>
+        <w:rPr>
+          <w:rFonts w:ascii="Times New Roman" w:hAnsi="Times New Roman" w:cs="Times New Roman"/>
+        </w:rPr>
+      </w:pPr>
+      <w:r>
+        <w:rPr>
+          <w:rFonts w:ascii="Times New Roman" w:hAnsi="Times New Roman" w:cs="Times New Roman"/>
+        </w:rPr>
+        <w:t xml:space="preserve">El siguiente diagrama explica de forma visual como funciona el cifrado XOR normal con texto plano y con archivos. El cifrado XOR funciona igual para ambos ya que trabaja bit a bit. </w:t>
+      </w:r>
+    </w:p>
+    <w:p>
+      <w:pPr>
+        <w:jc w:val="both"/>
+        <w:rPr>
+          <w:rFonts w:ascii="Times New Roman" w:hAnsi="Times New Roman" w:cs="Times New Roman"/>
+        </w:rPr>
+      </w:pPr>
+      <w:r>
+        <w:rPr>
           <w:noProof/>
-        </w:rPr>
-        <w:lastRenderedPageBreak/>
+          <w14:ligatures w14:val="standardContextual"/>
+        </w:rPr>
         <w:drawing>
-          <wp:anchor distT="0" distB="0" distL="114300" distR="114300" simplePos="0" relativeHeight="251667456" behindDoc="0" locked="0" layoutInCell="1" allowOverlap="1" wp14:anchorId="19BB2F59" wp14:editId="3D143AC8">
+          <wp:anchor distT="0" distB="0" distL="114300" distR="114300" simplePos="0" relativeHeight="251747328" behindDoc="0" locked="0" layoutInCell="1" allowOverlap="1" wp14:anchorId="318D22E9" wp14:editId="117BA1A6">
             <wp:simplePos x="0" y="0"/>
             <wp:positionH relativeFrom="margin">
               <wp:align>center</wp:align>
             </wp:positionH>
             <wp:positionV relativeFrom="paragraph">
-              <wp:posOffset>6119</wp:posOffset>
+              <wp:posOffset>139065</wp:posOffset>
             </wp:positionV>
-            <wp:extent cx="3147060" cy="2795905"/>
-            <wp:effectExtent l="0" t="0" r="0" b="4445"/>
+            <wp:extent cx="2423160" cy="2673985"/>
+            <wp:effectExtent l="0" t="0" r="0" b="0"/>
+            <wp:wrapSquare wrapText="bothSides"/>
+            <wp:docPr id="2084403579" name="Imagen 1"/>
+            <wp:cNvGraphicFramePr>
+              <a:graphicFrameLocks xmlns:a="http://schemas.openxmlformats.org/drawingml/2006/main" noChangeAspect="1"/>
+            </wp:cNvGraphicFramePr>
+            <a:graphic xmlns:a="http://schemas.openxmlformats.org/drawingml/2006/main">
+              <a:graphicData uri="http://schemas.openxmlformats.org/drawingml/2006/picture">
+                <pic:pic xmlns:pic="http://schemas.openxmlformats.org/drawingml/2006/picture">
+                  <pic:nvPicPr>
+                    <pic:cNvPr id="2084403579" name=""/>
+                    <pic:cNvPicPr/>
+                  </pic:nvPicPr>
+                  <pic:blipFill>
+                    <a:blip r:embed="rId9"/>
+                    <a:stretch>
+                      <a:fillRect/>
+                    </a:stretch>
+                  </pic:blipFill>
+                  <pic:spPr>
+                    <a:xfrm>
+                      <a:off x="0" y="0"/>
+                      <a:ext cx="2423160" cy="2673985"/>
+                    </a:xfrm>
+                    <a:prstGeom prst="rect">
+                      <a:avLst/>
+                    </a:prstGeom>
+                  </pic:spPr>
+                </pic:pic>
+              </a:graphicData>
+            </a:graphic>
+            <wp14:sizeRelH relativeFrom="margin">
+              <wp14:pctWidth>0</wp14:pctWidth>
+            </wp14:sizeRelH>
+            <wp14:sizeRelV relativeFrom="margin">
+              <wp14:pctHeight>0</wp14:pctHeight>
+            </wp14:sizeRelV>
+          </wp:anchor>
+        </w:drawing>
+      </w:r>
+    </w:p>
+    <w:p>
+      <w:pPr>
+        <w:jc w:val="both"/>
+        <w:rPr>
+          <w:rFonts w:ascii="Times New Roman" w:hAnsi="Times New Roman" w:cs="Times New Roman"/>
+        </w:rPr>
+      </w:pPr>
+      <w:r>
+        <w:rPr>
+          <w:rFonts w:ascii="Times New Roman" w:hAnsi="Times New Roman" w:cs="Times New Roman"/>
+        </w:rPr>
+        <w:t xml:space="preserve">  </w:t>
+      </w:r>
+      <w:r>
+        <w:rPr>
+          <w:rFonts w:ascii="Times New Roman" w:hAnsi="Times New Roman" w:cs="Times New Roman"/>
+        </w:rPr>
+        <w:t xml:space="preserve"> </w:t>
+      </w:r>
+    </w:p>
+    <w:p>
+      <w:pPr>
+        <w:jc w:val="both"/>
+        <w:rPr>
+          <w:rFonts w:ascii="Times New Roman" w:hAnsi="Times New Roman" w:cs="Times New Roman"/>
+        </w:rPr>
+      </w:pPr>
+    </w:p>
+    <w:p>
+      <w:pPr>
+        <w:jc w:val="both"/>
+        <w:rPr>
+          <w:rFonts w:ascii="Times New Roman" w:hAnsi="Times New Roman" w:cs="Times New Roman"/>
+        </w:rPr>
+      </w:pPr>
+    </w:p>
+    <w:p>
+      <w:pPr>
+        <w:jc w:val="both"/>
+        <w:rPr>
+          <w:rFonts w:ascii="Times New Roman" w:hAnsi="Times New Roman" w:cs="Times New Roman"/>
+        </w:rPr>
+      </w:pPr>
+    </w:p>
+    <w:p>
+      <w:pPr>
+        <w:jc w:val="both"/>
+        <w:rPr>
+          <w:rFonts w:ascii="Times New Roman" w:hAnsi="Times New Roman" w:cs="Times New Roman"/>
+        </w:rPr>
+      </w:pPr>
+    </w:p>
+    <w:p>
+      <w:pPr>
+        <w:jc w:val="both"/>
+        <w:rPr>
+          <w:rFonts w:ascii="Times New Roman" w:hAnsi="Times New Roman" w:cs="Times New Roman"/>
+        </w:rPr>
+      </w:pPr>
+    </w:p>
+    <w:p>
+      <w:pPr>
+        <w:jc w:val="both"/>
+        <w:rPr>
+          <w:rFonts w:ascii="Times New Roman" w:hAnsi="Times New Roman" w:cs="Times New Roman"/>
+        </w:rPr>
+      </w:pPr>
+    </w:p>
+    <w:p>
+      <w:pPr>
+        <w:jc w:val="both"/>
+        <w:rPr>
+          <w:rFonts w:ascii="Times New Roman" w:hAnsi="Times New Roman" w:cs="Times New Roman"/>
+        </w:rPr>
+      </w:pPr>
+    </w:p>
+    <w:p>
+      <w:pPr>
+        <w:jc w:val="both"/>
+        <w:rPr>
+          <w:rFonts w:ascii="Times New Roman" w:hAnsi="Times New Roman" w:cs="Times New Roman"/>
+        </w:rPr>
+      </w:pPr>
+    </w:p>
+    <w:p>
+      <w:pPr>
+        <w:jc w:val="both"/>
+        <w:rPr>
+          <w:rFonts w:ascii="Times New Roman" w:hAnsi="Times New Roman" w:cs="Times New Roman"/>
+        </w:rPr>
+      </w:pPr>
+    </w:p>
+    <w:p>
+      <w:pPr>
+        <w:jc w:val="both"/>
+        <w:rPr>
+          <w:rFonts w:ascii="Times New Roman" w:hAnsi="Times New Roman" w:cs="Times New Roman"/>
+        </w:rPr>
+      </w:pPr>
+      <w:r>
+        <w:rPr>
+          <w:rFonts w:ascii="Times New Roman" w:hAnsi="Times New Roman" w:cs="Times New Roman"/>
+        </w:rPr>
+        <w:lastRenderedPageBreak/>
+        <w:t>El siguiente diagrama visual explica el funcionamiento normal del cifrado Vigen</w:t>
+      </w:r>
+      <w:r>
+        <w:rPr>
+          <w:rFonts w:ascii="Times New Roman" w:hAnsi="Times New Roman" w:cs="Times New Roman"/>
+        </w:rPr>
+        <w:t>ère</w:t>
+      </w:r>
+      <w:r>
+        <w:rPr>
+          <w:rFonts w:ascii="Times New Roman" w:hAnsi="Times New Roman" w:cs="Times New Roman"/>
+        </w:rPr>
+        <w:t xml:space="preserve"> con textos planos. La palabra al ser más larga que la contraseña, vuelve a repetirse hasta llenarla.  </w:t>
+      </w:r>
+    </w:p>
+    <w:p>
+      <w:pPr>
+        <w:jc w:val="both"/>
+        <w:rPr>
+          <w:rFonts w:ascii="Times New Roman" w:hAnsi="Times New Roman" w:cs="Times New Roman"/>
+        </w:rPr>
+      </w:pPr>
+      <w:r>
+        <w:rPr>
+          <w:noProof/>
+          <w14:ligatures w14:val="standardContextual"/>
+        </w:rPr>
+        <w:drawing>
+          <wp:anchor distT="0" distB="0" distL="114300" distR="114300" simplePos="0" relativeHeight="251749376" behindDoc="0" locked="0" layoutInCell="1" allowOverlap="1" wp14:anchorId="5E8CFEC3" wp14:editId="372FED90">
+            <wp:simplePos x="0" y="0"/>
+            <wp:positionH relativeFrom="margin">
+              <wp:posOffset>1042670</wp:posOffset>
+            </wp:positionH>
+            <wp:positionV relativeFrom="paragraph">
+              <wp:posOffset>23495</wp:posOffset>
+            </wp:positionV>
+            <wp:extent cx="2557780" cy="2918460"/>
+            <wp:effectExtent l="0" t="0" r="0" b="0"/>
+            <wp:wrapSquare wrapText="bothSides"/>
+            <wp:docPr id="1577335768" name="Imagen 1"/>
+            <wp:cNvGraphicFramePr>
+              <a:graphicFrameLocks xmlns:a="http://schemas.openxmlformats.org/drawingml/2006/main" noChangeAspect="1"/>
+            </wp:cNvGraphicFramePr>
+            <a:graphic xmlns:a="http://schemas.openxmlformats.org/drawingml/2006/main">
+              <a:graphicData uri="http://schemas.openxmlformats.org/drawingml/2006/picture">
+                <pic:pic xmlns:pic="http://schemas.openxmlformats.org/drawingml/2006/picture">
+                  <pic:nvPicPr>
+                    <pic:cNvPr id="1577335768" name=""/>
+                    <pic:cNvPicPr/>
+                  </pic:nvPicPr>
+                  <pic:blipFill>
+                    <a:blip r:embed="rId10"/>
+                    <a:stretch>
+                      <a:fillRect/>
+                    </a:stretch>
+                  </pic:blipFill>
+                  <pic:spPr>
+                    <a:xfrm>
+                      <a:off x="0" y="0"/>
+                      <a:ext cx="2557780" cy="2918460"/>
+                    </a:xfrm>
+                    <a:prstGeom prst="rect">
+                      <a:avLst/>
+                    </a:prstGeom>
+                  </pic:spPr>
+                </pic:pic>
+              </a:graphicData>
+            </a:graphic>
+            <wp14:sizeRelH relativeFrom="margin">
+              <wp14:pctWidth>0</wp14:pctWidth>
+            </wp14:sizeRelH>
+            <wp14:sizeRelV relativeFrom="margin">
+              <wp14:pctHeight>0</wp14:pctHeight>
+            </wp14:sizeRelV>
+          </wp:anchor>
+        </w:drawing>
+      </w:r>
+    </w:p>
+    <w:p>
+      <w:pPr>
+        <w:tabs>
+          <w:tab w:val="left" w:pos="1524"/>
+        </w:tabs>
+        <w:jc w:val="both"/>
+        <w:rPr>
+          <w:rFonts w:ascii="Times New Roman" w:hAnsi="Times New Roman" w:cs="Times New Roman"/>
+        </w:rPr>
+      </w:pPr>
+      <w:r>
+        <w:rPr>
+          <w:rFonts w:ascii="Times New Roman" w:hAnsi="Times New Roman" w:cs="Times New Roman"/>
+        </w:rPr>
+        <w:tab/>
+      </w:r>
+    </w:p>
+    <w:p>
+      <w:pPr>
+        <w:tabs>
+          <w:tab w:val="left" w:pos="1524"/>
+        </w:tabs>
+        <w:jc w:val="both"/>
+        <w:rPr>
+          <w:rFonts w:ascii="Times New Roman" w:hAnsi="Times New Roman" w:cs="Times New Roman"/>
+        </w:rPr>
+      </w:pPr>
+    </w:p>
+    <w:p>
+      <w:pPr>
+        <w:tabs>
+          <w:tab w:val="left" w:pos="1524"/>
+        </w:tabs>
+        <w:jc w:val="both"/>
+        <w:rPr>
+          <w:rFonts w:ascii="Times New Roman" w:hAnsi="Times New Roman" w:cs="Times New Roman"/>
+        </w:rPr>
+      </w:pPr>
+    </w:p>
+    <w:p>
+      <w:pPr>
+        <w:tabs>
+          <w:tab w:val="left" w:pos="1524"/>
+        </w:tabs>
+        <w:jc w:val="both"/>
+        <w:rPr>
+          <w:rFonts w:ascii="Times New Roman" w:hAnsi="Times New Roman" w:cs="Times New Roman"/>
+        </w:rPr>
+      </w:pPr>
+    </w:p>
+    <w:p>
+      <w:pPr>
+        <w:tabs>
+          <w:tab w:val="left" w:pos="1524"/>
+        </w:tabs>
+        <w:jc w:val="both"/>
+        <w:rPr>
+          <w:rFonts w:ascii="Times New Roman" w:hAnsi="Times New Roman" w:cs="Times New Roman"/>
+        </w:rPr>
+      </w:pPr>
+    </w:p>
+    <w:p>
+      <w:pPr>
+        <w:tabs>
+          <w:tab w:val="left" w:pos="1524"/>
+        </w:tabs>
+        <w:jc w:val="both"/>
+        <w:rPr>
+          <w:rFonts w:ascii="Times New Roman" w:hAnsi="Times New Roman" w:cs="Times New Roman"/>
+        </w:rPr>
+      </w:pPr>
+    </w:p>
+    <w:p>
+      <w:pPr>
+        <w:tabs>
+          <w:tab w:val="left" w:pos="1524"/>
+        </w:tabs>
+        <w:jc w:val="both"/>
+        <w:rPr>
+          <w:rFonts w:ascii="Times New Roman" w:hAnsi="Times New Roman" w:cs="Times New Roman"/>
+        </w:rPr>
+      </w:pPr>
+    </w:p>
+    <w:p>
+      <w:pPr>
+        <w:tabs>
+          <w:tab w:val="left" w:pos="1524"/>
+        </w:tabs>
+        <w:jc w:val="both"/>
+        <w:rPr>
+          <w:rFonts w:ascii="Times New Roman" w:hAnsi="Times New Roman" w:cs="Times New Roman"/>
+        </w:rPr>
+      </w:pPr>
+    </w:p>
+    <w:p>
+      <w:pPr>
+        <w:tabs>
+          <w:tab w:val="left" w:pos="1524"/>
+        </w:tabs>
+        <w:jc w:val="both"/>
+        <w:rPr>
+          <w:rFonts w:ascii="Times New Roman" w:hAnsi="Times New Roman" w:cs="Times New Roman"/>
+        </w:rPr>
+      </w:pPr>
+    </w:p>
+    <w:p>
+      <w:pPr>
+        <w:tabs>
+          <w:tab w:val="left" w:pos="1524"/>
+        </w:tabs>
+        <w:jc w:val="both"/>
+        <w:rPr>
+          <w:rFonts w:ascii="Times New Roman" w:hAnsi="Times New Roman" w:cs="Times New Roman"/>
+        </w:rPr>
+      </w:pPr>
+    </w:p>
+    <w:p>
+      <w:pPr>
+        <w:pStyle w:val="Ttulo1"/>
+        <w:jc w:val="both"/>
+        <w:rPr>
+          <w:rFonts w:ascii="Times New Roman" w:hAnsi="Times New Roman" w:cs="Times New Roman"/>
+        </w:rPr>
+      </w:pPr>
+      <w:bookmarkStart w:id="13" w:name="_Toc240650650"/>
+      <w:r>
+        <w:rPr>
+          <w:rFonts w:ascii="Times New Roman" w:hAnsi="Times New Roman" w:cs="Times New Roman"/>
+        </w:rPr>
+        <w:t>Investigación realizada</w:t>
+      </w:r>
+      <w:bookmarkEnd w:id="13"/>
+    </w:p>
+    <w:p>
+      <w:pPr>
+        <w:jc w:val="both"/>
+        <w:rPr>
+          <w:rFonts w:ascii="Times New Roman" w:hAnsi="Times New Roman" w:cs="Times New Roman"/>
+        </w:rPr>
+      </w:pPr>
+      <w:r>
+        <w:rPr>
+          <w:rFonts w:ascii="Times New Roman" w:hAnsi="Times New Roman" w:cs="Times New Roman"/>
+        </w:rPr>
+        <w:t>A continuación, se documentan los algoritmos investigados para el correcto funcionamiento del sistema, así como los elementos investigados por cuenta propia que no fueron desarrollados en su totalidad dentro del marco teórico de la clase.</w:t>
+      </w:r>
+    </w:p>
+    <w:p>
+      <w:pPr>
+        <w:pStyle w:val="Ttulo2"/>
+        <w:jc w:val="both"/>
+        <w:rPr>
+          <w:rFonts w:ascii="Times New Roman" w:hAnsi="Times New Roman" w:cs="Times New Roman"/>
+        </w:rPr>
+      </w:pPr>
+      <w:bookmarkStart w:id="14" w:name="_Toc240650651"/>
+      <w:r>
+        <w:rPr>
+          <w:rFonts w:ascii="Times New Roman" w:hAnsi="Times New Roman" w:cs="Times New Roman"/>
+        </w:rPr>
+        <w:t>Cifrado y descifrado César</w:t>
+      </w:r>
+      <w:bookmarkEnd w:id="14"/>
+    </w:p>
+    <w:p>
+      <w:pPr>
+        <w:jc w:val="both"/>
+        <w:rPr>
+          <w:rFonts w:ascii="Times New Roman" w:hAnsi="Times New Roman" w:cs="Times New Roman"/>
+        </w:rPr>
+      </w:pPr>
+      <w:r>
+        <w:rPr>
+          <w:rFonts w:ascii="Times New Roman" w:hAnsi="Times New Roman" w:cs="Times New Roman"/>
+          <w:noProof/>
+        </w:rPr>
+        <w:drawing>
+          <wp:anchor distT="0" distB="0" distL="114300" distR="114300" simplePos="0" relativeHeight="251667456" behindDoc="0" locked="0" layoutInCell="1" allowOverlap="1" wp14:anchorId="19BB2F59" wp14:editId="2666FB74">
+            <wp:simplePos x="0" y="0"/>
+            <wp:positionH relativeFrom="margin">
+              <wp:posOffset>1639570</wp:posOffset>
+            </wp:positionH>
+            <wp:positionV relativeFrom="paragraph">
+              <wp:posOffset>1600835</wp:posOffset>
+            </wp:positionV>
+            <wp:extent cx="1964055" cy="1744980"/>
+            <wp:effectExtent l="0" t="0" r="0" b="7620"/>
             <wp:wrapSquare wrapText="bothSides"/>
             <wp:docPr id="882652944" name="Imagen 1"/>
             <wp:cNvGraphicFramePr>
@@ -6466,7 +7290,7 @@
                   <pic:spPr>
                     <a:xfrm>
                       <a:off x="0" y="0"/>
-                      <a:ext cx="3147060" cy="2795905"/>
+                      <a:ext cx="1964055" cy="1744980"/>
                     </a:xfrm>
                     <a:prstGeom prst="rect">
                       <a:avLst/>
@@ -6488,6 +7312,32 @@
         <w:rPr>
           <w:rFonts w:ascii="Times New Roman" w:hAnsi="Times New Roman" w:cs="Times New Roman"/>
         </w:rPr>
+        <w:t xml:space="preserve">El cifrado César consta de una clave (entre 1 – 26 para el alfabeto inglés y del 1 – 27 para el alfabeto español) para desplazar el abecedario esa cantidad de posiciones. Podemos tener una clave 3 (espacios) y nuestro abecedario se desplaza esa cantidad a la derecha para obtener una letra ya cifrada. Un ejemplo, siempre con clave 3, la letra A pasa a ser la letra D, la B pasa a la letra E, la C para a la letra F y así sucesivamente con el resto del alfabeto. Si el número de desplazamiento llega al final del abecedario y ya no hay más letras, las letras que sobran siguen avanzando las posiciones que deben, pero el inicio del abecedario. Ejemplo: la letra Z (clave 3) pasaría a ser C. La imagen de abajo es un sistema visual de </w:t>
+      </w:r>
+      <w:r>
+        <w:rPr>
+          <w:rFonts w:ascii="Times New Roman" w:hAnsi="Times New Roman" w:cs="Times New Roman"/>
+        </w:rPr>
+        <w:t>cómo</w:t>
+      </w:r>
+      <w:r>
+        <w:rPr>
+          <w:rFonts w:ascii="Times New Roman" w:hAnsi="Times New Roman" w:cs="Times New Roman"/>
+        </w:rPr>
+        <w:t xml:space="preserve"> hacer el cifrado/descifrado César (moviendo el circulo interior las posiciones deseadas).</w:t>
+      </w:r>
+    </w:p>
+    <w:p>
+      <w:pPr>
+        <w:jc w:val="both"/>
+        <w:rPr>
+          <w:rFonts w:ascii="Times New Roman" w:hAnsi="Times New Roman" w:cs="Times New Roman"/>
+        </w:rPr>
+      </w:pPr>
+      <w:r>
+        <w:rPr>
+          <w:rFonts w:ascii="Times New Roman" w:hAnsi="Times New Roman" w:cs="Times New Roman"/>
+        </w:rPr>
         <w:t xml:space="preserve"> </w:t>
       </w:r>
     </w:p>
@@ -6538,42 +7388,11 @@
           <w:rFonts w:ascii="Times New Roman" w:hAnsi="Times New Roman" w:cs="Times New Roman"/>
         </w:rPr>
       </w:pPr>
-    </w:p>
-    <w:p>
-      <w:pPr>
-        <w:jc w:val="both"/>
-        <w:rPr>
-          <w:rFonts w:ascii="Times New Roman" w:hAnsi="Times New Roman" w:cs="Times New Roman"/>
-        </w:rPr>
-      </w:pPr>
-    </w:p>
-    <w:p>
-      <w:pPr>
-        <w:jc w:val="both"/>
-        <w:rPr>
-          <w:rFonts w:ascii="Times New Roman" w:hAnsi="Times New Roman" w:cs="Times New Roman"/>
-        </w:rPr>
-      </w:pPr>
-    </w:p>
-    <w:p>
-      <w:pPr>
-        <w:jc w:val="both"/>
-        <w:rPr>
-          <w:rFonts w:ascii="Times New Roman" w:hAnsi="Times New Roman" w:cs="Times New Roman"/>
-        </w:rPr>
-      </w:pPr>
-    </w:p>
-    <w:p>
-      <w:pPr>
-        <w:jc w:val="both"/>
-        <w:rPr>
-          <w:rFonts w:ascii="Times New Roman" w:hAnsi="Times New Roman" w:cs="Times New Roman"/>
-        </w:rPr>
-      </w:pPr>
-      <w:r>
-        <w:rPr>
-          <w:rFonts w:ascii="Times New Roman" w:hAnsi="Times New Roman" w:cs="Times New Roman"/>
-        </w:rPr>
+      <w:r>
+        <w:rPr>
+          <w:rFonts w:ascii="Times New Roman" w:hAnsi="Times New Roman" w:cs="Times New Roman"/>
+        </w:rPr>
+        <w:lastRenderedPageBreak/>
         <w:t>Este tipo de cifrado debe de tener una clave previamente acordada por ambas partes, emisor y receptor. En el caso del programa el usuario ingresa la clave.</w:t>
       </w:r>
     </w:p>
@@ -6689,14 +7508,12 @@
         </w:rPr>
         <w:t xml:space="preserve">Para lograr cifrar y descifrar los mensajes existe dos </w:t>
       </w:r>
-      <w:proofErr w:type="spellStart"/>
-      <w:r>
-        <w:rPr>
-          <w:rFonts w:ascii="Times New Roman" w:hAnsi="Times New Roman" w:cs="Times New Roman"/>
-        </w:rPr>
-        <w:t>formulas</w:t>
-      </w:r>
-      <w:proofErr w:type="spellEnd"/>
+      <w:r>
+        <w:rPr>
+          <w:rFonts w:ascii="Times New Roman" w:hAnsi="Times New Roman" w:cs="Times New Roman"/>
+        </w:rPr>
+        <w:t>fórmulas</w:t>
+      </w:r>
       <w:r>
         <w:rPr>
           <w:rFonts w:ascii="Times New Roman" w:hAnsi="Times New Roman" w:cs="Times New Roman"/>
@@ -6829,8 +7646,6 @@
       <w:r>
         <w:rPr>
           <w:rFonts w:ascii="Times New Roman" w:hAnsi="Times New Roman" w:cs="Times New Roman"/>
-          <w:b/>
-          <w:bCs/>
         </w:rPr>
         <w:t>0 a 25</w:t>
       </w:r>
@@ -6899,12 +7714,11 @@
           <w:rFonts w:ascii="Times New Roman" w:hAnsi="Times New Roman" w:cs="Times New Roman"/>
         </w:rPr>
       </w:pPr>
-      <w:bookmarkStart w:id="15" w:name="_Toc240640916"/>
-      <w:r>
-        <w:rPr>
-          <w:rFonts w:ascii="Times New Roman" w:hAnsi="Times New Roman" w:cs="Times New Roman"/>
-        </w:rPr>
-        <w:lastRenderedPageBreak/>
+      <w:bookmarkStart w:id="15" w:name="_Toc240650652"/>
+      <w:r>
+        <w:rPr>
+          <w:rFonts w:ascii="Times New Roman" w:hAnsi="Times New Roman" w:cs="Times New Roman"/>
+        </w:rPr>
         <w:t>Cifrado y descifrado XOR</w:t>
       </w:r>
       <w:bookmarkEnd w:id="15"/>
@@ -7083,6 +7897,7 @@
           <w:rFonts w:ascii="Times New Roman" w:hAnsi="Times New Roman" w:cs="Times New Roman"/>
           <w:noProof/>
         </w:rPr>
+        <w:lastRenderedPageBreak/>
         <w:drawing>
           <wp:anchor distT="0" distB="0" distL="114300" distR="114300" simplePos="0" relativeHeight="251669504" behindDoc="0" locked="0" layoutInCell="1" allowOverlap="1" wp14:anchorId="2C181128" wp14:editId="3256F244">
             <wp:simplePos x="0" y="0"/>
@@ -7107,7 +7922,7 @@
                     <pic:cNvPicPr/>
                   </pic:nvPicPr>
                   <pic:blipFill>
-                    <a:blip r:embed="rId9"/>
+                    <a:blip r:embed="rId11"/>
                     <a:stretch>
                       <a:fillRect/>
                     </a:stretch>
@@ -7228,24 +8043,24 @@
           <w:rFonts w:ascii="Times New Roman" w:hAnsi="Times New Roman" w:cs="Times New Roman"/>
         </w:rPr>
       </w:pPr>
-      <w:bookmarkStart w:id="16" w:name="_Toc240640917"/>
-      <w:r>
-        <w:rPr>
-          <w:rFonts w:ascii="Times New Roman" w:hAnsi="Times New Roman" w:cs="Times New Roman"/>
-        </w:rPr>
-        <w:t>Cifrado Vigen</w:t>
-      </w:r>
-      <w:r>
-        <w:rPr>
-          <w:rFonts w:ascii="Times New Roman" w:hAnsi="Times New Roman" w:cs="Times New Roman"/>
-        </w:rPr>
-        <w:t>è</w:t>
-      </w:r>
-      <w:r>
-        <w:rPr>
-          <w:rFonts w:ascii="Times New Roman" w:hAnsi="Times New Roman" w:cs="Times New Roman"/>
-        </w:rPr>
-        <w:t>re</w:t>
+      <w:bookmarkStart w:id="16" w:name="_Toc240650653"/>
+      <w:r>
+        <w:rPr>
+          <w:rFonts w:ascii="Times New Roman" w:hAnsi="Times New Roman" w:cs="Times New Roman"/>
+        </w:rPr>
+        <w:t xml:space="preserve">Cifrado </w:t>
+      </w:r>
+      <w:r>
+        <w:rPr>
+          <w:rFonts w:ascii="Times New Roman" w:hAnsi="Times New Roman" w:cs="Times New Roman"/>
+        </w:rPr>
+        <w:t xml:space="preserve">y descifrado </w:t>
+      </w:r>
+      <w:r>
+        <w:rPr>
+          <w:rFonts w:ascii="Times New Roman" w:hAnsi="Times New Roman" w:cs="Times New Roman"/>
+        </w:rPr>
+        <w:t>Vigenère</w:t>
       </w:r>
       <w:bookmarkEnd w:id="16"/>
     </w:p>
@@ -7412,7 +8227,7 @@
                     <pic:cNvPicPr/>
                   </pic:nvPicPr>
                   <pic:blipFill>
-                    <a:blip r:embed="rId10"/>
+                    <a:blip r:embed="rId12"/>
                     <a:stretch>
                       <a:fillRect/>
                     </a:stretch>
@@ -7571,7 +8386,7 @@
           <w:rFonts w:ascii="Times New Roman" w:hAnsi="Times New Roman" w:cs="Times New Roman"/>
         </w:rPr>
       </w:pPr>
-      <w:bookmarkStart w:id="17" w:name="_Toc240640918"/>
+      <w:bookmarkStart w:id="17" w:name="_Toc240650654"/>
       <w:r>
         <w:rPr>
           <w:rFonts w:ascii="Times New Roman" w:hAnsi="Times New Roman" w:cs="Times New Roman"/>
@@ -7659,7 +8474,7 @@
                     <pic:cNvPicPr/>
                   </pic:nvPicPr>
                   <pic:blipFill>
-                    <a:blip r:embed="rId11"/>
+                    <a:blip r:embed="rId13"/>
                     <a:stretch>
                       <a:fillRect/>
                     </a:stretch>
@@ -7830,7 +8645,7 @@
                     <pic:cNvPicPr/>
                   </pic:nvPicPr>
                   <pic:blipFill>
-                    <a:blip r:embed="rId12"/>
+                    <a:blip r:embed="rId14"/>
                     <a:stretch>
                       <a:fillRect/>
                     </a:stretch>
@@ -7951,17 +8766,26 @@
     </w:p>
     <w:p>
       <w:pPr>
+        <w:jc w:val="both"/>
+        <w:rPr>
+          <w:rFonts w:ascii="Times New Roman" w:hAnsi="Times New Roman" w:cs="Times New Roman"/>
+        </w:rPr>
+      </w:pPr>
+    </w:p>
+    <w:p>
+      <w:pPr>
         <w:pStyle w:val="Ttulo2"/>
         <w:jc w:val="both"/>
         <w:rPr>
           <w:rFonts w:ascii="Times New Roman" w:hAnsi="Times New Roman" w:cs="Times New Roman"/>
         </w:rPr>
       </w:pPr>
-      <w:bookmarkStart w:id="18" w:name="_Toc240640919"/>
-      <w:r>
-        <w:rPr>
-          <w:rFonts w:ascii="Times New Roman" w:hAnsi="Times New Roman" w:cs="Times New Roman"/>
-        </w:rPr>
+      <w:bookmarkStart w:id="18" w:name="_Toc240650655"/>
+      <w:r>
+        <w:rPr>
+          <w:rFonts w:ascii="Times New Roman" w:hAnsi="Times New Roman" w:cs="Times New Roman"/>
+        </w:rPr>
+        <w:lastRenderedPageBreak/>
         <w:t>Elementos de investigación propia</w:t>
       </w:r>
       <w:bookmarkEnd w:id="18"/>
@@ -7986,12 +8810,11 @@
           <w:rFonts w:ascii="Times New Roman" w:hAnsi="Times New Roman" w:cs="Times New Roman"/>
         </w:rPr>
       </w:pPr>
-      <w:bookmarkStart w:id="19" w:name="_Toc240640920"/>
-      <w:r>
-        <w:rPr>
-          <w:rFonts w:ascii="Times New Roman" w:hAnsi="Times New Roman" w:cs="Times New Roman"/>
-        </w:rPr>
-        <w:lastRenderedPageBreak/>
+      <w:bookmarkStart w:id="19" w:name="_Toc240650656"/>
+      <w:r>
+        <w:rPr>
+          <w:rFonts w:ascii="Times New Roman" w:hAnsi="Times New Roman" w:cs="Times New Roman"/>
+        </w:rPr>
         <w:t>Librería &lt;</w:t>
       </w:r>
       <w:proofErr w:type="spellStart"/>
@@ -8022,23 +8845,9 @@
         <w:rPr>
           <w:rFonts w:ascii="Times New Roman" w:hAnsi="Times New Roman" w:cs="Times New Roman"/>
         </w:rPr>
-        <w:t>E</w:t>
-      </w:r>
-      <w:r>
-        <w:rPr>
-          <w:rFonts w:ascii="Times New Roman" w:hAnsi="Times New Roman" w:cs="Times New Roman"/>
-        </w:rPr>
-        <w:t xml:space="preserve">sta librería es utilizada dentro de </w:t>
-      </w:r>
-      <w:proofErr w:type="gramStart"/>
-      <w:r>
-        <w:rPr>
-          <w:rFonts w:ascii="Times New Roman" w:hAnsi="Times New Roman" w:cs="Times New Roman"/>
-        </w:rPr>
-        <w:t>Utilidades::</w:t>
+        <w:t>Esta librería es utilizada dentro de Utilidades::</w:t>
       </w:r>
       <w:proofErr w:type="spellStart"/>
-      <w:proofErr w:type="gramEnd"/>
       <w:r>
         <w:rPr>
           <w:rFonts w:ascii="Times New Roman" w:hAnsi="Times New Roman" w:cs="Times New Roman"/>
@@ -8050,19 +8859,7 @@
         <w:rPr>
           <w:rFonts w:ascii="Times New Roman" w:hAnsi="Times New Roman" w:cs="Times New Roman"/>
         </w:rPr>
-        <w:t xml:space="preserve">() con el fin de poder registrar la fecha y hora exacta en la </w:t>
-      </w:r>
-      <w:r>
-        <w:rPr>
-          <w:rFonts w:ascii="Times New Roman" w:hAnsi="Times New Roman" w:cs="Times New Roman"/>
-        </w:rPr>
-        <w:t>cual</w:t>
-      </w:r>
-      <w:r>
-        <w:rPr>
-          <w:rFonts w:ascii="Times New Roman" w:hAnsi="Times New Roman" w:cs="Times New Roman"/>
-        </w:rPr>
-        <w:t xml:space="preserve"> se realizó cada operación. </w:t>
+        <w:t xml:space="preserve">() con el fin de poder registrar la fecha y hora exacta en la cual se realizó cada operación. </w:t>
       </w:r>
     </w:p>
     <w:p>
@@ -8102,7 +8899,7 @@
                     <pic:cNvPicPr/>
                   </pic:nvPicPr>
                   <pic:blipFill>
-                    <a:blip r:embed="rId13"/>
+                    <a:blip r:embed="rId15"/>
                     <a:stretch>
                       <a:fillRect/>
                     </a:stretch>
@@ -8169,7 +8966,7 @@
           <w:rFonts w:ascii="Times New Roman" w:hAnsi="Times New Roman" w:cs="Times New Roman"/>
         </w:rPr>
       </w:pPr>
-      <w:bookmarkStart w:id="20" w:name="_Toc240640921"/>
+      <w:bookmarkStart w:id="20" w:name="_Toc240650657"/>
       <w:r>
         <w:rPr>
           <w:rFonts w:ascii="Times New Roman" w:hAnsi="Times New Roman" w:cs="Times New Roman"/>
@@ -8271,7 +9068,7 @@
                     <pic:cNvPicPr/>
                   </pic:nvPicPr>
                   <pic:blipFill>
-                    <a:blip r:embed="rId14"/>
+                    <a:blip r:embed="rId16"/>
                     <a:stretch>
                       <a:fillRect/>
                     </a:stretch>
@@ -8326,7 +9123,7 @@
                     <pic:cNvPicPr/>
                   </pic:nvPicPr>
                   <pic:blipFill>
-                    <a:blip r:embed="rId15"/>
+                    <a:blip r:embed="rId17"/>
                     <a:stretch>
                       <a:fillRect/>
                     </a:stretch>
@@ -8401,7 +9198,7 @@
           <w:rFonts w:ascii="Times New Roman" w:hAnsi="Times New Roman" w:cs="Times New Roman"/>
         </w:rPr>
       </w:pPr>
-      <w:bookmarkStart w:id="21" w:name="_Toc240640922"/>
+      <w:bookmarkStart w:id="21" w:name="_Toc240650658"/>
       <w:r>
         <w:rPr>
           <w:rFonts w:ascii="Times New Roman" w:hAnsi="Times New Roman" w:cs="Times New Roman"/>
@@ -8504,7 +9301,7 @@
                     <pic:cNvPicPr/>
                   </pic:nvPicPr>
                   <pic:blipFill>
-                    <a:blip r:embed="rId16"/>
+                    <a:blip r:embed="rId18"/>
                     <a:stretch>
                       <a:fillRect/>
                     </a:stretch>
@@ -8554,7 +9351,7 @@
           <w:rFonts w:ascii="Times New Roman" w:hAnsi="Times New Roman" w:cs="Times New Roman"/>
         </w:rPr>
       </w:pPr>
-      <w:bookmarkStart w:id="22" w:name="_Toc240640923"/>
+      <w:bookmarkStart w:id="22" w:name="_Toc240650659"/>
       <w:r>
         <w:rPr>
           <w:rFonts w:ascii="Times New Roman" w:hAnsi="Times New Roman" w:cs="Times New Roman"/>
@@ -8575,16 +9372,9 @@
         <w:rPr>
           <w:rFonts w:ascii="Times New Roman" w:hAnsi="Times New Roman" w:cs="Times New Roman"/>
         </w:rPr>
-        <w:t>F</w:t>
-      </w:r>
-      <w:r>
-        <w:rPr>
-          <w:rFonts w:ascii="Times New Roman" w:hAnsi="Times New Roman" w:cs="Times New Roman"/>
-        </w:rPr>
-        <w:t xml:space="preserve">orma correcta de usar </w:t>
+        <w:t xml:space="preserve">Forma correcta de usar </w:t>
       </w:r>
       <w:proofErr w:type="spellStart"/>
-      <w:proofErr w:type="gramStart"/>
       <w:r>
         <w:rPr>
           <w:rFonts w:ascii="Times New Roman" w:hAnsi="Times New Roman" w:cs="Times New Roman"/>
@@ -8599,7 +9389,6 @@
         <w:t>::</w:t>
       </w:r>
       <w:proofErr w:type="spellStart"/>
-      <w:proofErr w:type="gramEnd"/>
       <w:r>
         <w:rPr>
           <w:rFonts w:ascii="Times New Roman" w:hAnsi="Times New Roman" w:cs="Times New Roman"/>
@@ -8639,19 +9428,7 @@
         <w:rPr>
           <w:rFonts w:ascii="Times New Roman" w:hAnsi="Times New Roman" w:cs="Times New Roman"/>
         </w:rPr>
-        <w:t xml:space="preserve">() y </w:t>
-      </w:r>
-      <w:r>
-        <w:rPr>
-          <w:rFonts w:ascii="Times New Roman" w:hAnsi="Times New Roman" w:cs="Times New Roman"/>
-        </w:rPr>
-        <w:t>cómo</w:t>
-      </w:r>
-      <w:r>
-        <w:rPr>
-          <w:rFonts w:ascii="Times New Roman" w:hAnsi="Times New Roman" w:cs="Times New Roman"/>
-        </w:rPr>
-        <w:t xml:space="preserve"> manejar los punteros dentro de archivos para obtener su tamaño exacto.</w:t>
+        <w:t>() y cómo manejar los punteros dentro de archivos para obtener su tamaño exacto.</w:t>
       </w:r>
     </w:p>
     <w:p>
@@ -8692,7 +9469,7 @@
                     <pic:cNvPicPr/>
                   </pic:nvPicPr>
                   <pic:blipFill>
-                    <a:blip r:embed="rId17"/>
+                    <a:blip r:embed="rId19"/>
                     <a:stretch>
                       <a:fillRect/>
                     </a:stretch>
@@ -8792,7 +9569,7 @@
           <w:rFonts w:ascii="Times New Roman" w:hAnsi="Times New Roman" w:cs="Times New Roman"/>
         </w:rPr>
       </w:pPr>
-      <w:bookmarkStart w:id="23" w:name="_Toc240640924"/>
+      <w:bookmarkStart w:id="23" w:name="_Toc240650660"/>
       <w:r>
         <w:rPr>
           <w:rFonts w:ascii="Times New Roman" w:hAnsi="Times New Roman" w:cs="Times New Roman"/>
@@ -8827,13 +9604,7 @@
         <w:rPr>
           <w:rFonts w:ascii="Times New Roman" w:hAnsi="Times New Roman" w:cs="Times New Roman"/>
         </w:rPr>
-        <w:t>C</w:t>
-      </w:r>
-      <w:r>
-        <w:rPr>
-          <w:rFonts w:ascii="Times New Roman" w:hAnsi="Times New Roman" w:cs="Times New Roman"/>
-        </w:rPr>
-        <w:t xml:space="preserve">onfiguración de </w:t>
+        <w:t xml:space="preserve">Configuración de </w:t>
       </w:r>
       <w:proofErr w:type="spellStart"/>
       <w:r>
@@ -8901,7 +9672,7 @@
                     <pic:cNvPicPr/>
                   </pic:nvPicPr>
                   <pic:blipFill>
-                    <a:blip r:embed="rId18"/>
+                    <a:blip r:embed="rId20"/>
                     <a:stretch>
                       <a:fillRect/>
                     </a:stretch>
@@ -8949,7 +9720,7 @@
           <w:rFonts w:ascii="Times New Roman" w:hAnsi="Times New Roman" w:cs="Times New Roman"/>
         </w:rPr>
       </w:pPr>
-      <w:bookmarkStart w:id="24" w:name="_Toc240640925"/>
+      <w:bookmarkStart w:id="24" w:name="_Toc240650661"/>
       <w:r>
         <w:rPr>
           <w:rFonts w:ascii="Times New Roman" w:hAnsi="Times New Roman" w:cs="Times New Roman"/>
@@ -8970,13 +9741,7 @@
         <w:rPr>
           <w:rFonts w:ascii="Times New Roman" w:hAnsi="Times New Roman" w:cs="Times New Roman"/>
         </w:rPr>
-        <w:t>A</w:t>
-      </w:r>
-      <w:r>
-        <w:rPr>
-          <w:rFonts w:ascii="Times New Roman" w:hAnsi="Times New Roman" w:cs="Times New Roman"/>
-        </w:rPr>
-        <w:t xml:space="preserve">parte de los conocimientos brindados en clase decidí investigar su funcionamiento y como aplicarlas al proyecto. Las funciones son virtuales ya que le permiten a la clase </w:t>
+        <w:t xml:space="preserve">Aparte de los conocimientos brindados en clase decidí investigar su funcionamiento y como aplicarlas al proyecto. Las funciones son virtuales ya que le permiten a la clase </w:t>
       </w:r>
       <w:proofErr w:type="spellStart"/>
       <w:r>
@@ -9003,6 +9768,7 @@
       <w:r>
         <w:rPr>
           <w:rFonts w:ascii="Times New Roman" w:hAnsi="Times New Roman" w:cs="Times New Roman"/>
+          <w:noProof/>
         </w:rPr>
         <w:drawing>
           <wp:anchor distT="0" distB="0" distL="114300" distR="114300" simplePos="0" relativeHeight="251687936" behindDoc="0" locked="0" layoutInCell="1" allowOverlap="1" wp14:anchorId="4C704564" wp14:editId="1966B238">
@@ -9028,7 +9794,7 @@
                     <pic:cNvPicPr/>
                   </pic:nvPicPr>
                   <pic:blipFill>
-                    <a:blip r:embed="rId19"/>
+                    <a:blip r:embed="rId21"/>
                     <a:stretch>
                       <a:fillRect/>
                     </a:stretch>
@@ -9130,17 +9896,26 @@
     </w:p>
     <w:p>
       <w:pPr>
+        <w:jc w:val="both"/>
+        <w:rPr>
+          <w:rFonts w:ascii="Times New Roman" w:hAnsi="Times New Roman" w:cs="Times New Roman"/>
+        </w:rPr>
+      </w:pPr>
+    </w:p>
+    <w:p>
+      <w:pPr>
         <w:pStyle w:val="Ttulo1"/>
         <w:jc w:val="both"/>
         <w:rPr>
           <w:rFonts w:ascii="Times New Roman" w:hAnsi="Times New Roman" w:cs="Times New Roman"/>
         </w:rPr>
       </w:pPr>
-      <w:bookmarkStart w:id="25" w:name="_Toc240640926"/>
-      <w:r>
-        <w:rPr>
-          <w:rFonts w:ascii="Times New Roman" w:hAnsi="Times New Roman" w:cs="Times New Roman"/>
-        </w:rPr>
+      <w:bookmarkStart w:id="25" w:name="_Toc240650662"/>
+      <w:r>
+        <w:rPr>
+          <w:rFonts w:ascii="Times New Roman" w:hAnsi="Times New Roman" w:cs="Times New Roman"/>
+        </w:rPr>
+        <w:lastRenderedPageBreak/>
         <w:t>Manual Técnico</w:t>
       </w:r>
       <w:bookmarkEnd w:id="25"/>
@@ -9181,12 +9956,11 @@
           <w:rFonts w:ascii="Times New Roman" w:hAnsi="Times New Roman" w:cs="Times New Roman"/>
         </w:rPr>
       </w:pPr>
-      <w:bookmarkStart w:id="26" w:name="_Toc240640927"/>
-      <w:r>
-        <w:rPr>
-          <w:rFonts w:ascii="Times New Roman" w:hAnsi="Times New Roman" w:cs="Times New Roman"/>
-        </w:rPr>
-        <w:lastRenderedPageBreak/>
+      <w:bookmarkStart w:id="26" w:name="_Toc240650663"/>
+      <w:r>
+        <w:rPr>
+          <w:rFonts w:ascii="Times New Roman" w:hAnsi="Times New Roman" w:cs="Times New Roman"/>
+        </w:rPr>
         <w:t>Arquitectura de clases y principios de POO</w:t>
       </w:r>
       <w:bookmarkEnd w:id="26"/>
@@ -9199,7 +9973,7 @@
           <w:rFonts w:ascii="Times New Roman" w:hAnsi="Times New Roman" w:cs="Times New Roman"/>
         </w:rPr>
       </w:pPr>
-      <w:bookmarkStart w:id="27" w:name="_Toc240640928"/>
+      <w:bookmarkStart w:id="27" w:name="_Toc240650664"/>
       <w:r>
         <w:rPr>
           <w:rFonts w:ascii="Times New Roman" w:hAnsi="Times New Roman" w:cs="Times New Roman"/>
@@ -9258,7 +10032,7 @@
                     <pic:cNvPicPr/>
                   </pic:nvPicPr>
                   <pic:blipFill>
-                    <a:blip r:embed="rId20"/>
+                    <a:blip r:embed="rId22"/>
                     <a:stretch>
                       <a:fillRect/>
                     </a:stretch>
@@ -9369,7 +10143,7 @@
           <w:rFonts w:ascii="Times New Roman" w:hAnsi="Times New Roman" w:cs="Times New Roman"/>
         </w:rPr>
       </w:pPr>
-      <w:bookmarkStart w:id="28" w:name="_Toc240640929"/>
+      <w:bookmarkStart w:id="28" w:name="_Toc240650665"/>
       <w:r>
         <w:rPr>
           <w:rFonts w:ascii="Times New Roman" w:hAnsi="Times New Roman" w:cs="Times New Roman"/>
@@ -9528,7 +10302,7 @@
                     <pic:cNvPicPr/>
                   </pic:nvPicPr>
                   <pic:blipFill>
-                    <a:blip r:embed="rId21"/>
+                    <a:blip r:embed="rId23"/>
                     <a:stretch>
                       <a:fillRect/>
                     </a:stretch>
@@ -9587,11 +10361,12 @@
           <w:rFonts w:ascii="Times New Roman" w:hAnsi="Times New Roman" w:cs="Times New Roman"/>
         </w:rPr>
       </w:pPr>
-      <w:bookmarkStart w:id="29" w:name="_Toc240640930"/>
-      <w:r>
-        <w:rPr>
-          <w:rFonts w:ascii="Times New Roman" w:hAnsi="Times New Roman" w:cs="Times New Roman"/>
-        </w:rPr>
+      <w:bookmarkStart w:id="29" w:name="_Toc240650666"/>
+      <w:r>
+        <w:rPr>
+          <w:rFonts w:ascii="Times New Roman" w:hAnsi="Times New Roman" w:cs="Times New Roman"/>
+        </w:rPr>
+        <w:lastRenderedPageBreak/>
         <w:t>Herencia y encapsulamiento</w:t>
       </w:r>
       <w:bookmarkEnd w:id="29"/>
@@ -9632,7 +10407,7 @@
                     <pic:cNvPicPr/>
                   </pic:nvPicPr>
                   <pic:blipFill>
-                    <a:blip r:embed="rId22"/>
+                    <a:blip r:embed="rId24"/>
                     <a:stretch>
                       <a:fillRect/>
                     </a:stretch>
@@ -9755,7 +10530,7 @@
           <w:rFonts w:ascii="Times New Roman" w:hAnsi="Times New Roman" w:cs="Times New Roman"/>
         </w:rPr>
       </w:pPr>
-      <w:bookmarkStart w:id="30" w:name="_Toc240640931"/>
+      <w:bookmarkStart w:id="30" w:name="_Toc240650667"/>
       <w:r>
         <w:rPr>
           <w:rFonts w:ascii="Times New Roman" w:hAnsi="Times New Roman" w:cs="Times New Roman"/>
@@ -9850,7 +10625,7 @@
           <w:rFonts w:ascii="Times New Roman" w:hAnsi="Times New Roman" w:cs="Times New Roman"/>
         </w:rPr>
       </w:pPr>
-      <w:bookmarkStart w:id="31" w:name="_Toc240640932"/>
+      <w:bookmarkStart w:id="31" w:name="_Toc240650668"/>
       <w:r>
         <w:rPr>
           <w:rFonts w:ascii="Times New Roman" w:hAnsi="Times New Roman" w:cs="Times New Roman"/>
@@ -9871,7 +10646,7 @@
           <w:rFonts w:ascii="Times New Roman" w:hAnsi="Times New Roman" w:cs="Times New Roman"/>
         </w:rPr>
       </w:pPr>
-      <w:bookmarkStart w:id="32" w:name="_Toc240640933"/>
+      <w:bookmarkStart w:id="32" w:name="_Toc240650669"/>
       <w:r>
         <w:rPr>
           <w:rFonts w:ascii="Times New Roman" w:hAnsi="Times New Roman" w:cs="Times New Roman"/>
@@ -9934,17 +10709,9 @@
         <w:rPr>
           <w:rFonts w:ascii="Times New Roman" w:hAnsi="Times New Roman" w:cs="Times New Roman"/>
         </w:rPr>
-        <w:t xml:space="preserve"> y </w:t>
-      </w:r>
-      <w:proofErr w:type="gramStart"/>
-      <w:r>
-        <w:rPr>
-          <w:rFonts w:ascii="Times New Roman" w:hAnsi="Times New Roman" w:cs="Times New Roman"/>
-        </w:rPr>
-        <w:t>Utilidades::</w:t>
+        <w:t xml:space="preserve"> y Utilidades::</w:t>
       </w:r>
       <w:proofErr w:type="spellStart"/>
-      <w:proofErr w:type="gramEnd"/>
       <w:r>
         <w:rPr>
           <w:rFonts w:ascii="Times New Roman" w:hAnsi="Times New Roman" w:cs="Times New Roman"/>
@@ -10009,7 +10776,7 @@
                     <pic:cNvPicPr/>
                   </pic:nvPicPr>
                   <pic:blipFill>
-                    <a:blip r:embed="rId23"/>
+                    <a:blip r:embed="rId25"/>
                     <a:stretch>
                       <a:fillRect/>
                     </a:stretch>
@@ -10042,7 +10809,7 @@
           <w:rFonts w:ascii="Times New Roman" w:hAnsi="Times New Roman" w:cs="Times New Roman"/>
         </w:rPr>
       </w:pPr>
-      <w:bookmarkStart w:id="33" w:name="_Toc240640934"/>
+      <w:bookmarkStart w:id="33" w:name="_Toc240650670"/>
       <w:r>
         <w:rPr>
           <w:rFonts w:ascii="Times New Roman" w:hAnsi="Times New Roman" w:cs="Times New Roman"/>
@@ -10144,7 +10911,7 @@
                     <pic:cNvPicPr/>
                   </pic:nvPicPr>
                   <pic:blipFill>
-                    <a:blip r:embed="rId24"/>
+                    <a:blip r:embed="rId26"/>
                     <a:stretch>
                       <a:fillRect/>
                     </a:stretch>
@@ -10185,7 +10952,7 @@
           <w:rFonts w:ascii="Times New Roman" w:hAnsi="Times New Roman" w:cs="Times New Roman"/>
         </w:rPr>
       </w:pPr>
-      <w:bookmarkStart w:id="34" w:name="_Toc240640935"/>
+      <w:bookmarkStart w:id="34" w:name="_Toc240650671"/>
       <w:r>
         <w:rPr>
           <w:rFonts w:ascii="Times New Roman" w:hAnsi="Times New Roman" w:cs="Times New Roman"/>
@@ -10273,7 +11040,7 @@
                     <pic:cNvPicPr/>
                   </pic:nvPicPr>
                   <pic:blipFill>
-                    <a:blip r:embed="rId25"/>
+                    <a:blip r:embed="rId27"/>
                     <a:stretch>
                       <a:fillRect/>
                     </a:stretch>
@@ -10308,11 +11075,12 @@
           <w:rFonts w:ascii="Times New Roman" w:hAnsi="Times New Roman" w:cs="Times New Roman"/>
         </w:rPr>
       </w:pPr>
-      <w:bookmarkStart w:id="35" w:name="_Toc240640936"/>
-      <w:r>
-        <w:rPr>
-          <w:rFonts w:ascii="Times New Roman" w:hAnsi="Times New Roman" w:cs="Times New Roman"/>
-        </w:rPr>
+      <w:bookmarkStart w:id="35" w:name="_Toc240650672"/>
+      <w:r>
+        <w:rPr>
+          <w:rFonts w:ascii="Times New Roman" w:hAnsi="Times New Roman" w:cs="Times New Roman"/>
+        </w:rPr>
+        <w:lastRenderedPageBreak/>
         <w:t>Optimización de memoria</w:t>
       </w:r>
       <w:bookmarkEnd w:id="35"/>
@@ -10329,7 +11097,7 @@
           <w:rFonts w:ascii="Times New Roman" w:hAnsi="Times New Roman" w:cs="Times New Roman"/>
         </w:rPr>
       </w:pPr>
-      <w:bookmarkStart w:id="36" w:name="_Toc240640937"/>
+      <w:bookmarkStart w:id="36" w:name="_Toc240650673"/>
       <w:r>
         <w:rPr>
           <w:rFonts w:ascii="Times New Roman" w:hAnsi="Times New Roman" w:cs="Times New Roman"/>
@@ -10378,43 +11146,7 @@
         <w:rPr>
           <w:rFonts w:ascii="Times New Roman" w:hAnsi="Times New Roman" w:cs="Times New Roman"/>
         </w:rPr>
-        <w:t xml:space="preserve"> se cuenta con una función llamada redimensionar() . Dicha función </w:t>
-      </w:r>
-      <w:r>
-        <w:rPr>
-          <w:rFonts w:ascii="Times New Roman" w:hAnsi="Times New Roman" w:cs="Times New Roman"/>
-        </w:rPr>
-        <w:t>está</w:t>
-      </w:r>
-      <w:r>
-        <w:rPr>
-          <w:rFonts w:ascii="Times New Roman" w:hAnsi="Times New Roman" w:cs="Times New Roman"/>
-        </w:rPr>
-        <w:t xml:space="preserve"> destinada a, como lo dice su nombre, redimensionar los arreglos dinámicos. Decidí </w:t>
-      </w:r>
-      <w:r>
-        <w:rPr>
-          <w:rFonts w:ascii="Times New Roman" w:hAnsi="Times New Roman" w:cs="Times New Roman"/>
-        </w:rPr>
-        <w:t>que,</w:t>
-      </w:r>
-      <w:r>
-        <w:rPr>
-          <w:rFonts w:ascii="Times New Roman" w:hAnsi="Times New Roman" w:cs="Times New Roman"/>
-        </w:rPr>
-        <w:t xml:space="preserve"> en lugar de asignar bloques masivos de memoria estática, las clases mencionadas podrían iniciar con una capacidad reducida (5 elementos). Al alcanzar el </w:t>
-      </w:r>
-      <w:r>
-        <w:rPr>
-          <w:rFonts w:ascii="Times New Roman" w:hAnsi="Times New Roman" w:cs="Times New Roman"/>
-        </w:rPr>
-        <w:t>límite</w:t>
-      </w:r>
-      <w:r>
-        <w:rPr>
-          <w:rFonts w:ascii="Times New Roman" w:hAnsi="Times New Roman" w:cs="Times New Roman"/>
-        </w:rPr>
-        <w:t xml:space="preserve"> establecido, la función privada ya mencionada se encarga de duplicar ese espacio y reasignar el arreglo. Esto garantiza un consuma de RAM proporcional al uso que el usuario vaya usando.  </w:t>
+        <w:t xml:space="preserve"> se cuenta con una función llamada redimensionar() . Dicha función está destinada a, como lo dice su nombre, redimensionar los arreglos dinámicos. Decidí que, en lugar de asignar bloques masivos de memoria estática, las clases mencionadas podrían iniciar con una capacidad reducida (5 elementos). Al alcanzar el límite establecido, la función privada ya mencionada se encarga de duplicar ese espacio y reasignar el arreglo. Esto garantiza un consuma de RAM proporcional al uso que el usuario vaya usando.  </w:t>
       </w:r>
     </w:p>
     <w:p>
@@ -10430,7 +11162,6 @@
           <w:rFonts w:ascii="Times New Roman" w:hAnsi="Times New Roman" w:cs="Times New Roman"/>
           <w:noProof/>
         </w:rPr>
-        <w:lastRenderedPageBreak/>
         <w:drawing>
           <wp:anchor distT="0" distB="0" distL="114300" distR="114300" simplePos="0" relativeHeight="251702272" behindDoc="0" locked="0" layoutInCell="1" allowOverlap="1" wp14:anchorId="2CD3DEA6" wp14:editId="57114B76">
             <wp:simplePos x="0" y="0"/>
@@ -10455,7 +11186,7 @@
                     <pic:cNvPicPr/>
                   </pic:nvPicPr>
                   <pic:blipFill>
-                    <a:blip r:embed="rId26"/>
+                    <a:blip r:embed="rId28"/>
                     <a:stretch>
                       <a:fillRect/>
                     </a:stretch>
@@ -10545,7 +11276,7 @@
           <w:rFonts w:ascii="Times New Roman" w:hAnsi="Times New Roman" w:cs="Times New Roman"/>
         </w:rPr>
       </w:pPr>
-      <w:bookmarkStart w:id="37" w:name="_Toc240640938"/>
+      <w:bookmarkStart w:id="37" w:name="_Toc240650674"/>
       <w:r>
         <w:rPr>
           <w:rFonts w:ascii="Times New Roman" w:hAnsi="Times New Roman" w:cs="Times New Roman"/>
@@ -10594,17 +11325,9 @@
         <w:rPr>
           <w:rFonts w:ascii="Times New Roman" w:hAnsi="Times New Roman" w:cs="Times New Roman"/>
         </w:rPr>
-        <w:t>(0,</w:t>
-      </w:r>
-      <w:proofErr w:type="gramStart"/>
-      <w:r>
-        <w:rPr>
-          <w:rFonts w:ascii="Times New Roman" w:hAnsi="Times New Roman" w:cs="Times New Roman"/>
-        </w:rPr>
-        <w:t>ios::</w:t>
+        <w:t>(0,ios::</w:t>
       </w:r>
       <w:proofErr w:type="spellStart"/>
-      <w:proofErr w:type="gramEnd"/>
       <w:r>
         <w:rPr>
           <w:rFonts w:ascii="Times New Roman" w:hAnsi="Times New Roman" w:cs="Times New Roman"/>
@@ -10711,7 +11434,7 @@
                     <pic:cNvPicPr/>
                   </pic:nvPicPr>
                   <pic:blipFill>
-                    <a:blip r:embed="rId27"/>
+                    <a:blip r:embed="rId29"/>
                     <a:stretch>
                       <a:fillRect/>
                     </a:stretch>
@@ -10764,7 +11487,7 @@
           <w:rFonts w:ascii="Times New Roman" w:hAnsi="Times New Roman" w:cs="Times New Roman"/>
         </w:rPr>
       </w:pPr>
-      <w:bookmarkStart w:id="38" w:name="_Toc240640939"/>
+      <w:bookmarkStart w:id="38" w:name="_Toc240650675"/>
       <w:r>
         <w:rPr>
           <w:rFonts w:ascii="Times New Roman" w:hAnsi="Times New Roman" w:cs="Times New Roman"/>
@@ -10809,7 +11532,7 @@
           <w:rFonts w:ascii="Times New Roman" w:hAnsi="Times New Roman" w:cs="Times New Roman"/>
         </w:rPr>
       </w:pPr>
-      <w:bookmarkStart w:id="39" w:name="_Toc240640940"/>
+      <w:bookmarkStart w:id="39" w:name="_Toc240650676"/>
       <w:r>
         <w:rPr>
           <w:rFonts w:ascii="Times New Roman" w:hAnsi="Times New Roman" w:cs="Times New Roman"/>
@@ -10852,6 +11575,7 @@
           <w:rFonts w:ascii="Times New Roman" w:hAnsi="Times New Roman" w:cs="Times New Roman"/>
           <w:noProof/>
         </w:rPr>
+        <w:lastRenderedPageBreak/>
         <w:drawing>
           <wp:anchor distT="0" distB="0" distL="114300" distR="114300" simplePos="0" relativeHeight="251706368" behindDoc="0" locked="0" layoutInCell="1" allowOverlap="1" wp14:anchorId="369F1383" wp14:editId="0FBC6BE0">
             <wp:simplePos x="0" y="0"/>
@@ -10876,7 +11600,7 @@
                     <pic:cNvPicPr/>
                   </pic:nvPicPr>
                   <pic:blipFill>
-                    <a:blip r:embed="rId28"/>
+                    <a:blip r:embed="rId30"/>
                     <a:stretch>
                       <a:fillRect/>
                     </a:stretch>
@@ -10967,12 +11691,11 @@
           <w:rFonts w:ascii="Times New Roman" w:hAnsi="Times New Roman" w:cs="Times New Roman"/>
         </w:rPr>
       </w:pPr>
-      <w:bookmarkStart w:id="40" w:name="_Toc240640941"/>
-      <w:r>
-        <w:rPr>
-          <w:rFonts w:ascii="Times New Roman" w:hAnsi="Times New Roman" w:cs="Times New Roman"/>
-        </w:rPr>
-        <w:lastRenderedPageBreak/>
+      <w:bookmarkStart w:id="40" w:name="_Toc240650677"/>
+      <w:r>
+        <w:rPr>
+          <w:rFonts w:ascii="Times New Roman" w:hAnsi="Times New Roman" w:cs="Times New Roman"/>
+        </w:rPr>
         <w:t>Algoritmo de ordenamiento por fecha (</w:t>
       </w:r>
       <w:proofErr w:type="spellStart"/>
@@ -11027,7 +11750,7 @@
                     <pic:cNvPicPr/>
                   </pic:nvPicPr>
                   <pic:blipFill>
-                    <a:blip r:embed="rId29"/>
+                    <a:blip r:embed="rId31"/>
                     <a:stretch>
                       <a:fillRect/>
                     </a:stretch>
@@ -11144,7 +11867,7 @@
           <w:rFonts w:ascii="Times New Roman" w:hAnsi="Times New Roman" w:cs="Times New Roman"/>
         </w:rPr>
       </w:pPr>
-      <w:bookmarkStart w:id="41" w:name="_Toc240640942"/>
+      <w:bookmarkStart w:id="41" w:name="_Toc240650678"/>
       <w:r>
         <w:rPr>
           <w:rFonts w:ascii="Times New Roman" w:hAnsi="Times New Roman" w:cs="Times New Roman"/>
@@ -11189,7 +11912,7 @@
                     <pic:cNvPicPr/>
                   </pic:nvPicPr>
                   <pic:blipFill>
-                    <a:blip r:embed="rId30"/>
+                    <a:blip r:embed="rId32"/>
                     <a:stretch>
                       <a:fillRect/>
                     </a:stretch>
@@ -11283,11 +12006,12 @@
           <w:rFonts w:ascii="Times New Roman" w:hAnsi="Times New Roman" w:cs="Times New Roman"/>
         </w:rPr>
       </w:pPr>
-      <w:bookmarkStart w:id="42" w:name="_Toc240640943"/>
-      <w:r>
-        <w:rPr>
-          <w:rFonts w:ascii="Times New Roman" w:hAnsi="Times New Roman" w:cs="Times New Roman"/>
-        </w:rPr>
+      <w:bookmarkStart w:id="42" w:name="_Toc240650679"/>
+      <w:r>
+        <w:rPr>
+          <w:rFonts w:ascii="Times New Roman" w:hAnsi="Times New Roman" w:cs="Times New Roman"/>
+        </w:rPr>
+        <w:lastRenderedPageBreak/>
         <w:t>Pruebas y resultados</w:t>
       </w:r>
       <w:bookmarkEnd w:id="42"/>
@@ -11314,12 +12038,11 @@
           <w:rFonts w:ascii="Times New Roman" w:hAnsi="Times New Roman" w:cs="Times New Roman"/>
         </w:rPr>
       </w:pPr>
-      <w:bookmarkStart w:id="43" w:name="_Toc240640944"/>
-      <w:r>
-        <w:rPr>
-          <w:rFonts w:ascii="Times New Roman" w:hAnsi="Times New Roman" w:cs="Times New Roman"/>
-        </w:rPr>
-        <w:lastRenderedPageBreak/>
+      <w:bookmarkStart w:id="43" w:name="_Toc240650680"/>
+      <w:r>
+        <w:rPr>
+          <w:rFonts w:ascii="Times New Roman" w:hAnsi="Times New Roman" w:cs="Times New Roman"/>
+        </w:rPr>
         <w:t>Pruebas con datos inválidos</w:t>
       </w:r>
       <w:bookmarkEnd w:id="43"/>
@@ -11360,7 +12083,7 @@
                     <pic:cNvPicPr/>
                   </pic:nvPicPr>
                   <pic:blipFill>
-                    <a:blip r:embed="rId31"/>
+                    <a:blip r:embed="rId33"/>
                     <a:stretch>
                       <a:fillRect/>
                     </a:stretch>
@@ -11445,7 +12168,7 @@
                     <pic:cNvPicPr/>
                   </pic:nvPicPr>
                   <pic:blipFill>
-                    <a:blip r:embed="rId32"/>
+                    <a:blip r:embed="rId34"/>
                     <a:stretch>
                       <a:fillRect/>
                     </a:stretch>
@@ -11574,7 +12297,7 @@
           <w:rFonts w:ascii="Times New Roman" w:hAnsi="Times New Roman" w:cs="Times New Roman"/>
         </w:rPr>
       </w:pPr>
-      <w:bookmarkStart w:id="44" w:name="_Toc240640945"/>
+      <w:bookmarkStart w:id="44" w:name="_Toc240650681"/>
       <w:r>
         <w:rPr>
           <w:rFonts w:ascii="Times New Roman" w:hAnsi="Times New Roman" w:cs="Times New Roman"/>
@@ -11620,7 +12343,7 @@
                     <pic:cNvPicPr/>
                   </pic:nvPicPr>
                   <pic:blipFill>
-                    <a:blip r:embed="rId33"/>
+                    <a:blip r:embed="rId35"/>
                     <a:stretch>
                       <a:fillRect/>
                     </a:stretch>
@@ -11689,7 +12412,7 @@
                     <pic:cNvPicPr/>
                   </pic:nvPicPr>
                   <pic:blipFill>
-                    <a:blip r:embed="rId34"/>
+                    <a:blip r:embed="rId36"/>
                     <a:stretch>
                       <a:fillRect/>
                     </a:stretch>
@@ -11744,7 +12467,7 @@
                     <pic:cNvPicPr/>
                   </pic:nvPicPr>
                   <pic:blipFill>
-                    <a:blip r:embed="rId35"/>
+                    <a:blip r:embed="rId37"/>
                     <a:stretch>
                       <a:fillRect/>
                     </a:stretch>
@@ -11889,7 +12612,7 @@
           <w:rFonts w:ascii="Times New Roman" w:hAnsi="Times New Roman" w:cs="Times New Roman"/>
         </w:rPr>
       </w:pPr>
-      <w:bookmarkStart w:id="45" w:name="_Toc240640946"/>
+      <w:bookmarkStart w:id="45" w:name="_Toc240650682"/>
       <w:r>
         <w:rPr>
           <w:rFonts w:ascii="Times New Roman" w:hAnsi="Times New Roman" w:cs="Times New Roman"/>
@@ -11934,7 +12657,7 @@
                     <pic:cNvPicPr/>
                   </pic:nvPicPr>
                   <pic:blipFill>
-                    <a:blip r:embed="rId30"/>
+                    <a:blip r:embed="rId32"/>
                     <a:stretch>
                       <a:fillRect/>
                     </a:stretch>
@@ -11977,6 +12700,7 @@
       <w:r>
         <w:rPr>
           <w:rFonts w:ascii="Times New Roman" w:hAnsi="Times New Roman" w:cs="Times New Roman"/>
+          <w:noProof/>
         </w:rPr>
         <w:drawing>
           <wp:anchor distT="0" distB="0" distL="114300" distR="114300" simplePos="0" relativeHeight="251726848" behindDoc="0" locked="0" layoutInCell="1" allowOverlap="1" wp14:anchorId="1B1A0A0D" wp14:editId="3C8CEDDE">
@@ -12002,7 +12726,7 @@
                     <pic:cNvPicPr/>
                   </pic:nvPicPr>
                   <pic:blipFill>
-                    <a:blip r:embed="rId36"/>
+                    <a:blip r:embed="rId38"/>
                     <a:stretch>
                       <a:fillRect/>
                     </a:stretch>
@@ -12031,41 +12755,18 @@
     </w:p>
     <w:p>
       <w:pPr>
-        <w:jc w:val="both"/>
-        <w:rPr>
-          <w:rFonts w:ascii="Times New Roman" w:hAnsi="Times New Roman" w:cs="Times New Roman"/>
-        </w:rPr>
-      </w:pPr>
-    </w:p>
-    <w:p>
-      <w:pPr>
-        <w:jc w:val="both"/>
-        <w:rPr>
-          <w:rFonts w:ascii="Times New Roman" w:hAnsi="Times New Roman" w:cs="Times New Roman"/>
-        </w:rPr>
-      </w:pPr>
-    </w:p>
-    <w:p>
-      <w:pPr>
-        <w:jc w:val="both"/>
-        <w:rPr>
-          <w:rFonts w:ascii="Times New Roman" w:hAnsi="Times New Roman" w:cs="Times New Roman"/>
-        </w:rPr>
-      </w:pPr>
-    </w:p>
-    <w:p>
-      <w:pPr>
         <w:pStyle w:val="Ttulo2"/>
         <w:jc w:val="both"/>
         <w:rPr>
           <w:rFonts w:ascii="Times New Roman" w:hAnsi="Times New Roman" w:cs="Times New Roman"/>
         </w:rPr>
       </w:pPr>
-      <w:bookmarkStart w:id="46" w:name="_Toc240640947"/>
-      <w:r>
-        <w:rPr>
-          <w:rFonts w:ascii="Times New Roman" w:hAnsi="Times New Roman" w:cs="Times New Roman"/>
-        </w:rPr>
+      <w:bookmarkStart w:id="46" w:name="_Toc240650683"/>
+      <w:r>
+        <w:rPr>
+          <w:rFonts w:ascii="Times New Roman" w:hAnsi="Times New Roman" w:cs="Times New Roman"/>
+        </w:rPr>
+        <w:lastRenderedPageBreak/>
         <w:t>Resultado final obtenido</w:t>
       </w:r>
       <w:bookmarkEnd w:id="46"/>
@@ -12100,7 +12801,7 @@
           <w:rFonts w:ascii="Times New Roman" w:hAnsi="Times New Roman" w:cs="Times New Roman"/>
         </w:rPr>
       </w:pPr>
-      <w:bookmarkStart w:id="47" w:name="_Toc240640948"/>
+      <w:bookmarkStart w:id="47" w:name="_Toc240650684"/>
       <w:r>
         <w:rPr>
           <w:rFonts w:ascii="Times New Roman" w:hAnsi="Times New Roman" w:cs="Times New Roman"/>
@@ -12117,7 +12818,7 @@
           <w:rFonts w:ascii="Times New Roman" w:hAnsi="Times New Roman" w:cs="Times New Roman"/>
         </w:rPr>
       </w:pPr>
-      <w:bookmarkStart w:id="48" w:name="_Toc240640949"/>
+      <w:bookmarkStart w:id="48" w:name="_Toc240650685"/>
       <w:r>
         <w:rPr>
           <w:rFonts w:ascii="Times New Roman" w:hAnsi="Times New Roman" w:cs="Times New Roman"/>
@@ -12204,7 +12905,7 @@
           <w:rFonts w:ascii="Times New Roman" w:hAnsi="Times New Roman" w:cs="Times New Roman"/>
         </w:rPr>
       </w:pPr>
-      <w:bookmarkStart w:id="49" w:name="_Toc240640950"/>
+      <w:bookmarkStart w:id="49" w:name="_Toc240650686"/>
       <w:r>
         <w:rPr>
           <w:rFonts w:ascii="Times New Roman" w:hAnsi="Times New Roman" w:cs="Times New Roman"/>
@@ -12229,19 +12930,7 @@
         <w:rPr>
           <w:rFonts w:ascii="Times New Roman" w:hAnsi="Times New Roman" w:cs="Times New Roman"/>
         </w:rPr>
-        <w:t xml:space="preserve">Entorno: El entorno actual del programa </w:t>
-      </w:r>
-      <w:r>
-        <w:rPr>
-          <w:rFonts w:ascii="Times New Roman" w:hAnsi="Times New Roman" w:cs="Times New Roman"/>
-        </w:rPr>
-        <w:t>está</w:t>
-      </w:r>
-      <w:r>
-        <w:rPr>
-          <w:rFonts w:ascii="Times New Roman" w:hAnsi="Times New Roman" w:cs="Times New Roman"/>
-        </w:rPr>
-        <w:t xml:space="preserve"> pensado para Windows 10 u 11 debido a que se utilizan funciones específicas para Windows y librerías específicas del entorno operativo. </w:t>
+        <w:t xml:space="preserve">Entorno: El entorno actual del programa está pensado para Windows 10 u 11 debido a que se utilizan funciones específicas para Windows y librerías específicas del entorno operativo. </w:t>
       </w:r>
     </w:p>
     <w:p>
@@ -12318,7 +13007,7 @@
           <w:rFonts w:ascii="Times New Roman" w:hAnsi="Times New Roman" w:cs="Times New Roman"/>
         </w:rPr>
       </w:pPr>
-      <w:bookmarkStart w:id="50" w:name="_Toc240640951"/>
+      <w:bookmarkStart w:id="50" w:name="_Toc240650687"/>
       <w:r>
         <w:rPr>
           <w:rFonts w:ascii="Times New Roman" w:hAnsi="Times New Roman" w:cs="Times New Roman"/>
@@ -12416,7 +13105,6 @@
           <w:rFonts w:ascii="Times New Roman" w:hAnsi="Times New Roman" w:cs="Times New Roman"/>
           <w:noProof/>
         </w:rPr>
-        <w:lastRenderedPageBreak/>
         <w:drawing>
           <wp:anchor distT="0" distB="0" distL="114300" distR="114300" simplePos="0" relativeHeight="251728896" behindDoc="0" locked="0" layoutInCell="1" allowOverlap="1" wp14:anchorId="5A3562CF" wp14:editId="4D1C7717">
             <wp:simplePos x="0" y="0"/>
@@ -12441,7 +13129,7 @@
                     <pic:cNvPicPr/>
                   </pic:nvPicPr>
                   <pic:blipFill>
-                    <a:blip r:embed="rId37"/>
+                    <a:blip r:embed="rId39"/>
                     <a:stretch>
                       <a:fillRect/>
                     </a:stretch>
@@ -12514,7 +13202,7 @@
           <w:rFonts w:ascii="Times New Roman" w:hAnsi="Times New Roman" w:cs="Times New Roman"/>
         </w:rPr>
       </w:pPr>
-      <w:bookmarkStart w:id="51" w:name="_Toc240640952"/>
+      <w:bookmarkStart w:id="51" w:name="_Toc240650688"/>
       <w:r>
         <w:rPr>
           <w:rFonts w:ascii="Times New Roman" w:hAnsi="Times New Roman" w:cs="Times New Roman"/>
@@ -12609,7 +13297,7 @@
                     <pic:cNvPicPr/>
                   </pic:nvPicPr>
                   <pic:blipFill>
-                    <a:blip r:embed="rId37"/>
+                    <a:blip r:embed="rId39"/>
                     <a:stretch>
                       <a:fillRect/>
                     </a:stretch>
@@ -12700,7 +13388,7 @@
                     <pic:cNvPicPr/>
                   </pic:nvPicPr>
                   <pic:blipFill>
-                    <a:blip r:embed="rId38"/>
+                    <a:blip r:embed="rId40"/>
                     <a:stretch>
                       <a:fillRect/>
                     </a:stretch>
@@ -12844,7 +13532,7 @@
                     <pic:cNvPicPr/>
                   </pic:nvPicPr>
                   <pic:blipFill>
-                    <a:blip r:embed="rId31"/>
+                    <a:blip r:embed="rId33"/>
                     <a:stretch>
                       <a:fillRect/>
                     </a:stretch>
@@ -12887,7 +13575,7 @@
           <w:rFonts w:ascii="Times New Roman" w:hAnsi="Times New Roman" w:cs="Times New Roman"/>
         </w:rPr>
       </w:pPr>
-      <w:bookmarkStart w:id="52" w:name="_Toc240640953"/>
+      <w:bookmarkStart w:id="52" w:name="_Toc240650689"/>
       <w:r>
         <w:rPr>
           <w:rFonts w:ascii="Times New Roman" w:hAnsi="Times New Roman" w:cs="Times New Roman"/>
@@ -13060,7 +13748,7 @@
                     <pic:cNvPicPr/>
                   </pic:nvPicPr>
                   <pic:blipFill>
-                    <a:blip r:embed="rId39"/>
+                    <a:blip r:embed="rId41"/>
                     <a:stretch>
                       <a:fillRect/>
                     </a:stretch>
@@ -13115,7 +13803,7 @@
                     <pic:cNvPicPr/>
                   </pic:nvPicPr>
                   <pic:blipFill>
-                    <a:blip r:embed="rId35"/>
+                    <a:blip r:embed="rId37"/>
                     <a:stretch>
                       <a:fillRect/>
                     </a:stretch>
@@ -13196,7 +13884,7 @@
           <w:rFonts w:ascii="Times New Roman" w:hAnsi="Times New Roman" w:cs="Times New Roman"/>
         </w:rPr>
       </w:pPr>
-      <w:bookmarkStart w:id="53" w:name="_Toc240640954"/>
+      <w:bookmarkStart w:id="53" w:name="_Toc240650690"/>
       <w:r>
         <w:rPr>
           <w:rFonts w:ascii="Times New Roman" w:hAnsi="Times New Roman" w:cs="Times New Roman"/>
@@ -13214,7 +13902,7 @@
           <w:rFonts w:ascii="Times New Roman" w:hAnsi="Times New Roman" w:cs="Times New Roman"/>
         </w:rPr>
       </w:pPr>
-      <w:bookmarkStart w:id="54" w:name="_Toc240640955"/>
+      <w:bookmarkStart w:id="54" w:name="_Toc240650691"/>
       <w:r>
         <w:rPr>
           <w:rFonts w:ascii="Times New Roman" w:hAnsi="Times New Roman" w:cs="Times New Roman"/>
@@ -13259,7 +13947,7 @@
                     <pic:cNvPicPr/>
                   </pic:nvPicPr>
                   <pic:blipFill>
-                    <a:blip r:embed="rId34"/>
+                    <a:blip r:embed="rId36"/>
                     <a:stretch>
                       <a:fillRect/>
                     </a:stretch>
@@ -13292,7 +13980,6 @@
         <w:t xml:space="preserve">Esta opción comprueba la lectura y escritura limpia en modo binario (con </w:t>
       </w:r>
       <w:proofErr w:type="spellStart"/>
-      <w:proofErr w:type="gramStart"/>
       <w:r>
         <w:rPr>
           <w:rFonts w:ascii="Times New Roman" w:hAnsi="Times New Roman" w:cs="Times New Roman"/>
@@ -13307,7 +13994,6 @@
         <w:t>::</w:t>
       </w:r>
       <w:proofErr w:type="spellStart"/>
-      <w:proofErr w:type="gramEnd"/>
       <w:r>
         <w:rPr>
           <w:rFonts w:ascii="Times New Roman" w:hAnsi="Times New Roman" w:cs="Times New Roman"/>
@@ -13359,7 +14045,7 @@
                     <pic:cNvPicPr/>
                   </pic:nvPicPr>
                   <pic:blipFill>
-                    <a:blip r:embed="rId33"/>
+                    <a:blip r:embed="rId35"/>
                     <a:stretch>
                       <a:fillRect/>
                     </a:stretch>
@@ -13421,7 +14107,7 @@
           <w:rFonts w:ascii="Times New Roman" w:hAnsi="Times New Roman" w:cs="Times New Roman"/>
         </w:rPr>
       </w:pPr>
-      <w:bookmarkStart w:id="55" w:name="_Toc240640956"/>
+      <w:bookmarkStart w:id="55" w:name="_Toc240650692"/>
       <w:r>
         <w:rPr>
           <w:rFonts w:ascii="Times New Roman" w:hAnsi="Times New Roman" w:cs="Times New Roman"/>
@@ -13480,7 +14166,7 @@
                     <pic:cNvPicPr/>
                   </pic:nvPicPr>
                   <pic:blipFill>
-                    <a:blip r:embed="rId40"/>
+                    <a:blip r:embed="rId42"/>
                     <a:stretch>
                       <a:fillRect/>
                     </a:stretch>
@@ -13569,37 +14255,13 @@
     </w:p>
     <w:p>
       <w:pPr>
-        <w:jc w:val="both"/>
-        <w:rPr>
-          <w:rFonts w:ascii="Times New Roman" w:hAnsi="Times New Roman" w:cs="Times New Roman"/>
-        </w:rPr>
-      </w:pPr>
-    </w:p>
-    <w:p>
-      <w:pPr>
-        <w:jc w:val="both"/>
-        <w:rPr>
-          <w:rFonts w:ascii="Times New Roman" w:hAnsi="Times New Roman" w:cs="Times New Roman"/>
-        </w:rPr>
-      </w:pPr>
-    </w:p>
-    <w:p>
-      <w:pPr>
-        <w:jc w:val="both"/>
-        <w:rPr>
-          <w:rFonts w:ascii="Times New Roman" w:hAnsi="Times New Roman" w:cs="Times New Roman"/>
-        </w:rPr>
-      </w:pPr>
-    </w:p>
-    <w:p>
-      <w:pPr>
         <w:pStyle w:val="Ttulo3"/>
         <w:jc w:val="both"/>
         <w:rPr>
           <w:rFonts w:ascii="Times New Roman" w:hAnsi="Times New Roman" w:cs="Times New Roman"/>
         </w:rPr>
       </w:pPr>
-      <w:bookmarkStart w:id="56" w:name="_Toc240640957"/>
+      <w:bookmarkStart w:id="56" w:name="_Toc240650693"/>
       <w:r>
         <w:rPr>
           <w:rFonts w:ascii="Times New Roman" w:hAnsi="Times New Roman" w:cs="Times New Roman"/>
@@ -13638,7 +14300,6 @@
         <w:rPr>
           <w:rFonts w:ascii="Times New Roman" w:hAnsi="Times New Roman" w:cs="Times New Roman"/>
         </w:rPr>
-        <w:lastRenderedPageBreak/>
         <w:t>Ver historial: Muestra la tablada con formato centrado las acciones realizadas y registradas con fecha y hora, usuario, tipo, algoritmo y archivo (ruta o consola).</w:t>
       </w:r>
     </w:p>
@@ -13677,6 +14338,7 @@
         <w:rPr>
           <w:rFonts w:ascii="Times New Roman" w:hAnsi="Times New Roman" w:cs="Times New Roman"/>
         </w:rPr>
+        <w:lastRenderedPageBreak/>
         <w:t>Buscar operaciones por usuario: Filtra y despliega únicamente las operaciones realizadas por un usuario. Si el usuario ingresado no existe se mostrará el error en pantalla en color rojo.</w:t>
       </w:r>
     </w:p>
@@ -13749,7 +14411,7 @@
                     <pic:cNvPicPr/>
                   </pic:nvPicPr>
                   <pic:blipFill>
-                    <a:blip r:embed="rId41"/>
+                    <a:blip r:embed="rId43"/>
                     <a:stretch>
                       <a:fillRect/>
                     </a:stretch>
@@ -13840,7 +14502,7 @@
           <w:rFonts w:ascii="Times New Roman" w:hAnsi="Times New Roman" w:cs="Times New Roman"/>
         </w:rPr>
       </w:pPr>
-      <w:bookmarkStart w:id="57" w:name="_Toc240640958"/>
+      <w:bookmarkStart w:id="57" w:name="_Toc240650694"/>
       <w:r>
         <w:rPr>
           <w:rFonts w:ascii="Times New Roman" w:hAnsi="Times New Roman" w:cs="Times New Roman"/>
@@ -13865,19 +14527,7 @@
         <w:rPr>
           <w:rFonts w:ascii="Times New Roman" w:hAnsi="Times New Roman" w:cs="Times New Roman"/>
         </w:rPr>
-        <w:t xml:space="preserve">Cancelación del explorador: Si al momento de seleccionar una de las opciones que abren el explorador de Windows y seleccionas cancelar, el programa no tronará, en pantalla se mostrará un mensaje en rojo indicando que la operación se </w:t>
-      </w:r>
-      <w:r>
-        <w:rPr>
-          <w:rFonts w:ascii="Times New Roman" w:hAnsi="Times New Roman" w:cs="Times New Roman"/>
-        </w:rPr>
-        <w:t>canceló</w:t>
-      </w:r>
-      <w:r>
-        <w:rPr>
-          <w:rFonts w:ascii="Times New Roman" w:hAnsi="Times New Roman" w:cs="Times New Roman"/>
-        </w:rPr>
-        <w:t xml:space="preserve"> (debido a que no se seleccionó nada).</w:t>
+        <w:t>Cancelación del explorador: Si al momento de seleccionar una de las opciones que abren el explorador de Windows y seleccionas cancelar, el programa no tronará, en pantalla se mostrará un mensaje en rojo indicando que la operación se canceló (debido a que no se seleccionó nada).</w:t>
       </w:r>
     </w:p>
     <w:p>
@@ -13928,20 +14578,32 @@
       <w:r>
         <w:rPr>
           <w:rFonts w:ascii="Times New Roman" w:hAnsi="Times New Roman" w:cs="Times New Roman"/>
+        </w:rPr>
+        <w:t xml:space="preserve">Archivos corruptos: Asegúrate de usar la misma clave y algoritmo cuando vas a cifrar/descifrar un archivo. Modificar una clave en archivos binarios altera su formato nativo y encabados. </w:t>
+      </w:r>
+    </w:p>
+    <w:p>
+      <w:pPr>
+        <w:jc w:val="both"/>
+        <w:rPr>
+          <w:rFonts w:ascii="Times New Roman" w:hAnsi="Times New Roman" w:cs="Times New Roman"/>
+        </w:rPr>
+      </w:pPr>
+      <w:r>
+        <w:rPr>
           <w:noProof/>
         </w:rPr>
-        <w:lastRenderedPageBreak/>
         <w:drawing>
-          <wp:anchor distT="0" distB="0" distL="114300" distR="114300" simplePos="0" relativeHeight="251745280" behindDoc="0" locked="0" layoutInCell="1" allowOverlap="1" wp14:anchorId="5980A4DE" wp14:editId="77956CF5">
+          <wp:anchor distT="0" distB="0" distL="114300" distR="114300" simplePos="0" relativeHeight="251745280" behindDoc="0" locked="0" layoutInCell="1" allowOverlap="1" wp14:anchorId="5980A4DE" wp14:editId="534EC46A">
             <wp:simplePos x="0" y="0"/>
             <wp:positionH relativeFrom="margin">
-              <wp:posOffset>1251585</wp:posOffset>
+              <wp:align>center</wp:align>
             </wp:positionH>
             <wp:positionV relativeFrom="paragraph">
-              <wp:posOffset>639445</wp:posOffset>
+              <wp:posOffset>11430</wp:posOffset>
             </wp:positionV>
-            <wp:extent cx="3040380" cy="3292475"/>
-            <wp:effectExtent l="0" t="0" r="7620" b="3175"/>
+            <wp:extent cx="1981200" cy="2145665"/>
+            <wp:effectExtent l="0" t="0" r="0" b="6985"/>
             <wp:wrapSquare wrapText="bothSides"/>
             <wp:docPr id="1530722892" name="Imagen 1"/>
             <wp:cNvGraphicFramePr>
@@ -13955,7 +14617,7 @@
                     <pic:cNvPicPr/>
                   </pic:nvPicPr>
                   <pic:blipFill>
-                    <a:blip r:embed="rId32"/>
+                    <a:blip r:embed="rId34"/>
                     <a:stretch>
                       <a:fillRect/>
                     </a:stretch>
@@ -13963,7 +14625,7 @@
                   <pic:spPr>
                     <a:xfrm>
                       <a:off x="0" y="0"/>
-                      <a:ext cx="3040380" cy="3292475"/>
+                      <a:ext cx="1981200" cy="2145665"/>
                     </a:xfrm>
                     <a:prstGeom prst="rect">
                       <a:avLst/>
@@ -13981,36 +14643,6 @@
           </wp:anchor>
         </w:drawing>
       </w:r>
-      <w:r>
-        <w:rPr>
-          <w:rFonts w:ascii="Times New Roman" w:hAnsi="Times New Roman" w:cs="Times New Roman"/>
-        </w:rPr>
-        <w:t xml:space="preserve">Archivos corruptos: Asegúrate de usar la misma clave y algoritmo cuando vas a cifrar/descifrar un archivo. Modificar una clave en archivos binarios altera su formato nativo y encabados. </w:t>
-      </w:r>
-    </w:p>
-    <w:p>
-      <w:pPr>
-        <w:jc w:val="both"/>
-        <w:rPr>
-          <w:rFonts w:ascii="Times New Roman" w:hAnsi="Times New Roman" w:cs="Times New Roman"/>
-        </w:rPr>
-      </w:pPr>
-    </w:p>
-    <w:p>
-      <w:pPr>
-        <w:jc w:val="both"/>
-        <w:rPr>
-          <w:rFonts w:ascii="Times New Roman" w:hAnsi="Times New Roman" w:cs="Times New Roman"/>
-        </w:rPr>
-      </w:pPr>
-    </w:p>
-    <w:p>
-      <w:pPr>
-        <w:jc w:val="both"/>
-        <w:rPr>
-          <w:rFonts w:ascii="Times New Roman" w:hAnsi="Times New Roman" w:cs="Times New Roman"/>
-        </w:rPr>
-      </w:pPr>
     </w:p>
     <w:p>
       <w:pPr>
@@ -14092,11 +14724,12 @@
           <w:rFonts w:ascii="Times New Roman" w:hAnsi="Times New Roman" w:cs="Times New Roman"/>
         </w:rPr>
       </w:pPr>
-      <w:bookmarkStart w:id="58" w:name="_Toc240640959"/>
-      <w:r>
-        <w:rPr>
-          <w:rFonts w:ascii="Times New Roman" w:hAnsi="Times New Roman" w:cs="Times New Roman"/>
-        </w:rPr>
+      <w:bookmarkStart w:id="58" w:name="_Toc240650695"/>
+      <w:r>
+        <w:rPr>
+          <w:rFonts w:ascii="Times New Roman" w:hAnsi="Times New Roman" w:cs="Times New Roman"/>
+        </w:rPr>
+        <w:lastRenderedPageBreak/>
         <w:t>Conclusiones</w:t>
       </w:r>
       <w:bookmarkEnd w:id="58"/>
@@ -14220,21 +14853,13 @@
     </w:p>
     <w:p>
       <w:pPr>
-        <w:jc w:val="both"/>
-        <w:rPr>
-          <w:rFonts w:ascii="Times New Roman" w:hAnsi="Times New Roman" w:cs="Times New Roman"/>
-        </w:rPr>
-      </w:pPr>
-    </w:p>
-    <w:p>
-      <w:pPr>
         <w:pStyle w:val="Ttulo1"/>
         <w:jc w:val="both"/>
         <w:rPr>
           <w:rFonts w:ascii="Times New Roman" w:hAnsi="Times New Roman" w:cs="Times New Roman"/>
         </w:rPr>
       </w:pPr>
-      <w:bookmarkStart w:id="59" w:name="_Toc240640960"/>
+      <w:bookmarkStart w:id="59" w:name="_Toc240650696"/>
       <w:r>
         <w:rPr>
           <w:rFonts w:ascii="Times New Roman" w:hAnsi="Times New Roman" w:cs="Times New Roman"/>
@@ -14289,7 +14914,7 @@
         </w:rPr>
         <w:t xml:space="preserve">. </w:t>
       </w:r>
-      <w:hyperlink r:id="rId42" w:history="1">
+      <w:hyperlink r:id="rId44" w:history="1">
         <w:r>
           <w:rPr>
             <w:rStyle w:val="Hipervnculo"/>
@@ -14345,7 +14970,7 @@
         </w:rPr>
         <w:t xml:space="preserve">. </w:t>
       </w:r>
-      <w:hyperlink r:id="rId43" w:history="1">
+      <w:hyperlink r:id="rId45" w:history="1">
         <w:r>
           <w:rPr>
             <w:rStyle w:val="Hipervnculo"/>
@@ -14401,7 +15026,7 @@
         </w:rPr>
         <w:t xml:space="preserve">Luis Llamas: Ingeniería, informática y diseño. </w:t>
       </w:r>
-      <w:hyperlink r:id="rId44" w:history="1">
+      <w:hyperlink r:id="rId46" w:history="1">
         <w:r>
           <w:rPr>
             <w:rStyle w:val="Hipervnculo"/>
@@ -14443,7 +15068,7 @@
         </w:rPr>
         <w:t xml:space="preserve">Universidad de Granada. </w:t>
       </w:r>
-      <w:hyperlink r:id="rId45" w:history="1">
+      <w:hyperlink r:id="rId47" w:history="1">
         <w:r>
           <w:rPr>
             <w:rStyle w:val="Hipervnculo"/>
@@ -14501,7 +15126,7 @@
         </w:rPr>
         <w:t xml:space="preserve">. </w:t>
       </w:r>
-      <w:hyperlink r:id="rId46" w:history="1">
+      <w:hyperlink r:id="rId48" w:history="1">
         <w:r>
           <w:rPr>
             <w:rStyle w:val="Hipervnculo"/>
@@ -14575,7 +15200,7 @@
         </w:rPr>
         <w:t xml:space="preserve">. </w:t>
       </w:r>
-      <w:hyperlink r:id="rId47" w:history="1">
+      <w:hyperlink r:id="rId49" w:history="1">
         <w:r>
           <w:rPr>
             <w:rStyle w:val="Hipervnculo"/>
@@ -14617,7 +15242,7 @@
         </w:rPr>
         <w:t xml:space="preserve">En Wikipedia. </w:t>
       </w:r>
-      <w:hyperlink r:id="rId48" w:history="1">
+      <w:hyperlink r:id="rId50" w:history="1">
         <w:r>
           <w:rPr>
             <w:rStyle w:val="Hipervnculo"/>
@@ -14651,11 +15276,12 @@
           <w:rFonts w:ascii="Times New Roman" w:hAnsi="Times New Roman" w:cs="Times New Roman"/>
         </w:rPr>
       </w:pPr>
-      <w:bookmarkStart w:id="60" w:name="_Toc240640961"/>
-      <w:r>
-        <w:rPr>
-          <w:rFonts w:ascii="Times New Roman" w:hAnsi="Times New Roman" w:cs="Times New Roman"/>
-        </w:rPr>
+      <w:bookmarkStart w:id="60" w:name="_Toc240650697"/>
+      <w:r>
+        <w:rPr>
+          <w:rFonts w:ascii="Times New Roman" w:hAnsi="Times New Roman" w:cs="Times New Roman"/>
+        </w:rPr>
+        <w:lastRenderedPageBreak/>
         <w:t>Anexos</w:t>
       </w:r>
       <w:bookmarkEnd w:id="60"/>

</xml_diff>

<commit_message>
Correccion de carga de usuarios y compatibilidad multiplataforma
</commit_message>
<xml_diff>
--- a/Documentos/Informe_Final_MarcoVásquez.docx
+++ b/Documentos/Informe_Final_MarcoVásquez.docx
@@ -798,7 +798,7 @@
           <w:r>
             <w:fldChar w:fldCharType="separate"/>
           </w:r>
-          <w:hyperlink w:anchor="_Toc240658278" w:history="1">
+          <w:hyperlink w:anchor="_Toc240661386" w:history="1">
             <w:r>
               <w:rPr>
                 <w:rStyle w:val="Hipervnculo"/>
@@ -826,7 +826,7 @@
                 <w:noProof/>
                 <w:webHidden/>
               </w:rPr>
-              <w:instrText xml:space="preserve"> PAGEREF _Toc240658278 \h </w:instrText>
+              <w:instrText xml:space="preserve"> PAGEREF _Toc240661386 \h </w:instrText>
             </w:r>
             <w:r>
               <w:rPr>
@@ -873,7 +873,7 @@
               <w14:ligatures w14:val="standardContextual"/>
             </w:rPr>
           </w:pPr>
-          <w:hyperlink w:anchor="_Toc240658279" w:history="1">
+          <w:hyperlink w:anchor="_Toc240661387" w:history="1">
             <w:r>
               <w:rPr>
                 <w:rStyle w:val="Hipervnculo"/>
@@ -901,7 +901,7 @@
                 <w:noProof/>
                 <w:webHidden/>
               </w:rPr>
-              <w:instrText xml:space="preserve"> PAGEREF _Toc240658279 \h </w:instrText>
+              <w:instrText xml:space="preserve"> PAGEREF _Toc240661387 \h </w:instrText>
             </w:r>
             <w:r>
               <w:rPr>
@@ -948,7 +948,7 @@
               <w14:ligatures w14:val="standardContextual"/>
             </w:rPr>
           </w:pPr>
-          <w:hyperlink w:anchor="_Toc240658280" w:history="1">
+          <w:hyperlink w:anchor="_Toc240661388" w:history="1">
             <w:r>
               <w:rPr>
                 <w:rStyle w:val="Hipervnculo"/>
@@ -976,7 +976,7 @@
                 <w:noProof/>
                 <w:webHidden/>
               </w:rPr>
-              <w:instrText xml:space="preserve"> PAGEREF _Toc240658280 \h </w:instrText>
+              <w:instrText xml:space="preserve"> PAGEREF _Toc240661388 \h </w:instrText>
             </w:r>
             <w:r>
               <w:rPr>
@@ -1023,7 +1023,7 @@
               <w14:ligatures w14:val="standardContextual"/>
             </w:rPr>
           </w:pPr>
-          <w:hyperlink w:anchor="_Toc240658281" w:history="1">
+          <w:hyperlink w:anchor="_Toc240661389" w:history="1">
             <w:r>
               <w:rPr>
                 <w:rStyle w:val="Hipervnculo"/>
@@ -1051,7 +1051,7 @@
                 <w:noProof/>
                 <w:webHidden/>
               </w:rPr>
-              <w:instrText xml:space="preserve"> PAGEREF _Toc240658281 \h </w:instrText>
+              <w:instrText xml:space="preserve"> PAGEREF _Toc240661389 \h </w:instrText>
             </w:r>
             <w:r>
               <w:rPr>
@@ -1098,7 +1098,7 @@
               <w14:ligatures w14:val="standardContextual"/>
             </w:rPr>
           </w:pPr>
-          <w:hyperlink w:anchor="_Toc240658282" w:history="1">
+          <w:hyperlink w:anchor="_Toc240661390" w:history="1">
             <w:r>
               <w:rPr>
                 <w:rStyle w:val="Hipervnculo"/>
@@ -1126,7 +1126,7 @@
                 <w:noProof/>
                 <w:webHidden/>
               </w:rPr>
-              <w:instrText xml:space="preserve"> PAGEREF _Toc240658282 \h </w:instrText>
+              <w:instrText xml:space="preserve"> PAGEREF _Toc240661390 \h </w:instrText>
             </w:r>
             <w:r>
               <w:rPr>
@@ -1173,7 +1173,7 @@
               <w14:ligatures w14:val="standardContextual"/>
             </w:rPr>
           </w:pPr>
-          <w:hyperlink w:anchor="_Toc240658283" w:history="1">
+          <w:hyperlink w:anchor="_Toc240661391" w:history="1">
             <w:r>
               <w:rPr>
                 <w:rStyle w:val="Hipervnculo"/>
@@ -1201,7 +1201,7 @@
                 <w:noProof/>
                 <w:webHidden/>
               </w:rPr>
-              <w:instrText xml:space="preserve"> PAGEREF _Toc240658283 \h </w:instrText>
+              <w:instrText xml:space="preserve"> PAGEREF _Toc240661391 \h </w:instrText>
             </w:r>
             <w:r>
               <w:rPr>
@@ -1248,7 +1248,7 @@
               <w14:ligatures w14:val="standardContextual"/>
             </w:rPr>
           </w:pPr>
-          <w:hyperlink w:anchor="_Toc240658284" w:history="1">
+          <w:hyperlink w:anchor="_Toc240661392" w:history="1">
             <w:r>
               <w:rPr>
                 <w:rStyle w:val="Hipervnculo"/>
@@ -1276,7 +1276,7 @@
                 <w:noProof/>
                 <w:webHidden/>
               </w:rPr>
-              <w:instrText xml:space="preserve"> PAGEREF _Toc240658284 \h </w:instrText>
+              <w:instrText xml:space="preserve"> PAGEREF _Toc240661392 \h </w:instrText>
             </w:r>
             <w:r>
               <w:rPr>
@@ -1323,7 +1323,7 @@
               <w14:ligatures w14:val="standardContextual"/>
             </w:rPr>
           </w:pPr>
-          <w:hyperlink w:anchor="_Toc240658285" w:history="1">
+          <w:hyperlink w:anchor="_Toc240661393" w:history="1">
             <w:r>
               <w:rPr>
                 <w:rStyle w:val="Hipervnculo"/>
@@ -1351,7 +1351,7 @@
                 <w:noProof/>
                 <w:webHidden/>
               </w:rPr>
-              <w:instrText xml:space="preserve"> PAGEREF _Toc240658285 \h </w:instrText>
+              <w:instrText xml:space="preserve"> PAGEREF _Toc240661393 \h </w:instrText>
             </w:r>
             <w:r>
               <w:rPr>
@@ -1398,7 +1398,7 @@
               <w14:ligatures w14:val="standardContextual"/>
             </w:rPr>
           </w:pPr>
-          <w:hyperlink w:anchor="_Toc240658286" w:history="1">
+          <w:hyperlink w:anchor="_Toc240661394" w:history="1">
             <w:r>
               <w:rPr>
                 <w:rStyle w:val="Hipervnculo"/>
@@ -1426,7 +1426,7 @@
                 <w:noProof/>
                 <w:webHidden/>
               </w:rPr>
-              <w:instrText xml:space="preserve"> PAGEREF _Toc240658286 \h </w:instrText>
+              <w:instrText xml:space="preserve"> PAGEREF _Toc240661394 \h </w:instrText>
             </w:r>
             <w:r>
               <w:rPr>
@@ -1473,7 +1473,7 @@
               <w14:ligatures w14:val="standardContextual"/>
             </w:rPr>
           </w:pPr>
-          <w:hyperlink w:anchor="_Toc240658287" w:history="1">
+          <w:hyperlink w:anchor="_Toc240661395" w:history="1">
             <w:r>
               <w:rPr>
                 <w:rStyle w:val="Hipervnculo"/>
@@ -1501,7 +1501,7 @@
                 <w:noProof/>
                 <w:webHidden/>
               </w:rPr>
-              <w:instrText xml:space="preserve"> PAGEREF _Toc240658287 \h </w:instrText>
+              <w:instrText xml:space="preserve"> PAGEREF _Toc240661395 \h </w:instrText>
             </w:r>
             <w:r>
               <w:rPr>
@@ -1548,7 +1548,7 @@
               <w14:ligatures w14:val="standardContextual"/>
             </w:rPr>
           </w:pPr>
-          <w:hyperlink w:anchor="_Toc240658288" w:history="1">
+          <w:hyperlink w:anchor="_Toc240661396" w:history="1">
             <w:r>
               <w:rPr>
                 <w:rStyle w:val="Hipervnculo"/>
@@ -1576,7 +1576,7 @@
                 <w:noProof/>
                 <w:webHidden/>
               </w:rPr>
-              <w:instrText xml:space="preserve"> PAGEREF _Toc240658288 \h </w:instrText>
+              <w:instrText xml:space="preserve"> PAGEREF _Toc240661396 \h </w:instrText>
             </w:r>
             <w:r>
               <w:rPr>
@@ -1623,7 +1623,7 @@
               <w14:ligatures w14:val="standardContextual"/>
             </w:rPr>
           </w:pPr>
-          <w:hyperlink w:anchor="_Toc240658289" w:history="1">
+          <w:hyperlink w:anchor="_Toc240661397" w:history="1">
             <w:r>
               <w:rPr>
                 <w:rStyle w:val="Hipervnculo"/>
@@ -1651,7 +1651,7 @@
                 <w:noProof/>
                 <w:webHidden/>
               </w:rPr>
-              <w:instrText xml:space="preserve"> PAGEREF _Toc240658289 \h </w:instrText>
+              <w:instrText xml:space="preserve"> PAGEREF _Toc240661397 \h </w:instrText>
             </w:r>
             <w:r>
               <w:rPr>
@@ -1698,7 +1698,7 @@
               <w14:ligatures w14:val="standardContextual"/>
             </w:rPr>
           </w:pPr>
-          <w:hyperlink w:anchor="_Toc240658290" w:history="1">
+          <w:hyperlink w:anchor="_Toc240661398" w:history="1">
             <w:r>
               <w:rPr>
                 <w:rStyle w:val="Hipervnculo"/>
@@ -1726,7 +1726,7 @@
                 <w:noProof/>
                 <w:webHidden/>
               </w:rPr>
-              <w:instrText xml:space="preserve"> PAGEREF _Toc240658290 \h </w:instrText>
+              <w:instrText xml:space="preserve"> PAGEREF _Toc240661398 \h </w:instrText>
             </w:r>
             <w:r>
               <w:rPr>
@@ -1773,7 +1773,7 @@
               <w14:ligatures w14:val="standardContextual"/>
             </w:rPr>
           </w:pPr>
-          <w:hyperlink w:anchor="_Toc240658291" w:history="1">
+          <w:hyperlink w:anchor="_Toc240661399" w:history="1">
             <w:r>
               <w:rPr>
                 <w:rStyle w:val="Hipervnculo"/>
@@ -1801,7 +1801,7 @@
                 <w:noProof/>
                 <w:webHidden/>
               </w:rPr>
-              <w:instrText xml:space="preserve"> PAGEREF _Toc240658291 \h </w:instrText>
+              <w:instrText xml:space="preserve"> PAGEREF _Toc240661399 \h </w:instrText>
             </w:r>
             <w:r>
               <w:rPr>
@@ -1849,7 +1849,7 @@
               <w14:ligatures w14:val="standardContextual"/>
             </w:rPr>
           </w:pPr>
-          <w:hyperlink w:anchor="_Toc240658292" w:history="1">
+          <w:hyperlink w:anchor="_Toc240661400" w:history="1">
             <w:r>
               <w:rPr>
                 <w:rStyle w:val="Hipervnculo"/>
@@ -1897,7 +1897,7 @@
                 <w:noProof/>
                 <w:webHidden/>
               </w:rPr>
-              <w:instrText xml:space="preserve"> PAGEREF _Toc240658292 \h </w:instrText>
+              <w:instrText xml:space="preserve"> PAGEREF _Toc240661400 \h </w:instrText>
             </w:r>
             <w:r>
               <w:rPr>
@@ -1945,7 +1945,7 @@
               <w14:ligatures w14:val="standardContextual"/>
             </w:rPr>
           </w:pPr>
-          <w:hyperlink w:anchor="_Toc240658293" w:history="1">
+          <w:hyperlink w:anchor="_Toc240661401" w:history="1">
             <w:r>
               <w:rPr>
                 <w:rStyle w:val="Hipervnculo"/>
@@ -1972,7 +1972,7 @@
                 <w:rFonts w:ascii="Times New Roman" w:hAnsi="Times New Roman" w:cs="Times New Roman"/>
                 <w:noProof/>
               </w:rPr>
-              <w:t>Explorador nativo de Windows (&lt;commdlg.h&gt;)</w:t>
+              <w:t>Selección de archivos mediante funciones nativas del sistema</w:t>
             </w:r>
             <w:r>
               <w:rPr>
@@ -1993,7 +1993,7 @@
                 <w:noProof/>
                 <w:webHidden/>
               </w:rPr>
-              <w:instrText xml:space="preserve"> PAGEREF _Toc240658293 \h </w:instrText>
+              <w:instrText xml:space="preserve"> PAGEREF _Toc240661401 \h </w:instrText>
             </w:r>
             <w:r>
               <w:rPr>
@@ -2041,7 +2041,7 @@
               <w14:ligatures w14:val="standardContextual"/>
             </w:rPr>
           </w:pPr>
-          <w:hyperlink w:anchor="_Toc240658294" w:history="1">
+          <w:hyperlink w:anchor="_Toc240661402" w:history="1">
             <w:r>
               <w:rPr>
                 <w:rStyle w:val="Hipervnculo"/>
@@ -2089,7 +2089,7 @@
                 <w:noProof/>
                 <w:webHidden/>
               </w:rPr>
-              <w:instrText xml:space="preserve"> PAGEREF _Toc240658294 \h </w:instrText>
+              <w:instrText xml:space="preserve"> PAGEREF _Toc240661402 \h </w:instrText>
             </w:r>
             <w:r>
               <w:rPr>
@@ -2137,7 +2137,7 @@
               <w14:ligatures w14:val="standardContextual"/>
             </w:rPr>
           </w:pPr>
-          <w:hyperlink w:anchor="_Toc240658295" w:history="1">
+          <w:hyperlink w:anchor="_Toc240661403" w:history="1">
             <w:r>
               <w:rPr>
                 <w:rStyle w:val="Hipervnculo"/>
@@ -2185,7 +2185,7 @@
                 <w:noProof/>
                 <w:webHidden/>
               </w:rPr>
-              <w:instrText xml:space="preserve"> PAGEREF _Toc240658295 \h </w:instrText>
+              <w:instrText xml:space="preserve"> PAGEREF _Toc240661403 \h </w:instrText>
             </w:r>
             <w:r>
               <w:rPr>
@@ -2233,7 +2233,7 @@
               <w14:ligatures w14:val="standardContextual"/>
             </w:rPr>
           </w:pPr>
-          <w:hyperlink w:anchor="_Toc240658296" w:history="1">
+          <w:hyperlink w:anchor="_Toc240661404" w:history="1">
             <w:r>
               <w:rPr>
                 <w:rStyle w:val="Hipervnculo"/>
@@ -2281,7 +2281,7 @@
                 <w:noProof/>
                 <w:webHidden/>
               </w:rPr>
-              <w:instrText xml:space="preserve"> PAGEREF _Toc240658296 \h </w:instrText>
+              <w:instrText xml:space="preserve"> PAGEREF _Toc240661404 \h </w:instrText>
             </w:r>
             <w:r>
               <w:rPr>
@@ -2329,7 +2329,7 @@
               <w14:ligatures w14:val="standardContextual"/>
             </w:rPr>
           </w:pPr>
-          <w:hyperlink w:anchor="_Toc240658297" w:history="1">
+          <w:hyperlink w:anchor="_Toc240661405" w:history="1">
             <w:r>
               <w:rPr>
                 <w:rStyle w:val="Hipervnculo"/>
@@ -2377,7 +2377,7 @@
                 <w:noProof/>
                 <w:webHidden/>
               </w:rPr>
-              <w:instrText xml:space="preserve"> PAGEREF _Toc240658297 \h </w:instrText>
+              <w:instrText xml:space="preserve"> PAGEREF _Toc240661405 \h </w:instrText>
             </w:r>
             <w:r>
               <w:rPr>
@@ -2424,7 +2424,7 @@
               <w14:ligatures w14:val="standardContextual"/>
             </w:rPr>
           </w:pPr>
-          <w:hyperlink w:anchor="_Toc240658298" w:history="1">
+          <w:hyperlink w:anchor="_Toc240661406" w:history="1">
             <w:r>
               <w:rPr>
                 <w:rStyle w:val="Hipervnculo"/>
@@ -2452,7 +2452,7 @@
                 <w:noProof/>
                 <w:webHidden/>
               </w:rPr>
-              <w:instrText xml:space="preserve"> PAGEREF _Toc240658298 \h </w:instrText>
+              <w:instrText xml:space="preserve"> PAGEREF _Toc240661406 \h </w:instrText>
             </w:r>
             <w:r>
               <w:rPr>
@@ -2499,7 +2499,7 @@
               <w14:ligatures w14:val="standardContextual"/>
             </w:rPr>
           </w:pPr>
-          <w:hyperlink w:anchor="_Toc240658299" w:history="1">
+          <w:hyperlink w:anchor="_Toc240661407" w:history="1">
             <w:r>
               <w:rPr>
                 <w:rStyle w:val="Hipervnculo"/>
@@ -2527,7 +2527,7 @@
                 <w:noProof/>
                 <w:webHidden/>
               </w:rPr>
-              <w:instrText xml:space="preserve"> PAGEREF _Toc240658299 \h </w:instrText>
+              <w:instrText xml:space="preserve"> PAGEREF _Toc240661407 \h </w:instrText>
             </w:r>
             <w:r>
               <w:rPr>
@@ -2574,7 +2574,7 @@
               <w14:ligatures w14:val="standardContextual"/>
             </w:rPr>
           </w:pPr>
-          <w:hyperlink w:anchor="_Toc240658300" w:history="1">
+          <w:hyperlink w:anchor="_Toc240661408" w:history="1">
             <w:r>
               <w:rPr>
                 <w:rStyle w:val="Hipervnculo"/>
@@ -2602,7 +2602,7 @@
                 <w:noProof/>
                 <w:webHidden/>
               </w:rPr>
-              <w:instrText xml:space="preserve"> PAGEREF _Toc240658300 \h </w:instrText>
+              <w:instrText xml:space="preserve"> PAGEREF _Toc240661408 \h </w:instrText>
             </w:r>
             <w:r>
               <w:rPr>
@@ -2649,7 +2649,7 @@
               <w14:ligatures w14:val="standardContextual"/>
             </w:rPr>
           </w:pPr>
-          <w:hyperlink w:anchor="_Toc240658301" w:history="1">
+          <w:hyperlink w:anchor="_Toc240661409" w:history="1">
             <w:r>
               <w:rPr>
                 <w:rStyle w:val="Hipervnculo"/>
@@ -2677,7 +2677,7 @@
                 <w:noProof/>
                 <w:webHidden/>
               </w:rPr>
-              <w:instrText xml:space="preserve"> PAGEREF _Toc240658301 \h </w:instrText>
+              <w:instrText xml:space="preserve"> PAGEREF _Toc240661409 \h </w:instrText>
             </w:r>
             <w:r>
               <w:rPr>
@@ -2724,7 +2724,7 @@
               <w14:ligatures w14:val="standardContextual"/>
             </w:rPr>
           </w:pPr>
-          <w:hyperlink w:anchor="_Toc240658302" w:history="1">
+          <w:hyperlink w:anchor="_Toc240661410" w:history="1">
             <w:r>
               <w:rPr>
                 <w:rStyle w:val="Hipervnculo"/>
@@ -2752,7 +2752,7 @@
                 <w:noProof/>
                 <w:webHidden/>
               </w:rPr>
-              <w:instrText xml:space="preserve"> PAGEREF _Toc240658302 \h </w:instrText>
+              <w:instrText xml:space="preserve"> PAGEREF _Toc240661410 \h </w:instrText>
             </w:r>
             <w:r>
               <w:rPr>
@@ -2799,7 +2799,7 @@
               <w14:ligatures w14:val="standardContextual"/>
             </w:rPr>
           </w:pPr>
-          <w:hyperlink w:anchor="_Toc240658303" w:history="1">
+          <w:hyperlink w:anchor="_Toc240661411" w:history="1">
             <w:r>
               <w:rPr>
                 <w:rStyle w:val="Hipervnculo"/>
@@ -2827,7 +2827,7 @@
                 <w:noProof/>
                 <w:webHidden/>
               </w:rPr>
-              <w:instrText xml:space="preserve"> PAGEREF _Toc240658303 \h </w:instrText>
+              <w:instrText xml:space="preserve"> PAGEREF _Toc240661411 \h </w:instrText>
             </w:r>
             <w:r>
               <w:rPr>
@@ -2874,7 +2874,7 @@
               <w14:ligatures w14:val="standardContextual"/>
             </w:rPr>
           </w:pPr>
-          <w:hyperlink w:anchor="_Toc240658304" w:history="1">
+          <w:hyperlink w:anchor="_Toc240661412" w:history="1">
             <w:r>
               <w:rPr>
                 <w:rStyle w:val="Hipervnculo"/>
@@ -2902,7 +2902,7 @@
                 <w:noProof/>
                 <w:webHidden/>
               </w:rPr>
-              <w:instrText xml:space="preserve"> PAGEREF _Toc240658304 \h </w:instrText>
+              <w:instrText xml:space="preserve"> PAGEREF _Toc240661412 \h </w:instrText>
             </w:r>
             <w:r>
               <w:rPr>
@@ -2950,7 +2950,7 @@
               <w14:ligatures w14:val="standardContextual"/>
             </w:rPr>
           </w:pPr>
-          <w:hyperlink w:anchor="_Toc240658305" w:history="1">
+          <w:hyperlink w:anchor="_Toc240661413" w:history="1">
             <w:r>
               <w:rPr>
                 <w:rStyle w:val="Hipervnculo"/>
@@ -2998,7 +2998,7 @@
                 <w:noProof/>
                 <w:webHidden/>
               </w:rPr>
-              <w:instrText xml:space="preserve"> PAGEREF _Toc240658305 \h </w:instrText>
+              <w:instrText xml:space="preserve"> PAGEREF _Toc240661413 \h </w:instrText>
             </w:r>
             <w:r>
               <w:rPr>
@@ -3046,7 +3046,7 @@
               <w14:ligatures w14:val="standardContextual"/>
             </w:rPr>
           </w:pPr>
-          <w:hyperlink w:anchor="_Toc240658306" w:history="1">
+          <w:hyperlink w:anchor="_Toc240661414" w:history="1">
             <w:r>
               <w:rPr>
                 <w:rStyle w:val="Hipervnculo"/>
@@ -3094,7 +3094,7 @@
                 <w:noProof/>
                 <w:webHidden/>
               </w:rPr>
-              <w:instrText xml:space="preserve"> PAGEREF _Toc240658306 \h </w:instrText>
+              <w:instrText xml:space="preserve"> PAGEREF _Toc240661414 \h </w:instrText>
             </w:r>
             <w:r>
               <w:rPr>
@@ -3142,7 +3142,7 @@
               <w14:ligatures w14:val="standardContextual"/>
             </w:rPr>
           </w:pPr>
-          <w:hyperlink w:anchor="_Toc240658307" w:history="1">
+          <w:hyperlink w:anchor="_Toc240661415" w:history="1">
             <w:r>
               <w:rPr>
                 <w:rStyle w:val="Hipervnculo"/>
@@ -3190,7 +3190,7 @@
                 <w:noProof/>
                 <w:webHidden/>
               </w:rPr>
-              <w:instrText xml:space="preserve"> PAGEREF _Toc240658307 \h </w:instrText>
+              <w:instrText xml:space="preserve"> PAGEREF _Toc240661415 \h </w:instrText>
             </w:r>
             <w:r>
               <w:rPr>
@@ -3210,7 +3210,7 @@
                 <w:noProof/>
                 <w:webHidden/>
               </w:rPr>
-              <w:t>15</w:t>
+              <w:t>16</w:t>
             </w:r>
             <w:r>
               <w:rPr>
@@ -3237,7 +3237,7 @@
               <w14:ligatures w14:val="standardContextual"/>
             </w:rPr>
           </w:pPr>
-          <w:hyperlink w:anchor="_Toc240658308" w:history="1">
+          <w:hyperlink w:anchor="_Toc240661416" w:history="1">
             <w:r>
               <w:rPr>
                 <w:rStyle w:val="Hipervnculo"/>
@@ -3265,7 +3265,7 @@
                 <w:noProof/>
                 <w:webHidden/>
               </w:rPr>
-              <w:instrText xml:space="preserve"> PAGEREF _Toc240658308 \h </w:instrText>
+              <w:instrText xml:space="preserve"> PAGEREF _Toc240661416 \h </w:instrText>
             </w:r>
             <w:r>
               <w:rPr>
@@ -3313,7 +3313,7 @@
               <w14:ligatures w14:val="standardContextual"/>
             </w:rPr>
           </w:pPr>
-          <w:hyperlink w:anchor="_Toc240658309" w:history="1">
+          <w:hyperlink w:anchor="_Toc240661417" w:history="1">
             <w:r>
               <w:rPr>
                 <w:rStyle w:val="Hipervnculo"/>
@@ -3361,7 +3361,7 @@
                 <w:noProof/>
                 <w:webHidden/>
               </w:rPr>
-              <w:instrText xml:space="preserve"> PAGEREF _Toc240658309 \h </w:instrText>
+              <w:instrText xml:space="preserve"> PAGEREF _Toc240661417 \h </w:instrText>
             </w:r>
             <w:r>
               <w:rPr>
@@ -3409,7 +3409,7 @@
               <w14:ligatures w14:val="standardContextual"/>
             </w:rPr>
           </w:pPr>
-          <w:hyperlink w:anchor="_Toc240658310" w:history="1">
+          <w:hyperlink w:anchor="_Toc240661418" w:history="1">
             <w:r>
               <w:rPr>
                 <w:rStyle w:val="Hipervnculo"/>
@@ -3457,7 +3457,7 @@
                 <w:noProof/>
                 <w:webHidden/>
               </w:rPr>
-              <w:instrText xml:space="preserve"> PAGEREF _Toc240658310 \h </w:instrText>
+              <w:instrText xml:space="preserve"> PAGEREF _Toc240661418 \h </w:instrText>
             </w:r>
             <w:r>
               <w:rPr>
@@ -3504,7 +3504,7 @@
               <w14:ligatures w14:val="standardContextual"/>
             </w:rPr>
           </w:pPr>
-          <w:hyperlink w:anchor="_Toc240658311" w:history="1">
+          <w:hyperlink w:anchor="_Toc240661419" w:history="1">
             <w:r>
               <w:rPr>
                 <w:rStyle w:val="Hipervnculo"/>
@@ -3532,7 +3532,7 @@
                 <w:noProof/>
                 <w:webHidden/>
               </w:rPr>
-              <w:instrText xml:space="preserve"> PAGEREF _Toc240658311 \h </w:instrText>
+              <w:instrText xml:space="preserve"> PAGEREF _Toc240661419 \h </w:instrText>
             </w:r>
             <w:r>
               <w:rPr>
@@ -3579,7 +3579,7 @@
               <w14:ligatures w14:val="standardContextual"/>
             </w:rPr>
           </w:pPr>
-          <w:hyperlink w:anchor="_Toc240658312" w:history="1">
+          <w:hyperlink w:anchor="_Toc240661420" w:history="1">
             <w:r>
               <w:rPr>
                 <w:rStyle w:val="Hipervnculo"/>
@@ -3607,7 +3607,7 @@
                 <w:noProof/>
                 <w:webHidden/>
               </w:rPr>
-              <w:instrText xml:space="preserve"> PAGEREF _Toc240658312 \h </w:instrText>
+              <w:instrText xml:space="preserve"> PAGEREF _Toc240661420 \h </w:instrText>
             </w:r>
             <w:r>
               <w:rPr>
@@ -3627,7 +3627,7 @@
                 <w:noProof/>
                 <w:webHidden/>
               </w:rPr>
-              <w:t>16</w:t>
+              <w:t>17</w:t>
             </w:r>
             <w:r>
               <w:rPr>
@@ -3654,7 +3654,7 @@
               <w14:ligatures w14:val="standardContextual"/>
             </w:rPr>
           </w:pPr>
-          <w:hyperlink w:anchor="_Toc240658313" w:history="1">
+          <w:hyperlink w:anchor="_Toc240661421" w:history="1">
             <w:r>
               <w:rPr>
                 <w:rStyle w:val="Hipervnculo"/>
@@ -3682,7 +3682,7 @@
                 <w:noProof/>
                 <w:webHidden/>
               </w:rPr>
-              <w:instrText xml:space="preserve"> PAGEREF _Toc240658313 \h </w:instrText>
+              <w:instrText xml:space="preserve"> PAGEREF _Toc240661421 \h </w:instrText>
             </w:r>
             <w:r>
               <w:rPr>
@@ -3729,7 +3729,7 @@
               <w14:ligatures w14:val="standardContextual"/>
             </w:rPr>
           </w:pPr>
-          <w:hyperlink w:anchor="_Toc240658314" w:history="1">
+          <w:hyperlink w:anchor="_Toc240661422" w:history="1">
             <w:r>
               <w:rPr>
                 <w:rStyle w:val="Hipervnculo"/>
@@ -3757,7 +3757,7 @@
                 <w:noProof/>
                 <w:webHidden/>
               </w:rPr>
-              <w:instrText xml:space="preserve"> PAGEREF _Toc240658314 \h </w:instrText>
+              <w:instrText xml:space="preserve"> PAGEREF _Toc240661422 \h </w:instrText>
             </w:r>
             <w:r>
               <w:rPr>
@@ -3804,7 +3804,7 @@
               <w14:ligatures w14:val="standardContextual"/>
             </w:rPr>
           </w:pPr>
-          <w:hyperlink w:anchor="_Toc240658315" w:history="1">
+          <w:hyperlink w:anchor="_Toc240661423" w:history="1">
             <w:r>
               <w:rPr>
                 <w:rStyle w:val="Hipervnculo"/>
@@ -3832,7 +3832,7 @@
                 <w:noProof/>
                 <w:webHidden/>
               </w:rPr>
-              <w:instrText xml:space="preserve"> PAGEREF _Toc240658315 \h </w:instrText>
+              <w:instrText xml:space="preserve"> PAGEREF _Toc240661423 \h </w:instrText>
             </w:r>
             <w:r>
               <w:rPr>
@@ -3879,7 +3879,7 @@
               <w14:ligatures w14:val="standardContextual"/>
             </w:rPr>
           </w:pPr>
-          <w:hyperlink w:anchor="_Toc240658316" w:history="1">
+          <w:hyperlink w:anchor="_Toc240661424" w:history="1">
             <w:r>
               <w:rPr>
                 <w:rStyle w:val="Hipervnculo"/>
@@ -3907,7 +3907,7 @@
                 <w:noProof/>
                 <w:webHidden/>
               </w:rPr>
-              <w:instrText xml:space="preserve"> PAGEREF _Toc240658316 \h </w:instrText>
+              <w:instrText xml:space="preserve"> PAGEREF _Toc240661424 \h </w:instrText>
             </w:r>
             <w:r>
               <w:rPr>
@@ -3954,7 +3954,7 @@
               <w14:ligatures w14:val="standardContextual"/>
             </w:rPr>
           </w:pPr>
-          <w:hyperlink w:anchor="_Toc240658317" w:history="1">
+          <w:hyperlink w:anchor="_Toc240661425" w:history="1">
             <w:r>
               <w:rPr>
                 <w:rStyle w:val="Hipervnculo"/>
@@ -3982,7 +3982,7 @@
                 <w:noProof/>
                 <w:webHidden/>
               </w:rPr>
-              <w:instrText xml:space="preserve"> PAGEREF _Toc240658317 \h </w:instrText>
+              <w:instrText xml:space="preserve"> PAGEREF _Toc240661425 \h </w:instrText>
             </w:r>
             <w:r>
               <w:rPr>
@@ -4029,7 +4029,7 @@
               <w14:ligatures w14:val="standardContextual"/>
             </w:rPr>
           </w:pPr>
-          <w:hyperlink w:anchor="_Toc240658318" w:history="1">
+          <w:hyperlink w:anchor="_Toc240661426" w:history="1">
             <w:r>
               <w:rPr>
                 <w:rStyle w:val="Hipervnculo"/>
@@ -4057,7 +4057,7 @@
                 <w:noProof/>
                 <w:webHidden/>
               </w:rPr>
-              <w:instrText xml:space="preserve"> PAGEREF _Toc240658318 \h </w:instrText>
+              <w:instrText xml:space="preserve"> PAGEREF _Toc240661426 \h </w:instrText>
             </w:r>
             <w:r>
               <w:rPr>
@@ -4104,7 +4104,7 @@
               <w14:ligatures w14:val="standardContextual"/>
             </w:rPr>
           </w:pPr>
-          <w:hyperlink w:anchor="_Toc240658319" w:history="1">
+          <w:hyperlink w:anchor="_Toc240661427" w:history="1">
             <w:r>
               <w:rPr>
                 <w:rStyle w:val="Hipervnculo"/>
@@ -4132,7 +4132,7 @@
                 <w:noProof/>
                 <w:webHidden/>
               </w:rPr>
-              <w:instrText xml:space="preserve"> PAGEREF _Toc240658319 \h </w:instrText>
+              <w:instrText xml:space="preserve"> PAGEREF _Toc240661427 \h </w:instrText>
             </w:r>
             <w:r>
               <w:rPr>
@@ -4179,7 +4179,7 @@
               <w14:ligatures w14:val="standardContextual"/>
             </w:rPr>
           </w:pPr>
-          <w:hyperlink w:anchor="_Toc240658320" w:history="1">
+          <w:hyperlink w:anchor="_Toc240661428" w:history="1">
             <w:r>
               <w:rPr>
                 <w:rStyle w:val="Hipervnculo"/>
@@ -4207,7 +4207,7 @@
                 <w:noProof/>
                 <w:webHidden/>
               </w:rPr>
-              <w:instrText xml:space="preserve"> PAGEREF _Toc240658320 \h </w:instrText>
+              <w:instrText xml:space="preserve"> PAGEREF _Toc240661428 \h </w:instrText>
             </w:r>
             <w:r>
               <w:rPr>
@@ -4254,7 +4254,7 @@
               <w14:ligatures w14:val="standardContextual"/>
             </w:rPr>
           </w:pPr>
-          <w:hyperlink w:anchor="_Toc240658321" w:history="1">
+          <w:hyperlink w:anchor="_Toc240661429" w:history="1">
             <w:r>
               <w:rPr>
                 <w:rStyle w:val="Hipervnculo"/>
@@ -4282,7 +4282,7 @@
                 <w:noProof/>
                 <w:webHidden/>
               </w:rPr>
-              <w:instrText xml:space="preserve"> PAGEREF _Toc240658321 \h </w:instrText>
+              <w:instrText xml:space="preserve"> PAGEREF _Toc240661429 \h </w:instrText>
             </w:r>
             <w:r>
               <w:rPr>
@@ -4329,7 +4329,7 @@
               <w14:ligatures w14:val="standardContextual"/>
             </w:rPr>
           </w:pPr>
-          <w:hyperlink w:anchor="_Toc240658322" w:history="1">
+          <w:hyperlink w:anchor="_Toc240661430" w:history="1">
             <w:r>
               <w:rPr>
                 <w:rStyle w:val="Hipervnculo"/>
@@ -4357,7 +4357,7 @@
                 <w:noProof/>
                 <w:webHidden/>
               </w:rPr>
-              <w:instrText xml:space="preserve"> PAGEREF _Toc240658322 \h </w:instrText>
+              <w:instrText xml:space="preserve"> PAGEREF _Toc240661430 \h </w:instrText>
             </w:r>
             <w:r>
               <w:rPr>
@@ -4404,7 +4404,7 @@
               <w14:ligatures w14:val="standardContextual"/>
             </w:rPr>
           </w:pPr>
-          <w:hyperlink w:anchor="_Toc240658323" w:history="1">
+          <w:hyperlink w:anchor="_Toc240661431" w:history="1">
             <w:r>
               <w:rPr>
                 <w:rStyle w:val="Hipervnculo"/>
@@ -4432,7 +4432,7 @@
                 <w:noProof/>
                 <w:webHidden/>
               </w:rPr>
-              <w:instrText xml:space="preserve"> PAGEREF _Toc240658323 \h </w:instrText>
+              <w:instrText xml:space="preserve"> PAGEREF _Toc240661431 \h </w:instrText>
             </w:r>
             <w:r>
               <w:rPr>
@@ -4479,7 +4479,7 @@
               <w14:ligatures w14:val="standardContextual"/>
             </w:rPr>
           </w:pPr>
-          <w:hyperlink w:anchor="_Toc240658324" w:history="1">
+          <w:hyperlink w:anchor="_Toc240661432" w:history="1">
             <w:r>
               <w:rPr>
                 <w:rStyle w:val="Hipervnculo"/>
@@ -4507,7 +4507,7 @@
                 <w:noProof/>
                 <w:webHidden/>
               </w:rPr>
-              <w:instrText xml:space="preserve"> PAGEREF _Toc240658324 \h </w:instrText>
+              <w:instrText xml:space="preserve"> PAGEREF _Toc240661432 \h </w:instrText>
             </w:r>
             <w:r>
               <w:rPr>
@@ -4554,7 +4554,7 @@
               <w14:ligatures w14:val="standardContextual"/>
             </w:rPr>
           </w:pPr>
-          <w:hyperlink w:anchor="_Toc240658325" w:history="1">
+          <w:hyperlink w:anchor="_Toc240661433" w:history="1">
             <w:r>
               <w:rPr>
                 <w:rStyle w:val="Hipervnculo"/>
@@ -4582,7 +4582,7 @@
                 <w:noProof/>
                 <w:webHidden/>
               </w:rPr>
-              <w:instrText xml:space="preserve"> PAGEREF _Toc240658325 \h </w:instrText>
+              <w:instrText xml:space="preserve"> PAGEREF _Toc240661433 \h </w:instrText>
             </w:r>
             <w:r>
               <w:rPr>
@@ -4629,7 +4629,7 @@
               <w14:ligatures w14:val="standardContextual"/>
             </w:rPr>
           </w:pPr>
-          <w:hyperlink w:anchor="_Toc240658326" w:history="1">
+          <w:hyperlink w:anchor="_Toc240661434" w:history="1">
             <w:r>
               <w:rPr>
                 <w:rStyle w:val="Hipervnculo"/>
@@ -4657,7 +4657,7 @@
                 <w:noProof/>
                 <w:webHidden/>
               </w:rPr>
-              <w:instrText xml:space="preserve"> PAGEREF _Toc240658326 \h </w:instrText>
+              <w:instrText xml:space="preserve"> PAGEREF _Toc240661434 \h </w:instrText>
             </w:r>
             <w:r>
               <w:rPr>
@@ -4704,7 +4704,7 @@
               <w14:ligatures w14:val="standardContextual"/>
             </w:rPr>
           </w:pPr>
-          <w:hyperlink w:anchor="_Toc240658327" w:history="1">
+          <w:hyperlink w:anchor="_Toc240661435" w:history="1">
             <w:r>
               <w:rPr>
                 <w:rStyle w:val="Hipervnculo"/>
@@ -4732,7 +4732,7 @@
                 <w:noProof/>
                 <w:webHidden/>
               </w:rPr>
-              <w:instrText xml:space="preserve"> PAGEREF _Toc240658327 \h </w:instrText>
+              <w:instrText xml:space="preserve"> PAGEREF _Toc240661435 \h </w:instrText>
             </w:r>
             <w:r>
               <w:rPr>
@@ -4779,7 +4779,7 @@
               <w14:ligatures w14:val="standardContextual"/>
             </w:rPr>
           </w:pPr>
-          <w:hyperlink w:anchor="_Toc240658328" w:history="1">
+          <w:hyperlink w:anchor="_Toc240661436" w:history="1">
             <w:r>
               <w:rPr>
                 <w:rStyle w:val="Hipervnculo"/>
@@ -4807,7 +4807,7 @@
                 <w:noProof/>
                 <w:webHidden/>
               </w:rPr>
-              <w:instrText xml:space="preserve"> PAGEREF _Toc240658328 \h </w:instrText>
+              <w:instrText xml:space="preserve"> PAGEREF _Toc240661436 \h </w:instrText>
             </w:r>
             <w:r>
               <w:rPr>
@@ -4854,7 +4854,7 @@
               <w14:ligatures w14:val="standardContextual"/>
             </w:rPr>
           </w:pPr>
-          <w:hyperlink w:anchor="_Toc240658329" w:history="1">
+          <w:hyperlink w:anchor="_Toc240661437" w:history="1">
             <w:r>
               <w:rPr>
                 <w:rStyle w:val="Hipervnculo"/>
@@ -4882,7 +4882,7 @@
                 <w:noProof/>
                 <w:webHidden/>
               </w:rPr>
-              <w:instrText xml:space="preserve"> PAGEREF _Toc240658329 \h </w:instrText>
+              <w:instrText xml:space="preserve"> PAGEREF _Toc240661437 \h </w:instrText>
             </w:r>
             <w:r>
               <w:rPr>
@@ -4929,7 +4929,7 @@
               <w14:ligatures w14:val="standardContextual"/>
             </w:rPr>
           </w:pPr>
-          <w:hyperlink w:anchor="_Toc240658330" w:history="1">
+          <w:hyperlink w:anchor="_Toc240661438" w:history="1">
             <w:r>
               <w:rPr>
                 <w:rStyle w:val="Hipervnculo"/>
@@ -4957,7 +4957,7 @@
                 <w:noProof/>
                 <w:webHidden/>
               </w:rPr>
-              <w:instrText xml:space="preserve"> PAGEREF _Toc240658330 \h </w:instrText>
+              <w:instrText xml:space="preserve"> PAGEREF _Toc240661438 \h </w:instrText>
             </w:r>
             <w:r>
               <w:rPr>
@@ -5004,7 +5004,7 @@
               <w14:ligatures w14:val="standardContextual"/>
             </w:rPr>
           </w:pPr>
-          <w:hyperlink w:anchor="_Toc240658331" w:history="1">
+          <w:hyperlink w:anchor="_Toc240661439" w:history="1">
             <w:r>
               <w:rPr>
                 <w:rStyle w:val="Hipervnculo"/>
@@ -5032,7 +5032,7 @@
                 <w:noProof/>
                 <w:webHidden/>
               </w:rPr>
-              <w:instrText xml:space="preserve"> PAGEREF _Toc240658331 \h </w:instrText>
+              <w:instrText xml:space="preserve"> PAGEREF _Toc240661439 \h </w:instrText>
             </w:r>
             <w:r>
               <w:rPr>
@@ -5079,7 +5079,7 @@
               <w14:ligatures w14:val="standardContextual"/>
             </w:rPr>
           </w:pPr>
-          <w:hyperlink w:anchor="_Toc240658332" w:history="1">
+          <w:hyperlink w:anchor="_Toc240661440" w:history="1">
             <w:r>
               <w:rPr>
                 <w:rStyle w:val="Hipervnculo"/>
@@ -5107,7 +5107,7 @@
                 <w:noProof/>
                 <w:webHidden/>
               </w:rPr>
-              <w:instrText xml:space="preserve"> PAGEREF _Toc240658332 \h </w:instrText>
+              <w:instrText xml:space="preserve"> PAGEREF _Toc240661440 \h </w:instrText>
             </w:r>
             <w:r>
               <w:rPr>
@@ -5154,7 +5154,7 @@
               <w14:ligatures w14:val="standardContextual"/>
             </w:rPr>
           </w:pPr>
-          <w:hyperlink w:anchor="_Toc240658333" w:history="1">
+          <w:hyperlink w:anchor="_Toc240661441" w:history="1">
             <w:r>
               <w:rPr>
                 <w:rStyle w:val="Hipervnculo"/>
@@ -5182,7 +5182,7 @@
                 <w:noProof/>
                 <w:webHidden/>
               </w:rPr>
-              <w:instrText xml:space="preserve"> PAGEREF _Toc240658333 \h </w:instrText>
+              <w:instrText xml:space="preserve"> PAGEREF _Toc240661441 \h </w:instrText>
             </w:r>
             <w:r>
               <w:rPr>
@@ -5239,7 +5239,7 @@
         </w:rPr>
       </w:pPr>
       <w:bookmarkStart w:id="1" w:name="_Toc240593474"/>
-      <w:bookmarkStart w:id="2" w:name="_Toc240658278"/>
+      <w:bookmarkStart w:id="2" w:name="_Toc240661386"/>
       <w:r>
         <w:rPr>
           <w:rFonts w:ascii="Times New Roman" w:hAnsi="Times New Roman" w:cs="Times New Roman"/>
@@ -5261,35 +5261,19 @@
         <w:rPr>
           <w:rFonts w:ascii="Times New Roman" w:hAnsi="Times New Roman" w:cs="Times New Roman"/>
         </w:rPr>
-        <w:t>El proyecto presentado se trata de un Cripto-Manager, el cuál es un sistema de cifrado y descifrado de archivos multinivel desarrollado en C++. El sistema aborda la necesidad de asegurar información confidencial procesando tantos textos planos en consola como archivos binarios completos de cualquier extensión, para que nadie que no posea la clave ni sepa el algoritmo correspondiente pueda ver el contenido ni corromperlos. Las tecnologías principales utilizadas fueron el manejo correcto de memoria dinámica, la manipulación de archivos binarios, la implementación de la API de Windows (</w:t>
-      </w:r>
-      <w:proofErr w:type="spellStart"/>
-      <w:r>
-        <w:rPr>
-          <w:rFonts w:ascii="Times New Roman" w:hAnsi="Times New Roman" w:cs="Times New Roman"/>
-        </w:rPr>
-        <w:t>commdlg.h</w:t>
-      </w:r>
-      <w:proofErr w:type="spellEnd"/>
-      <w:r>
-        <w:rPr>
-          <w:rFonts w:ascii="Times New Roman" w:hAnsi="Times New Roman" w:cs="Times New Roman"/>
-        </w:rPr>
-        <w:t xml:space="preserve"> y </w:t>
-      </w:r>
-      <w:proofErr w:type="spellStart"/>
-      <w:r>
-        <w:rPr>
-          <w:rFonts w:ascii="Times New Roman" w:hAnsi="Times New Roman" w:cs="Times New Roman"/>
-        </w:rPr>
-        <w:t>SetConsoleTextAttribute</w:t>
-      </w:r>
-      <w:proofErr w:type="spellEnd"/>
-      <w:r>
-        <w:rPr>
-          <w:rFonts w:ascii="Times New Roman" w:hAnsi="Times New Roman" w:cs="Times New Roman"/>
-        </w:rPr>
-        <w:t>). En este informe el lector podrá encontrar la explicación detallada del funcionamiento del sistema, la lógica matemática de los algoritmos que se implementaron y las técnicas de gestión de memoria dinámica aplicadas.</w:t>
+        <w:t>El proyecto presentado se trata de un Cripto-Manager, el cuál es un sistema de cifrado y descifrado de archivos multinivel desarrollado en C++. El sistema aborda la necesidad de asegurar información confidencial procesando tantos textos planos en consola como archivos binarios completos de cualquier extensión, para que nadie que no posea la clave ni sepa el algoritmo correspondiente pueda ver el contenido ni corromperlos. Las tecnologías principales utilizadas fueron el manejo correcto de memoria dinámica, la manipulación de archivos binarios, la implementación d</w:t>
+      </w:r>
+      <w:r>
+        <w:rPr>
+          <w:rFonts w:ascii="Times New Roman" w:hAnsi="Times New Roman" w:cs="Times New Roman"/>
+        </w:rPr>
+        <w:t>e funciones específicas del sistema operativo para la selección de archivos y personalización de consola, utilizando la API de Windows en este entorno presentado (.exe) y alternativas multiplataforma para otros sistemas.</w:t>
+      </w:r>
+      <w:r>
+        <w:rPr>
+          <w:rFonts w:ascii="Times New Roman" w:hAnsi="Times New Roman" w:cs="Times New Roman"/>
+        </w:rPr>
+        <w:t xml:space="preserve"> En este informe el lector podrá encontrar la explicación detallada del funcionamiento del sistema, la lógica matemática de los algoritmos que se implementaron y las técnicas de gestión de memoria dinámica aplicadas.</w:t>
       </w:r>
     </w:p>
     <w:p>
@@ -5301,7 +5285,7 @@
         </w:rPr>
       </w:pPr>
       <w:bookmarkStart w:id="3" w:name="_Toc240593475"/>
-      <w:bookmarkStart w:id="4" w:name="_Toc240658279"/>
+      <w:bookmarkStart w:id="4" w:name="_Toc240661387"/>
       <w:r>
         <w:rPr>
           <w:rFonts w:ascii="Times New Roman" w:hAnsi="Times New Roman" w:cs="Times New Roman"/>
@@ -5334,7 +5318,7 @@
         </w:rPr>
       </w:pPr>
       <w:bookmarkStart w:id="5" w:name="_Toc240593476"/>
-      <w:bookmarkStart w:id="6" w:name="_Toc240658280"/>
+      <w:bookmarkStart w:id="6" w:name="_Toc240661388"/>
       <w:r>
         <w:rPr>
           <w:rFonts w:ascii="Times New Roman" w:hAnsi="Times New Roman" w:cs="Times New Roman"/>
@@ -5423,7 +5407,13 @@
         <w:rPr>
           <w:rFonts w:ascii="Times New Roman" w:hAnsi="Times New Roman" w:cs="Times New Roman"/>
         </w:rPr>
-        <w:t>Mejorar la experiencia de usuario implementando el explorador de archivos de Windows para la selección de sus archivos de entrada y salida.</w:t>
+        <w:t xml:space="preserve">Mejorar la experiencia de usuario implementando </w:t>
+      </w:r>
+      <w:r>
+        <w:rPr>
+          <w:rFonts w:ascii="Times New Roman" w:hAnsi="Times New Roman" w:cs="Times New Roman"/>
+        </w:rPr>
+        <w:t>la selección de archivos mediante el explorador nativo del sistema operativo cuando esté disponible.</w:t>
       </w:r>
     </w:p>
     <w:p>
@@ -5505,7 +5495,7 @@
         </w:rPr>
       </w:pPr>
       <w:bookmarkStart w:id="7" w:name="_Toc240593477"/>
-      <w:bookmarkStart w:id="8" w:name="_Toc240658281"/>
+      <w:bookmarkStart w:id="8" w:name="_Toc240661389"/>
       <w:r>
         <w:rPr>
           <w:rFonts w:ascii="Times New Roman" w:hAnsi="Times New Roman" w:cs="Times New Roman"/>
@@ -5555,7 +5545,19 @@
         <w:rPr>
           <w:rFonts w:ascii="Times New Roman" w:hAnsi="Times New Roman" w:cs="Times New Roman"/>
         </w:rPr>
-        <w:t>Sus características principales son la interfaz de consola con soporte UTF-8 (para tildes y letra ñ), retroalimentación visual durante ejecución, invocación de cuadros de dialogo de Windows (explorador). El proyecto fue desarrollado en base al cumplimiento de 4 niveles:</w:t>
+        <w:t xml:space="preserve">Sus características principales son la interfaz de consola con soporte UTF-8 (para tildes y letra ñ), retroalimentación visual durante ejecución, invocación </w:t>
+      </w:r>
+      <w:r>
+        <w:rPr>
+          <w:rFonts w:ascii="Times New Roman" w:hAnsi="Times New Roman" w:cs="Times New Roman"/>
+        </w:rPr>
+        <w:t xml:space="preserve">del explorador nativo del sistema operativo para la selección de archivos. </w:t>
+      </w:r>
+      <w:r>
+        <w:rPr>
+          <w:rFonts w:ascii="Times New Roman" w:hAnsi="Times New Roman" w:cs="Times New Roman"/>
+        </w:rPr>
+        <w:t>El proyecto fue desarrollado en base al cumplimiento de 4 niveles:</w:t>
       </w:r>
     </w:p>
     <w:tbl>
@@ -5801,7 +5803,7 @@
           <w:rFonts w:ascii="Times New Roman" w:hAnsi="Times New Roman" w:cs="Times New Roman"/>
         </w:rPr>
       </w:pPr>
-      <w:bookmarkStart w:id="9" w:name="_Toc240658282"/>
+      <w:bookmarkStart w:id="9" w:name="_Toc240661390"/>
       <w:r>
         <w:rPr>
           <w:rFonts w:ascii="Times New Roman" w:hAnsi="Times New Roman" w:cs="Times New Roman"/>
@@ -5821,7 +5823,19 @@
         <w:rPr>
           <w:rFonts w:ascii="Times New Roman" w:hAnsi="Times New Roman" w:cs="Times New Roman"/>
         </w:rPr>
-        <w:t>El usuario dispone al ejecutar el programa son: Iniciar sesión, registrarse, encriptar y desencriptar mensajes en consola, copiar archivos binarios (validar que no haya problemas con archivos), cifrar/descifrar archivos mediante el explorador nativo de Windows, ver el historial completo tabulado, ordenar el historial de manera cronológica, buscar operaciones por filtros de nombre (nombre de usuario) y generar reporte de estadística de uso de los algoritmos.</w:t>
+        <w:t>El usuario dispone al ejecutar el programa son: Iniciar sesión, registrarse, encriptar y desencriptar mensajes en consola, copiar archivos binarios (validar que no haya problemas con archivos), cifrar/descifrar archivos mediante el explorador nativ</w:t>
+      </w:r>
+      <w:r>
+        <w:rPr>
+          <w:rFonts w:ascii="Times New Roman" w:hAnsi="Times New Roman" w:cs="Times New Roman"/>
+        </w:rPr>
+        <w:t>o del sistema operativo</w:t>
+      </w:r>
+      <w:r>
+        <w:rPr>
+          <w:rFonts w:ascii="Times New Roman" w:hAnsi="Times New Roman" w:cs="Times New Roman"/>
+        </w:rPr>
+        <w:t>, ver el historial completo tabulado, ordenar el historial de manera cronológica, buscar operaciones por filtros de nombre (nombre de usuario) y generar reporte de estadística de uso de los algoritmos.</w:t>
       </w:r>
       <w:r>
         <w:rPr>
@@ -5838,7 +5852,7 @@
           <w:rFonts w:ascii="Times New Roman" w:hAnsi="Times New Roman" w:cs="Times New Roman"/>
         </w:rPr>
       </w:pPr>
-      <w:bookmarkStart w:id="10" w:name="_Toc240658283"/>
+      <w:bookmarkStart w:id="10" w:name="_Toc240661391"/>
       <w:r>
         <w:rPr>
           <w:rFonts w:ascii="Times New Roman" w:hAnsi="Times New Roman" w:cs="Times New Roman"/>
@@ -6389,7 +6403,7 @@
           <w:rFonts w:ascii="Times New Roman" w:hAnsi="Times New Roman" w:cs="Times New Roman"/>
         </w:rPr>
       </w:pPr>
-      <w:bookmarkStart w:id="11" w:name="_Toc240658284"/>
+      <w:bookmarkStart w:id="11" w:name="_Toc240661392"/>
       <w:r>
         <w:rPr>
           <w:rFonts w:ascii="Times New Roman" w:hAnsi="Times New Roman" w:cs="Times New Roman"/>
@@ -6520,7 +6534,7 @@
           <w:rFonts w:ascii="Times New Roman" w:hAnsi="Times New Roman" w:cs="Times New Roman"/>
         </w:rPr>
       </w:pPr>
-      <w:bookmarkStart w:id="12" w:name="_Toc240658285"/>
+      <w:bookmarkStart w:id="12" w:name="_Toc240661393"/>
       <w:r>
         <w:rPr>
           <w:rFonts w:ascii="Times New Roman" w:hAnsi="Times New Roman" w:cs="Times New Roman"/>
@@ -6628,6 +6642,7 @@
       <w:r>
         <w:rPr>
           <w:rFonts w:ascii="Times New Roman" w:hAnsi="Times New Roman" w:cs="Times New Roman"/>
+          <w:noProof/>
         </w:rPr>
         <w:drawing>
           <wp:anchor distT="0" distB="0" distL="114300" distR="114300" simplePos="0" relativeHeight="251751424" behindDoc="0" locked="0" layoutInCell="1" allowOverlap="1" wp14:anchorId="6F249AD0" wp14:editId="3707417F">
@@ -6843,6 +6858,7 @@
       <w:r>
         <w:rPr>
           <w:rFonts w:ascii="Times New Roman" w:hAnsi="Times New Roman" w:cs="Times New Roman"/>
+          <w:noProof/>
         </w:rPr>
         <w:drawing>
           <wp:anchor distT="0" distB="0" distL="114300" distR="114300" simplePos="0" relativeHeight="251753472" behindDoc="0" locked="0" layoutInCell="1" allowOverlap="1" wp14:anchorId="20D1B9B3" wp14:editId="257E4182">
@@ -7024,6 +7040,7 @@
       <w:r>
         <w:rPr>
           <w:rFonts w:ascii="Times New Roman" w:hAnsi="Times New Roman" w:cs="Times New Roman"/>
+          <w:noProof/>
         </w:rPr>
         <w:drawing>
           <wp:anchor distT="0" distB="0" distL="114300" distR="114300" simplePos="0" relativeHeight="251755520" behindDoc="0" locked="0" layoutInCell="1" allowOverlap="1" wp14:anchorId="68F4FDA8" wp14:editId="405484FB">
@@ -7200,7 +7217,7 @@
           <w:rFonts w:ascii="Times New Roman" w:hAnsi="Times New Roman" w:cs="Times New Roman"/>
         </w:rPr>
       </w:pPr>
-      <w:bookmarkStart w:id="13" w:name="_Toc240658286"/>
+      <w:bookmarkStart w:id="13" w:name="_Toc240661394"/>
       <w:r>
         <w:rPr>
           <w:rFonts w:ascii="Times New Roman" w:hAnsi="Times New Roman" w:cs="Times New Roman"/>
@@ -7231,7 +7248,7 @@
           <w:rFonts w:ascii="Times New Roman" w:hAnsi="Times New Roman" w:cs="Times New Roman"/>
         </w:rPr>
       </w:pPr>
-      <w:bookmarkStart w:id="14" w:name="_Toc240658287"/>
+      <w:bookmarkStart w:id="14" w:name="_Toc240661395"/>
       <w:r>
         <w:rPr>
           <w:rFonts w:ascii="Times New Roman" w:hAnsi="Times New Roman" w:cs="Times New Roman"/>
@@ -7708,7 +7725,7 @@
           <w:rFonts w:ascii="Times New Roman" w:hAnsi="Times New Roman" w:cs="Times New Roman"/>
         </w:rPr>
       </w:pPr>
-      <w:bookmarkStart w:id="15" w:name="_Toc240658288"/>
+      <w:bookmarkStart w:id="15" w:name="_Toc240661396"/>
       <w:r>
         <w:rPr>
           <w:rFonts w:ascii="Times New Roman" w:hAnsi="Times New Roman" w:cs="Times New Roman"/>
@@ -8037,7 +8054,7 @@
           <w:rFonts w:ascii="Times New Roman" w:hAnsi="Times New Roman" w:cs="Times New Roman"/>
         </w:rPr>
       </w:pPr>
-      <w:bookmarkStart w:id="16" w:name="_Toc240658289"/>
+      <w:bookmarkStart w:id="16" w:name="_Toc240661397"/>
       <w:r>
         <w:rPr>
           <w:rFonts w:ascii="Times New Roman" w:hAnsi="Times New Roman" w:cs="Times New Roman"/>
@@ -8372,7 +8389,7 @@
           <w:rFonts w:ascii="Times New Roman" w:hAnsi="Times New Roman" w:cs="Times New Roman"/>
         </w:rPr>
       </w:pPr>
-      <w:bookmarkStart w:id="17" w:name="_Toc240658290"/>
+      <w:bookmarkStart w:id="17" w:name="_Toc240661398"/>
       <w:r>
         <w:rPr>
           <w:rFonts w:ascii="Times New Roman" w:hAnsi="Times New Roman" w:cs="Times New Roman"/>
@@ -8726,7 +8743,7 @@
           <w:rFonts w:ascii="Times New Roman" w:hAnsi="Times New Roman" w:cs="Times New Roman"/>
         </w:rPr>
       </w:pPr>
-      <w:bookmarkStart w:id="18" w:name="_Toc240658291"/>
+      <w:bookmarkStart w:id="18" w:name="_Toc240661399"/>
       <w:r>
         <w:rPr>
           <w:rFonts w:ascii="Times New Roman" w:hAnsi="Times New Roman" w:cs="Times New Roman"/>
@@ -8755,7 +8772,7 @@
           <w:rFonts w:ascii="Times New Roman" w:hAnsi="Times New Roman" w:cs="Times New Roman"/>
         </w:rPr>
       </w:pPr>
-      <w:bookmarkStart w:id="19" w:name="_Toc240658292"/>
+      <w:bookmarkStart w:id="19" w:name="_Toc240661400"/>
       <w:r>
         <w:rPr>
           <w:rFonts w:ascii="Times New Roman" w:hAnsi="Times New Roman" w:cs="Times New Roman"/>
@@ -8919,97 +8936,88 @@
           <w:rFonts w:ascii="Times New Roman" w:hAnsi="Times New Roman" w:cs="Times New Roman"/>
         </w:rPr>
       </w:pPr>
-      <w:bookmarkStart w:id="20" w:name="_Toc240658293"/>
-      <w:r>
-        <w:rPr>
-          <w:rFonts w:ascii="Times New Roman" w:hAnsi="Times New Roman" w:cs="Times New Roman"/>
-        </w:rPr>
-        <w:t>Explorador nativo de Windows (&lt;</w:t>
+      <w:bookmarkStart w:id="20" w:name="_Toc240661401"/>
+      <w:r>
+        <w:rPr>
+          <w:rFonts w:ascii="Times New Roman" w:hAnsi="Times New Roman" w:cs="Times New Roman"/>
+        </w:rPr>
+        <w:t>Selección de archivos mediante funciones nativas del sistema</w:t>
+      </w:r>
+      <w:bookmarkEnd w:id="20"/>
+    </w:p>
+    <w:p>
+      <w:pPr>
+        <w:ind w:left="360"/>
+        <w:jc w:val="both"/>
+        <w:rPr>
+          <w:rFonts w:ascii="Times New Roman" w:hAnsi="Times New Roman" w:cs="Times New Roman"/>
+        </w:rPr>
+      </w:pPr>
+      <w:r>
+        <w:rPr>
+          <w:rFonts w:ascii="Times New Roman" w:hAnsi="Times New Roman" w:cs="Times New Roman"/>
+        </w:rPr>
+        <w:t xml:space="preserve">Se integraron </w:t>
       </w:r>
       <w:proofErr w:type="spellStart"/>
       <w:r>
         <w:rPr>
           <w:rFonts w:ascii="Times New Roman" w:hAnsi="Times New Roman" w:cs="Times New Roman"/>
         </w:rPr>
-        <w:t>commdlg.h</w:t>
+        <w:t>GetOpenFileNameA</w:t>
       </w:r>
       <w:proofErr w:type="spellEnd"/>
       <w:r>
         <w:rPr>
           <w:rFonts w:ascii="Times New Roman" w:hAnsi="Times New Roman" w:cs="Times New Roman"/>
         </w:rPr>
-        <w:t>&gt;)</w:t>
-      </w:r>
-      <w:bookmarkEnd w:id="20"/>
-    </w:p>
-    <w:p>
-      <w:pPr>
-        <w:ind w:left="360"/>
-        <w:jc w:val="both"/>
-        <w:rPr>
-          <w:rFonts w:ascii="Times New Roman" w:hAnsi="Times New Roman" w:cs="Times New Roman"/>
-        </w:rPr>
-      </w:pPr>
-      <w:r>
-        <w:rPr>
-          <w:rFonts w:ascii="Times New Roman" w:hAnsi="Times New Roman" w:cs="Times New Roman"/>
-        </w:rPr>
-        <w:t xml:space="preserve">Se integraron </w:t>
+        <w:t xml:space="preserve"> y </w:t>
       </w:r>
       <w:proofErr w:type="spellStart"/>
       <w:r>
         <w:rPr>
           <w:rFonts w:ascii="Times New Roman" w:hAnsi="Times New Roman" w:cs="Times New Roman"/>
         </w:rPr>
-        <w:t>GetOpenFileNameA</w:t>
+        <w:t>GetSaveFileNameA</w:t>
       </w:r>
       <w:proofErr w:type="spellEnd"/>
       <w:r>
         <w:rPr>
           <w:rFonts w:ascii="Times New Roman" w:hAnsi="Times New Roman" w:cs="Times New Roman"/>
         </w:rPr>
-        <w:t xml:space="preserve"> y </w:t>
-      </w:r>
-      <w:proofErr w:type="spellStart"/>
-      <w:r>
-        <w:rPr>
-          <w:rFonts w:ascii="Times New Roman" w:hAnsi="Times New Roman" w:cs="Times New Roman"/>
-        </w:rPr>
-        <w:t>GetSaveFileNameA</w:t>
-      </w:r>
-      <w:proofErr w:type="spellEnd"/>
-      <w:r>
-        <w:rPr>
-          <w:rFonts w:ascii="Times New Roman" w:hAnsi="Times New Roman" w:cs="Times New Roman"/>
-        </w:rPr>
         <w:t xml:space="preserve"> para que la selección de archivos sea mediante el explorador, evitando confusiones para los usuarios con las rutas de dichos archivos.</w:t>
       </w:r>
-    </w:p>
-    <w:p>
-      <w:pPr>
-        <w:jc w:val="both"/>
-        <w:rPr>
-          <w:rFonts w:ascii="Times New Roman" w:hAnsi="Times New Roman" w:cs="Times New Roman"/>
-        </w:rPr>
-      </w:pPr>
-      <w:r>
-        <w:rPr>
-          <w:rFonts w:ascii="Times New Roman" w:hAnsi="Times New Roman" w:cs="Times New Roman"/>
-          <w:noProof/>
+      <w:r>
+        <w:rPr>
+          <w:rFonts w:ascii="Times New Roman" w:hAnsi="Times New Roman" w:cs="Times New Roman"/>
+        </w:rPr>
+        <w:t xml:space="preserve"> (Windows)</w:t>
+      </w:r>
+    </w:p>
+    <w:p>
+      <w:pPr>
+        <w:jc w:val="both"/>
+        <w:rPr>
+          <w:rFonts w:ascii="Times New Roman" w:hAnsi="Times New Roman" w:cs="Times New Roman"/>
+        </w:rPr>
+      </w:pPr>
+      <w:r>
+        <w:rPr>
+          <w:rFonts w:ascii="Times New Roman" w:hAnsi="Times New Roman" w:cs="Times New Roman"/>
         </w:rPr>
         <w:drawing>
-          <wp:anchor distT="0" distB="0" distL="114300" distR="114300" simplePos="0" relativeHeight="251679744" behindDoc="0" locked="0" layoutInCell="1" allowOverlap="1" wp14:anchorId="4CB1CC1B" wp14:editId="5BF0070B">
+          <wp:anchor distT="0" distB="0" distL="114300" distR="114300" simplePos="0" relativeHeight="251757568" behindDoc="0" locked="0" layoutInCell="1" allowOverlap="1" wp14:anchorId="328BBBD8" wp14:editId="52838432">
             <wp:simplePos x="0" y="0"/>
             <wp:positionH relativeFrom="margin">
-              <wp:posOffset>3041073</wp:posOffset>
+              <wp:align>left</wp:align>
             </wp:positionH>
             <wp:positionV relativeFrom="paragraph">
-              <wp:posOffset>155575</wp:posOffset>
+              <wp:posOffset>4445</wp:posOffset>
             </wp:positionV>
-            <wp:extent cx="2925445" cy="1815465"/>
-            <wp:effectExtent l="0" t="0" r="8255" b="0"/>
+            <wp:extent cx="2461260" cy="2047875"/>
+            <wp:effectExtent l="0" t="0" r="0" b="9525"/>
             <wp:wrapSquare wrapText="bothSides"/>
-            <wp:docPr id="561642333" name="Imagen 1"/>
+            <wp:docPr id="1094161633" name="Imagen 1"/>
             <wp:cNvGraphicFramePr>
               <a:graphicFrameLocks xmlns:a="http://schemas.openxmlformats.org/drawingml/2006/main" noChangeAspect="1"/>
             </wp:cNvGraphicFramePr>
@@ -9017,7 +9025,7 @@
               <a:graphicData uri="http://schemas.openxmlformats.org/drawingml/2006/picture">
                 <pic:pic xmlns:pic="http://schemas.openxmlformats.org/drawingml/2006/picture">
                   <pic:nvPicPr>
-                    <pic:cNvPr id="561642333" name=""/>
+                    <pic:cNvPr id="1094161633" name=""/>
                     <pic:cNvPicPr/>
                   </pic:nvPicPr>
                   <pic:blipFill>
@@ -9029,7 +9037,7 @@
                   <pic:spPr>
                     <a:xfrm>
                       <a:off x="0" y="0"/>
-                      <a:ext cx="2925445" cy="1815465"/>
+                      <a:ext cx="2461260" cy="2047875"/>
                     </a:xfrm>
                     <a:prstGeom prst="rect">
                       <a:avLst/>
@@ -9049,22 +9057,22 @@
       </w:r>
       <w:r>
         <w:rPr>
-          <w:rFonts w:ascii="Times New Roman" w:hAnsi="Times New Roman" w:cs="Times New Roman"/>
           <w:noProof/>
+          <w14:ligatures w14:val="standardContextual"/>
         </w:rPr>
         <w:drawing>
-          <wp:anchor distT="0" distB="0" distL="114300" distR="114300" simplePos="0" relativeHeight="251678720" behindDoc="0" locked="0" layoutInCell="1" allowOverlap="1" wp14:anchorId="224B05AB" wp14:editId="33252E57">
+          <wp:anchor distT="0" distB="0" distL="114300" distR="114300" simplePos="0" relativeHeight="251759616" behindDoc="0" locked="0" layoutInCell="1" allowOverlap="1" wp14:anchorId="200367A7" wp14:editId="72A87FCD">
             <wp:simplePos x="0" y="0"/>
-            <wp:positionH relativeFrom="margin">
-              <wp:posOffset>-62346</wp:posOffset>
+            <wp:positionH relativeFrom="column">
+              <wp:posOffset>3049905</wp:posOffset>
             </wp:positionH>
             <wp:positionV relativeFrom="paragraph">
-              <wp:posOffset>183168</wp:posOffset>
+              <wp:posOffset>4445</wp:posOffset>
             </wp:positionV>
-            <wp:extent cx="2961640" cy="1745615"/>
-            <wp:effectExtent l="0" t="0" r="0" b="6985"/>
+            <wp:extent cx="2324100" cy="2011680"/>
+            <wp:effectExtent l="0" t="0" r="0" b="7620"/>
             <wp:wrapSquare wrapText="bothSides"/>
-            <wp:docPr id="1285396431" name="Imagen 1"/>
+            <wp:docPr id="1272365052" name="Imagen 1"/>
             <wp:cNvGraphicFramePr>
               <a:graphicFrameLocks xmlns:a="http://schemas.openxmlformats.org/drawingml/2006/main" noChangeAspect="1"/>
             </wp:cNvGraphicFramePr>
@@ -9072,7 +9080,7 @@
               <a:graphicData uri="http://schemas.openxmlformats.org/drawingml/2006/picture">
                 <pic:pic xmlns:pic="http://schemas.openxmlformats.org/drawingml/2006/picture">
                   <pic:nvPicPr>
-                    <pic:cNvPr id="1285396431" name=""/>
+                    <pic:cNvPr id="1272365052" name=""/>
                     <pic:cNvPicPr/>
                   </pic:nvPicPr>
                   <pic:blipFill>
@@ -9084,7 +9092,7 @@
                   <pic:spPr>
                     <a:xfrm>
                       <a:off x="0" y="0"/>
-                      <a:ext cx="2961640" cy="1745615"/>
+                      <a:ext cx="2324100" cy="2011680"/>
                     </a:xfrm>
                     <a:prstGeom prst="rect">
                       <a:avLst/>
@@ -9104,31 +9112,92 @@
       </w:r>
       <w:r>
         <w:rPr>
-          <w:rFonts w:ascii="Times New Roman" w:hAnsi="Times New Roman" w:cs="Times New Roman"/>
+          <w:noProof/>
+          <w14:ligatures w14:val="standardContextual"/>
         </w:rPr>
         <w:t xml:space="preserve"> </w:t>
       </w:r>
-    </w:p>
-    <w:p>
-      <w:pPr>
-        <w:jc w:val="both"/>
-        <w:rPr>
-          <w:rFonts w:ascii="Times New Roman" w:hAnsi="Times New Roman" w:cs="Times New Roman"/>
-        </w:rPr>
-      </w:pPr>
-    </w:p>
-    <w:p>
-      <w:pPr>
-        <w:jc w:val="both"/>
-        <w:rPr>
-          <w:rFonts w:ascii="Times New Roman" w:hAnsi="Times New Roman" w:cs="Times New Roman"/>
-        </w:rPr>
-      </w:pPr>
-      <w:r>
-        <w:rPr>
-          <w:rFonts w:ascii="Times New Roman" w:hAnsi="Times New Roman" w:cs="Times New Roman"/>
-        </w:rPr>
-        <w:t>Ambos códigos hacen que el explorador nativo de Windows se abra para poder seleccionar un archivo a cifrar/descifrar y poder seleccionar donde queremos que se guarde y con que nombre y formato.</w:t>
+      <w:r>
+        <w:rPr>
+          <w:rFonts w:ascii="Times New Roman" w:hAnsi="Times New Roman" w:cs="Times New Roman"/>
+        </w:rPr>
+        <w:t xml:space="preserve"> </w:t>
+      </w:r>
+    </w:p>
+    <w:p>
+      <w:pPr>
+        <w:jc w:val="both"/>
+        <w:rPr>
+          <w:rFonts w:ascii="Times New Roman" w:hAnsi="Times New Roman" w:cs="Times New Roman"/>
+        </w:rPr>
+      </w:pPr>
+    </w:p>
+    <w:p>
+      <w:pPr>
+        <w:jc w:val="both"/>
+        <w:rPr>
+          <w:rFonts w:ascii="Times New Roman" w:hAnsi="Times New Roman" w:cs="Times New Roman"/>
+        </w:rPr>
+      </w:pPr>
+      <w:r>
+        <w:rPr>
+          <w:rFonts w:ascii="Times New Roman" w:hAnsi="Times New Roman" w:cs="Times New Roman"/>
+        </w:rPr>
+        <w:t xml:space="preserve"> </w:t>
+      </w:r>
+    </w:p>
+    <w:p>
+      <w:pPr>
+        <w:jc w:val="both"/>
+        <w:rPr>
+          <w:rFonts w:ascii="Times New Roman" w:hAnsi="Times New Roman" w:cs="Times New Roman"/>
+        </w:rPr>
+      </w:pPr>
+    </w:p>
+    <w:p>
+      <w:pPr>
+        <w:jc w:val="both"/>
+        <w:rPr>
+          <w:rFonts w:ascii="Times New Roman" w:hAnsi="Times New Roman" w:cs="Times New Roman"/>
+        </w:rPr>
+      </w:pPr>
+    </w:p>
+    <w:p>
+      <w:pPr>
+        <w:jc w:val="both"/>
+        <w:rPr>
+          <w:rFonts w:ascii="Times New Roman" w:hAnsi="Times New Roman" w:cs="Times New Roman"/>
+        </w:rPr>
+      </w:pPr>
+    </w:p>
+    <w:p>
+      <w:pPr>
+        <w:jc w:val="both"/>
+        <w:rPr>
+          <w:rFonts w:ascii="Times New Roman" w:hAnsi="Times New Roman" w:cs="Times New Roman"/>
+        </w:rPr>
+      </w:pPr>
+    </w:p>
+    <w:p>
+      <w:pPr>
+        <w:jc w:val="both"/>
+        <w:rPr>
+          <w:rFonts w:ascii="Times New Roman" w:hAnsi="Times New Roman" w:cs="Times New Roman"/>
+        </w:rPr>
+      </w:pPr>
+    </w:p>
+    <w:p>
+      <w:pPr>
+        <w:jc w:val="both"/>
+        <w:rPr>
+          <w:rFonts w:ascii="Times New Roman" w:hAnsi="Times New Roman" w:cs="Times New Roman"/>
+        </w:rPr>
+      </w:pPr>
+      <w:r>
+        <w:rPr>
+          <w:rFonts w:ascii="Times New Roman" w:hAnsi="Times New Roman" w:cs="Times New Roman"/>
+        </w:rPr>
+        <w:t xml:space="preserve">En Windows, ambos códigos hacen que el explorador nativo se abra para poder seleccionar un archivo a cifrar/descifrar y seleccionar donde queremos que se guarde. En otros sistemas operativos se utiliza una alternativa mediante ingreso de la ruta por consola. </w:t>
       </w:r>
     </w:p>
     <w:p>
@@ -9151,7 +9220,7 @@
           <w:rFonts w:ascii="Times New Roman" w:hAnsi="Times New Roman" w:cs="Times New Roman"/>
         </w:rPr>
       </w:pPr>
-      <w:bookmarkStart w:id="21" w:name="_Toc240658294"/>
+      <w:bookmarkStart w:id="21" w:name="_Toc240661402"/>
       <w:r>
         <w:rPr>
           <w:rFonts w:ascii="Times New Roman" w:hAnsi="Times New Roman" w:cs="Times New Roman"/>
@@ -9186,7 +9255,19 @@
         <w:rPr>
           <w:rFonts w:ascii="Times New Roman" w:hAnsi="Times New Roman" w:cs="Times New Roman"/>
         </w:rPr>
-        <w:t xml:space="preserve">(65001)) y la creación de una función </w:t>
+        <w:t>(65001)</w:t>
+      </w:r>
+      <w:r>
+        <w:rPr>
+          <w:rFonts w:ascii="Times New Roman" w:hAnsi="Times New Roman" w:cs="Times New Roman"/>
+        </w:rPr>
+        <w:t xml:space="preserve"> en Windows</w:t>
+      </w:r>
+      <w:r>
+        <w:rPr>
+          <w:rFonts w:ascii="Times New Roman" w:hAnsi="Times New Roman" w:cs="Times New Roman"/>
+        </w:rPr>
+        <w:t xml:space="preserve">) y la creación de una función </w:t>
       </w:r>
       <w:proofErr w:type="spellStart"/>
       <w:r>
@@ -9214,7 +9295,20 @@
         <w:rPr>
           <w:rFonts w:ascii="Times New Roman" w:hAnsi="Times New Roman" w:cs="Times New Roman"/>
         </w:rPr>
-        <w:t xml:space="preserve"> color), que permite manejar los colores de los textos dentro de la consola. </w:t>
+        <w:t xml:space="preserve"> color), que permite manejar los colores de </w:t>
+      </w:r>
+      <w:r>
+        <w:rPr>
+          <w:rFonts w:ascii="Times New Roman" w:hAnsi="Times New Roman" w:cs="Times New Roman"/>
+        </w:rPr>
+        <w:lastRenderedPageBreak/>
+        <w:t xml:space="preserve">los textos dentro de la consola. </w:t>
+      </w:r>
+      <w:r>
+        <w:rPr>
+          <w:rFonts w:ascii="Times New Roman" w:hAnsi="Times New Roman" w:cs="Times New Roman"/>
+        </w:rPr>
+        <w:t>Para otros sistemas operativos se utilizan códigos ANSI equivalentes.</w:t>
       </w:r>
     </w:p>
     <w:p>
@@ -9223,27 +9317,27 @@
         <w:jc w:val="both"/>
         <w:rPr>
           <w:rFonts w:ascii="Times New Roman" w:hAnsi="Times New Roman" w:cs="Times New Roman"/>
-        </w:rPr>
-      </w:pPr>
-      <w:r>
-        <w:rPr>
-          <w:rFonts w:ascii="Times New Roman" w:hAnsi="Times New Roman" w:cs="Times New Roman"/>
           <w:noProof/>
         </w:rPr>
-        <w:lastRenderedPageBreak/>
+      </w:pPr>
+      <w:r>
+        <w:rPr>
+          <w:rFonts w:ascii="Times New Roman" w:hAnsi="Times New Roman" w:cs="Times New Roman"/>
+          <w:noProof/>
+        </w:rPr>
         <w:drawing>
-          <wp:anchor distT="0" distB="0" distL="114300" distR="114300" simplePos="0" relativeHeight="251681792" behindDoc="0" locked="0" layoutInCell="1" allowOverlap="1" wp14:anchorId="16BBBC46" wp14:editId="3B3296D5">
+          <wp:anchor distT="0" distB="0" distL="114300" distR="114300" simplePos="0" relativeHeight="251761664" behindDoc="0" locked="0" layoutInCell="1" allowOverlap="1" wp14:anchorId="6935FE57" wp14:editId="38A4D7D7">
             <wp:simplePos x="0" y="0"/>
             <wp:positionH relativeFrom="margin">
               <wp:align>center</wp:align>
             </wp:positionH>
             <wp:positionV relativeFrom="paragraph">
-              <wp:posOffset>62172</wp:posOffset>
+              <wp:posOffset>0</wp:posOffset>
             </wp:positionV>
-            <wp:extent cx="3551228" cy="624894"/>
-            <wp:effectExtent l="0" t="0" r="0" b="3810"/>
+            <wp:extent cx="2697480" cy="2638425"/>
+            <wp:effectExtent l="0" t="0" r="7620" b="9525"/>
             <wp:wrapSquare wrapText="bothSides"/>
-            <wp:docPr id="562358379" name="Imagen 1"/>
+            <wp:docPr id="1269343079" name="Imagen 1"/>
             <wp:cNvGraphicFramePr>
               <a:graphicFrameLocks xmlns:a="http://schemas.openxmlformats.org/drawingml/2006/main" noChangeAspect="1"/>
             </wp:cNvGraphicFramePr>
@@ -9251,7 +9345,7 @@
               <a:graphicData uri="http://schemas.openxmlformats.org/drawingml/2006/picture">
                 <pic:pic xmlns:pic="http://schemas.openxmlformats.org/drawingml/2006/picture">
                   <pic:nvPicPr>
-                    <pic:cNvPr id="562358379" name=""/>
+                    <pic:cNvPr id="1269343079" name=""/>
                     <pic:cNvPicPr/>
                   </pic:nvPicPr>
                   <pic:blipFill>
@@ -9263,7 +9357,7 @@
                   <pic:spPr>
                     <a:xfrm>
                       <a:off x="0" y="0"/>
-                      <a:ext cx="3551228" cy="624894"/>
+                      <a:ext cx="2697480" cy="2638425"/>
                     </a:xfrm>
                     <a:prstGeom prst="rect">
                       <a:avLst/>
@@ -9272,9 +9366,134 @@
                 </pic:pic>
               </a:graphicData>
             </a:graphic>
+            <wp14:sizeRelH relativeFrom="margin">
+              <wp14:pctWidth>0</wp14:pctWidth>
+            </wp14:sizeRelH>
+            <wp14:sizeRelV relativeFrom="margin">
+              <wp14:pctHeight>0</wp14:pctHeight>
+            </wp14:sizeRelV>
           </wp:anchor>
         </w:drawing>
       </w:r>
+    </w:p>
+    <w:p>
+      <w:pPr>
+        <w:pStyle w:val="Prrafodelista"/>
+        <w:jc w:val="both"/>
+        <w:rPr>
+          <w:rFonts w:ascii="Times New Roman" w:hAnsi="Times New Roman" w:cs="Times New Roman"/>
+          <w:noProof/>
+        </w:rPr>
+      </w:pPr>
+    </w:p>
+    <w:p>
+      <w:pPr>
+        <w:pStyle w:val="Prrafodelista"/>
+        <w:jc w:val="both"/>
+        <w:rPr>
+          <w:rFonts w:ascii="Times New Roman" w:hAnsi="Times New Roman" w:cs="Times New Roman"/>
+          <w:noProof/>
+        </w:rPr>
+      </w:pPr>
+    </w:p>
+    <w:p>
+      <w:pPr>
+        <w:pStyle w:val="Prrafodelista"/>
+        <w:jc w:val="both"/>
+        <w:rPr>
+          <w:rFonts w:ascii="Times New Roman" w:hAnsi="Times New Roman" w:cs="Times New Roman"/>
+          <w:noProof/>
+        </w:rPr>
+      </w:pPr>
+    </w:p>
+    <w:p>
+      <w:pPr>
+        <w:pStyle w:val="Prrafodelista"/>
+        <w:jc w:val="both"/>
+        <w:rPr>
+          <w:rFonts w:ascii="Times New Roman" w:hAnsi="Times New Roman" w:cs="Times New Roman"/>
+          <w:noProof/>
+        </w:rPr>
+      </w:pPr>
+    </w:p>
+    <w:p>
+      <w:pPr>
+        <w:pStyle w:val="Prrafodelista"/>
+        <w:jc w:val="both"/>
+        <w:rPr>
+          <w:rFonts w:ascii="Times New Roman" w:hAnsi="Times New Roman" w:cs="Times New Roman"/>
+          <w:noProof/>
+        </w:rPr>
+      </w:pPr>
+    </w:p>
+    <w:p>
+      <w:pPr>
+        <w:pStyle w:val="Prrafodelista"/>
+        <w:jc w:val="both"/>
+        <w:rPr>
+          <w:rFonts w:ascii="Times New Roman" w:hAnsi="Times New Roman" w:cs="Times New Roman"/>
+        </w:rPr>
+      </w:pPr>
+      <w:r>
+        <w:rPr>
+          <w:rFonts w:ascii="Times New Roman" w:hAnsi="Times New Roman" w:cs="Times New Roman"/>
+        </w:rPr>
+        <w:t xml:space="preserve"> </w:t>
+      </w:r>
+    </w:p>
+    <w:p>
+      <w:pPr>
+        <w:pStyle w:val="Prrafodelista"/>
+        <w:jc w:val="both"/>
+        <w:rPr>
+          <w:rFonts w:ascii="Times New Roman" w:hAnsi="Times New Roman" w:cs="Times New Roman"/>
+        </w:rPr>
+      </w:pPr>
+    </w:p>
+    <w:p>
+      <w:pPr>
+        <w:pStyle w:val="Prrafodelista"/>
+        <w:jc w:val="both"/>
+        <w:rPr>
+          <w:rFonts w:ascii="Times New Roman" w:hAnsi="Times New Roman" w:cs="Times New Roman"/>
+        </w:rPr>
+      </w:pPr>
+    </w:p>
+    <w:p>
+      <w:pPr>
+        <w:pStyle w:val="Prrafodelista"/>
+        <w:jc w:val="both"/>
+        <w:rPr>
+          <w:rFonts w:ascii="Times New Roman" w:hAnsi="Times New Roman" w:cs="Times New Roman"/>
+        </w:rPr>
+      </w:pPr>
+    </w:p>
+    <w:p>
+      <w:pPr>
+        <w:pStyle w:val="Prrafodelista"/>
+        <w:jc w:val="both"/>
+        <w:rPr>
+          <w:rFonts w:ascii="Times New Roman" w:hAnsi="Times New Roman" w:cs="Times New Roman"/>
+        </w:rPr>
+      </w:pPr>
+    </w:p>
+    <w:p>
+      <w:pPr>
+        <w:pStyle w:val="Prrafodelista"/>
+        <w:jc w:val="both"/>
+        <w:rPr>
+          <w:rFonts w:ascii="Times New Roman" w:hAnsi="Times New Roman" w:cs="Times New Roman"/>
+        </w:rPr>
+      </w:pPr>
+    </w:p>
+    <w:p>
+      <w:pPr>
+        <w:pStyle w:val="Prrafodelista"/>
+        <w:jc w:val="both"/>
+        <w:rPr>
+          <w:rFonts w:ascii="Times New Roman" w:hAnsi="Times New Roman" w:cs="Times New Roman"/>
+        </w:rPr>
+      </w:pPr>
     </w:p>
     <w:p>
       <w:pPr>
@@ -9305,7 +9524,7 @@
           <w:rFonts w:ascii="Times New Roman" w:hAnsi="Times New Roman" w:cs="Times New Roman"/>
         </w:rPr>
       </w:pPr>
-      <w:bookmarkStart w:id="22" w:name="_Toc240658295"/>
+      <w:bookmarkStart w:id="22" w:name="_Toc240661403"/>
       <w:r>
         <w:rPr>
           <w:rFonts w:ascii="Times New Roman" w:hAnsi="Times New Roman" w:cs="Times New Roman"/>
@@ -9524,7 +9743,7 @@
           <w:rFonts w:ascii="Times New Roman" w:hAnsi="Times New Roman" w:cs="Times New Roman"/>
         </w:rPr>
       </w:pPr>
-      <w:bookmarkStart w:id="23" w:name="_Toc240658296"/>
+      <w:bookmarkStart w:id="23" w:name="_Toc240661404"/>
       <w:r>
         <w:rPr>
           <w:rFonts w:ascii="Times New Roman" w:hAnsi="Times New Roman" w:cs="Times New Roman"/>
@@ -9675,7 +9894,7 @@
           <w:rFonts w:ascii="Times New Roman" w:hAnsi="Times New Roman" w:cs="Times New Roman"/>
         </w:rPr>
       </w:pPr>
-      <w:bookmarkStart w:id="24" w:name="_Toc240658297"/>
+      <w:bookmarkStart w:id="24" w:name="_Toc240661405"/>
       <w:r>
         <w:rPr>
           <w:rFonts w:ascii="Times New Roman" w:hAnsi="Times New Roman" w:cs="Times New Roman"/>
@@ -9710,7 +9929,14 @@
         <w:rPr>
           <w:rFonts w:ascii="Times New Roman" w:hAnsi="Times New Roman" w:cs="Times New Roman"/>
         </w:rPr>
-        <w:t xml:space="preserve"> poder cifrar/descifrar un archivo sin saber de antemano que algoritmo eligió el usuario. Virtual permite evitar repetir código condicional al momento de escoger que se va a cifrar un archivo. </w:t>
+        <w:t xml:space="preserve"> </w:t>
+      </w:r>
+      <w:r>
+        <w:rPr>
+          <w:rFonts w:ascii="Times New Roman" w:hAnsi="Times New Roman" w:cs="Times New Roman"/>
+        </w:rPr>
+        <w:lastRenderedPageBreak/>
+        <w:t xml:space="preserve">poder cifrar/descifrar un archivo sin saber de antemano que algoritmo eligió el usuario. Virtual permite evitar repetir código condicional al momento de escoger que se va a cifrar un archivo. </w:t>
       </w:r>
     </w:p>
     <w:p>
@@ -9841,12 +10067,11 @@
           <w:rFonts w:ascii="Times New Roman" w:hAnsi="Times New Roman" w:cs="Times New Roman"/>
         </w:rPr>
       </w:pPr>
-      <w:bookmarkStart w:id="25" w:name="_Toc240658298"/>
-      <w:r>
-        <w:rPr>
-          <w:rFonts w:ascii="Times New Roman" w:hAnsi="Times New Roman" w:cs="Times New Roman"/>
-        </w:rPr>
-        <w:lastRenderedPageBreak/>
+      <w:bookmarkStart w:id="25" w:name="_Toc240661406"/>
+      <w:r>
+        <w:rPr>
+          <w:rFonts w:ascii="Times New Roman" w:hAnsi="Times New Roman" w:cs="Times New Roman"/>
+        </w:rPr>
         <w:t>Manual Técnico</w:t>
       </w:r>
       <w:bookmarkEnd w:id="25"/>
@@ -9887,7 +10112,7 @@
           <w:rFonts w:ascii="Times New Roman" w:hAnsi="Times New Roman" w:cs="Times New Roman"/>
         </w:rPr>
       </w:pPr>
-      <w:bookmarkStart w:id="26" w:name="_Toc240658299"/>
+      <w:bookmarkStart w:id="26" w:name="_Toc240661407"/>
       <w:r>
         <w:rPr>
           <w:rFonts w:ascii="Times New Roman" w:hAnsi="Times New Roman" w:cs="Times New Roman"/>
@@ -9904,7 +10129,7 @@
           <w:rFonts w:ascii="Times New Roman" w:hAnsi="Times New Roman" w:cs="Times New Roman"/>
         </w:rPr>
       </w:pPr>
-      <w:bookmarkStart w:id="27" w:name="_Toc240658300"/>
+      <w:bookmarkStart w:id="27" w:name="_Toc240661408"/>
       <w:r>
         <w:rPr>
           <w:rFonts w:ascii="Times New Roman" w:hAnsi="Times New Roman" w:cs="Times New Roman"/>
@@ -10074,7 +10299,7 @@
           <w:rFonts w:ascii="Times New Roman" w:hAnsi="Times New Roman" w:cs="Times New Roman"/>
         </w:rPr>
       </w:pPr>
-      <w:bookmarkStart w:id="28" w:name="_Toc240658301"/>
+      <w:bookmarkStart w:id="28" w:name="_Toc240661409"/>
       <w:r>
         <w:rPr>
           <w:rFonts w:ascii="Times New Roman" w:hAnsi="Times New Roman" w:cs="Times New Roman"/>
@@ -10186,7 +10411,14 @@
         <w:rPr>
           <w:rFonts w:ascii="Times New Roman" w:hAnsi="Times New Roman" w:cs="Times New Roman"/>
         </w:rPr>
-        <w:t>) pueden acceder y asignar directamente este atributo en sus constructores sin que este expuesto de manera pública al exterior de las clases deseadas.</w:t>
+        <w:t xml:space="preserve">) pueden acceder y </w:t>
+      </w:r>
+      <w:r>
+        <w:rPr>
+          <w:rFonts w:ascii="Times New Roman" w:hAnsi="Times New Roman" w:cs="Times New Roman"/>
+        </w:rPr>
+        <w:lastRenderedPageBreak/>
+        <w:t>asignar directamente este atributo en sus constructores sin que este expuesto de manera pública al exterior de las clases deseadas.</w:t>
       </w:r>
       <w:r>
         <w:rPr>
@@ -10292,12 +10524,11 @@
           <w:rFonts w:ascii="Times New Roman" w:hAnsi="Times New Roman" w:cs="Times New Roman"/>
         </w:rPr>
       </w:pPr>
-      <w:bookmarkStart w:id="29" w:name="_Toc240658302"/>
-      <w:r>
-        <w:rPr>
-          <w:rFonts w:ascii="Times New Roman" w:hAnsi="Times New Roman" w:cs="Times New Roman"/>
-        </w:rPr>
-        <w:lastRenderedPageBreak/>
+      <w:bookmarkStart w:id="29" w:name="_Toc240661410"/>
+      <w:r>
+        <w:rPr>
+          <w:rFonts w:ascii="Times New Roman" w:hAnsi="Times New Roman" w:cs="Times New Roman"/>
+        </w:rPr>
         <w:t>Herencia y encapsulamiento</w:t>
       </w:r>
       <w:bookmarkEnd w:id="29"/>
@@ -10461,7 +10692,7 @@
           <w:rFonts w:ascii="Times New Roman" w:hAnsi="Times New Roman" w:cs="Times New Roman"/>
         </w:rPr>
       </w:pPr>
-      <w:bookmarkStart w:id="30" w:name="_Toc240658303"/>
+      <w:bookmarkStart w:id="30" w:name="_Toc240661411"/>
       <w:r>
         <w:rPr>
           <w:rFonts w:ascii="Times New Roman" w:hAnsi="Times New Roman" w:cs="Times New Roman"/>
@@ -10556,7 +10787,7 @@
           <w:rFonts w:ascii="Times New Roman" w:hAnsi="Times New Roman" w:cs="Times New Roman"/>
         </w:rPr>
       </w:pPr>
-      <w:bookmarkStart w:id="31" w:name="_Toc240658304"/>
+      <w:bookmarkStart w:id="31" w:name="_Toc240661412"/>
       <w:r>
         <w:rPr>
           <w:rFonts w:ascii="Times New Roman" w:hAnsi="Times New Roman" w:cs="Times New Roman"/>
@@ -10577,7 +10808,7 @@
           <w:rFonts w:ascii="Times New Roman" w:hAnsi="Times New Roman" w:cs="Times New Roman"/>
         </w:rPr>
       </w:pPr>
-      <w:bookmarkStart w:id="32" w:name="_Toc240658305"/>
+      <w:bookmarkStart w:id="32" w:name="_Toc240661413"/>
       <w:r>
         <w:rPr>
           <w:rFonts w:ascii="Times New Roman" w:hAnsi="Times New Roman" w:cs="Times New Roman"/>
@@ -10748,7 +10979,7 @@
           <w:rFonts w:ascii="Times New Roman" w:hAnsi="Times New Roman" w:cs="Times New Roman"/>
         </w:rPr>
       </w:pPr>
-      <w:bookmarkStart w:id="33" w:name="_Toc240658306"/>
+      <w:bookmarkStart w:id="33" w:name="_Toc240661414"/>
       <w:r>
         <w:rPr>
           <w:rFonts w:ascii="Times New Roman" w:hAnsi="Times New Roman" w:cs="Times New Roman"/>
@@ -10891,11 +11122,12 @@
           <w:rFonts w:ascii="Times New Roman" w:hAnsi="Times New Roman" w:cs="Times New Roman"/>
         </w:rPr>
       </w:pPr>
-      <w:bookmarkStart w:id="34" w:name="_Toc240658307"/>
-      <w:r>
-        <w:rPr>
-          <w:rFonts w:ascii="Times New Roman" w:hAnsi="Times New Roman" w:cs="Times New Roman"/>
-        </w:rPr>
+      <w:bookmarkStart w:id="34" w:name="_Toc240661415"/>
+      <w:r>
+        <w:rPr>
+          <w:rFonts w:ascii="Times New Roman" w:hAnsi="Times New Roman" w:cs="Times New Roman"/>
+        </w:rPr>
+        <w:lastRenderedPageBreak/>
         <w:t xml:space="preserve">Doble puntero (Usuario** </w:t>
       </w:r>
       <w:proofErr w:type="spellStart"/>
@@ -10956,13 +11188,13 @@
           <w:noProof/>
         </w:rPr>
         <w:drawing>
-          <wp:anchor distT="0" distB="0" distL="114300" distR="114300" simplePos="0" relativeHeight="251700224" behindDoc="0" locked="0" layoutInCell="1" allowOverlap="1" wp14:anchorId="3CDD3C41" wp14:editId="0E5D6B53">
+          <wp:anchor distT="0" distB="0" distL="114300" distR="114300" simplePos="0" relativeHeight="251700224" behindDoc="0" locked="0" layoutInCell="1" allowOverlap="1" wp14:anchorId="3CDD3C41" wp14:editId="518E04BB">
             <wp:simplePos x="0" y="0"/>
             <wp:positionH relativeFrom="margin">
-              <wp:align>center</wp:align>
+              <wp:posOffset>1369695</wp:posOffset>
             </wp:positionH>
             <wp:positionV relativeFrom="paragraph">
-              <wp:posOffset>41622</wp:posOffset>
+              <wp:posOffset>19050</wp:posOffset>
             </wp:positionV>
             <wp:extent cx="2853081" cy="284018"/>
             <wp:effectExtent l="0" t="0" r="4445" b="1905"/>
@@ -11008,18 +11240,25 @@
     </w:p>
     <w:p>
       <w:pPr>
+        <w:jc w:val="both"/>
+        <w:rPr>
+          <w:rFonts w:ascii="Times New Roman" w:hAnsi="Times New Roman" w:cs="Times New Roman"/>
+        </w:rPr>
+      </w:pPr>
+    </w:p>
+    <w:p>
+      <w:pPr>
         <w:pStyle w:val="Ttulo2"/>
         <w:jc w:val="both"/>
         <w:rPr>
           <w:rFonts w:ascii="Times New Roman" w:hAnsi="Times New Roman" w:cs="Times New Roman"/>
         </w:rPr>
       </w:pPr>
-      <w:bookmarkStart w:id="35" w:name="_Toc240658308"/>
-      <w:r>
-        <w:rPr>
-          <w:rFonts w:ascii="Times New Roman" w:hAnsi="Times New Roman" w:cs="Times New Roman"/>
-        </w:rPr>
-        <w:lastRenderedPageBreak/>
+      <w:bookmarkStart w:id="35" w:name="_Toc240661416"/>
+      <w:r>
+        <w:rPr>
+          <w:rFonts w:ascii="Times New Roman" w:hAnsi="Times New Roman" w:cs="Times New Roman"/>
+        </w:rPr>
         <w:t>Optimización de memoria</w:t>
       </w:r>
       <w:bookmarkEnd w:id="35"/>
@@ -11036,7 +11275,7 @@
           <w:rFonts w:ascii="Times New Roman" w:hAnsi="Times New Roman" w:cs="Times New Roman"/>
         </w:rPr>
       </w:pPr>
-      <w:bookmarkStart w:id="36" w:name="_Toc240658309"/>
+      <w:bookmarkStart w:id="36" w:name="_Toc240661417"/>
       <w:r>
         <w:rPr>
           <w:rFonts w:ascii="Times New Roman" w:hAnsi="Times New Roman" w:cs="Times New Roman"/>
@@ -11215,7 +11454,7 @@
           <w:rFonts w:ascii="Times New Roman" w:hAnsi="Times New Roman" w:cs="Times New Roman"/>
         </w:rPr>
       </w:pPr>
-      <w:bookmarkStart w:id="37" w:name="_Toc240658310"/>
+      <w:bookmarkStart w:id="37" w:name="_Toc240661418"/>
       <w:r>
         <w:rPr>
           <w:rFonts w:ascii="Times New Roman" w:hAnsi="Times New Roman" w:cs="Times New Roman"/>
@@ -11434,7 +11673,7 @@
           <w:rFonts w:ascii="Times New Roman" w:hAnsi="Times New Roman" w:cs="Times New Roman"/>
         </w:rPr>
       </w:pPr>
-      <w:bookmarkStart w:id="38" w:name="_Toc240658311"/>
+      <w:bookmarkStart w:id="38" w:name="_Toc240661419"/>
       <w:r>
         <w:rPr>
           <w:rFonts w:ascii="Times New Roman" w:hAnsi="Times New Roman" w:cs="Times New Roman"/>
@@ -11479,11 +11718,12 @@
           <w:rFonts w:ascii="Times New Roman" w:hAnsi="Times New Roman" w:cs="Times New Roman"/>
         </w:rPr>
       </w:pPr>
-      <w:bookmarkStart w:id="39" w:name="_Toc240658312"/>
-      <w:r>
-        <w:rPr>
-          <w:rFonts w:ascii="Times New Roman" w:hAnsi="Times New Roman" w:cs="Times New Roman"/>
-        </w:rPr>
+      <w:bookmarkStart w:id="39" w:name="_Toc240661420"/>
+      <w:r>
+        <w:rPr>
+          <w:rFonts w:ascii="Times New Roman" w:hAnsi="Times New Roman" w:cs="Times New Roman"/>
+        </w:rPr>
+        <w:lastRenderedPageBreak/>
         <w:t xml:space="preserve">Entidad </w:t>
       </w:r>
       <w:proofErr w:type="spellStart"/>
@@ -11522,7 +11762,6 @@
           <w:rFonts w:ascii="Times New Roman" w:hAnsi="Times New Roman" w:cs="Times New Roman"/>
           <w:noProof/>
         </w:rPr>
-        <w:lastRenderedPageBreak/>
         <w:drawing>
           <wp:anchor distT="0" distB="0" distL="114300" distR="114300" simplePos="0" relativeHeight="251706368" behindDoc="0" locked="0" layoutInCell="1" allowOverlap="1" wp14:anchorId="369F1383" wp14:editId="0FBC6BE0">
             <wp:simplePos x="0" y="0"/>
@@ -11638,7 +11877,7 @@
           <w:rFonts w:ascii="Times New Roman" w:hAnsi="Times New Roman" w:cs="Times New Roman"/>
         </w:rPr>
       </w:pPr>
-      <w:bookmarkStart w:id="40" w:name="_Toc240658313"/>
+      <w:bookmarkStart w:id="40" w:name="_Toc240661421"/>
       <w:r>
         <w:rPr>
           <w:rFonts w:ascii="Times New Roman" w:hAnsi="Times New Roman" w:cs="Times New Roman"/>
@@ -11814,7 +12053,7 @@
           <w:rFonts w:ascii="Times New Roman" w:hAnsi="Times New Roman" w:cs="Times New Roman"/>
         </w:rPr>
       </w:pPr>
-      <w:bookmarkStart w:id="41" w:name="_Toc240658314"/>
+      <w:bookmarkStart w:id="41" w:name="_Toc240661422"/>
       <w:r>
         <w:rPr>
           <w:rFonts w:ascii="Times New Roman" w:hAnsi="Times New Roman" w:cs="Times New Roman"/>
@@ -11953,7 +12192,7 @@
           <w:rFonts w:ascii="Times New Roman" w:hAnsi="Times New Roman" w:cs="Times New Roman"/>
         </w:rPr>
       </w:pPr>
-      <w:bookmarkStart w:id="42" w:name="_Toc240658315"/>
+      <w:bookmarkStart w:id="42" w:name="_Toc240661423"/>
       <w:r>
         <w:rPr>
           <w:rFonts w:ascii="Times New Roman" w:hAnsi="Times New Roman" w:cs="Times New Roman"/>
@@ -11985,7 +12224,7 @@
           <w:rFonts w:ascii="Times New Roman" w:hAnsi="Times New Roman" w:cs="Times New Roman"/>
         </w:rPr>
       </w:pPr>
-      <w:bookmarkStart w:id="43" w:name="_Toc240658316"/>
+      <w:bookmarkStart w:id="43" w:name="_Toc240661424"/>
       <w:r>
         <w:rPr>
           <w:rFonts w:ascii="Times New Roman" w:hAnsi="Times New Roman" w:cs="Times New Roman"/>
@@ -12244,7 +12483,7 @@
           <w:rFonts w:ascii="Times New Roman" w:hAnsi="Times New Roman" w:cs="Times New Roman"/>
         </w:rPr>
       </w:pPr>
-      <w:bookmarkStart w:id="44" w:name="_Toc240658317"/>
+      <w:bookmarkStart w:id="44" w:name="_Toc240661425"/>
       <w:r>
         <w:rPr>
           <w:rFonts w:ascii="Times New Roman" w:hAnsi="Times New Roman" w:cs="Times New Roman"/>
@@ -12320,7 +12559,13 @@
         <w:rPr>
           <w:rFonts w:ascii="Times New Roman" w:hAnsi="Times New Roman" w:cs="Times New Roman"/>
         </w:rPr>
-        <w:t>Se verifico el flujo correcto para todos los niveles de cifrado/descifrado tanto texto plano en consola como archivos (texto e imágenes). Los archivos se seleccionan con el operador nativo de Windows, y como se mencionó antes hay errores capturados si la ventana se cierra abruptamente o se cancela la operación.</w:t>
+        <w:t xml:space="preserve">Se verifico el flujo correcto para todos los niveles de cifrado/descifrado tanto texto plano en consola como archivos (texto e imágenes). </w:t>
+      </w:r>
+      <w:r>
+        <w:rPr>
+          <w:rFonts w:ascii="Times New Roman" w:hAnsi="Times New Roman" w:cs="Times New Roman"/>
+        </w:rPr>
+        <w:t xml:space="preserve">En Windows, los archivos se seleccionan mediante el explorador nativo del sistema. En otros sistemas operativos, se solicita la ruta del archivo mediante consola. </w:t>
       </w:r>
     </w:p>
     <w:p>
@@ -12559,7 +12804,7 @@
           <w:rFonts w:ascii="Times New Roman" w:hAnsi="Times New Roman" w:cs="Times New Roman"/>
         </w:rPr>
       </w:pPr>
-      <w:bookmarkStart w:id="45" w:name="_Toc240658318"/>
+      <w:bookmarkStart w:id="45" w:name="_Toc240661426"/>
       <w:r>
         <w:rPr>
           <w:rFonts w:ascii="Times New Roman" w:hAnsi="Times New Roman" w:cs="Times New Roman"/>
@@ -12708,7 +12953,7 @@
           <w:rFonts w:ascii="Times New Roman" w:hAnsi="Times New Roman" w:cs="Times New Roman"/>
         </w:rPr>
       </w:pPr>
-      <w:bookmarkStart w:id="46" w:name="_Toc240658319"/>
+      <w:bookmarkStart w:id="46" w:name="_Toc240661427"/>
       <w:r>
         <w:rPr>
           <w:rFonts w:ascii="Times New Roman" w:hAnsi="Times New Roman" w:cs="Times New Roman"/>
@@ -12748,7 +12993,7 @@
           <w:rFonts w:ascii="Times New Roman" w:hAnsi="Times New Roman" w:cs="Times New Roman"/>
         </w:rPr>
       </w:pPr>
-      <w:bookmarkStart w:id="47" w:name="_Toc240658320"/>
+      <w:bookmarkStart w:id="47" w:name="_Toc240661428"/>
       <w:r>
         <w:rPr>
           <w:rFonts w:ascii="Times New Roman" w:hAnsi="Times New Roman" w:cs="Times New Roman"/>
@@ -12765,7 +13010,7 @@
           <w:rFonts w:ascii="Times New Roman" w:hAnsi="Times New Roman" w:cs="Times New Roman"/>
         </w:rPr>
       </w:pPr>
-      <w:bookmarkStart w:id="48" w:name="_Toc240658321"/>
+      <w:bookmarkStart w:id="48" w:name="_Toc240661429"/>
       <w:r>
         <w:rPr>
           <w:rFonts w:ascii="Times New Roman" w:hAnsi="Times New Roman" w:cs="Times New Roman"/>
@@ -12852,7 +13097,7 @@
           <w:rFonts w:ascii="Times New Roman" w:hAnsi="Times New Roman" w:cs="Times New Roman"/>
         </w:rPr>
       </w:pPr>
-      <w:bookmarkStart w:id="49" w:name="_Toc240658322"/>
+      <w:bookmarkStart w:id="49" w:name="_Toc240661430"/>
       <w:r>
         <w:rPr>
           <w:rFonts w:ascii="Times New Roman" w:hAnsi="Times New Roman" w:cs="Times New Roman"/>
@@ -12877,7 +13122,19 @@
         <w:rPr>
           <w:rFonts w:ascii="Times New Roman" w:hAnsi="Times New Roman" w:cs="Times New Roman"/>
         </w:rPr>
-        <w:t xml:space="preserve">Entorno: El entorno actual del programa está pensado para Windows 10 u 11 debido a que se utilizan funciones específicas para Windows y librerías específicas del entorno operativo. </w:t>
+        <w:t xml:space="preserve">Entorno: </w:t>
+      </w:r>
+      <w:r>
+        <w:rPr>
+          <w:rFonts w:ascii="Times New Roman" w:hAnsi="Times New Roman" w:cs="Times New Roman"/>
+        </w:rPr>
+        <w:t>El proyecto esta preparado para compilarse en Windows, Linux y macOS. Algunas funciones específicas del sistema operativo utilizan implementaciones diferentes mediante directivas de compilación, manteniendo el funcionamiento principal del sistema.</w:t>
+      </w:r>
+      <w:r>
+        <w:rPr>
+          <w:rFonts w:ascii="Times New Roman" w:hAnsi="Times New Roman" w:cs="Times New Roman"/>
+        </w:rPr>
+        <w:t xml:space="preserve"> </w:t>
       </w:r>
     </w:p>
     <w:p>
@@ -12915,7 +13172,13 @@
         <w:rPr>
           <w:rFonts w:ascii="Times New Roman" w:hAnsi="Times New Roman" w:cs="Times New Roman"/>
         </w:rPr>
-        <w:t>Portabilidad estática: Compilado estáticamente con las banderas -</w:t>
+        <w:t xml:space="preserve">Portabilidad estática: </w:t>
+      </w:r>
+      <w:r>
+        <w:rPr>
+          <w:rFonts w:ascii="Times New Roman" w:hAnsi="Times New Roman" w:cs="Times New Roman"/>
+        </w:rPr>
+        <w:t>En Windows, el ejecutable compila estáticamente con las banderas -</w:t>
       </w:r>
       <w:proofErr w:type="spellStart"/>
       <w:r>
@@ -12929,21 +13192,55 @@
         <w:rPr>
           <w:rFonts w:ascii="Times New Roman" w:hAnsi="Times New Roman" w:cs="Times New Roman"/>
         </w:rPr>
-        <w:t xml:space="preserve"> -</w:t>
+        <w:t>, -</w:t>
       </w:r>
       <w:proofErr w:type="spellStart"/>
       <w:r>
         <w:rPr>
           <w:rFonts w:ascii="Times New Roman" w:hAnsi="Times New Roman" w:cs="Times New Roman"/>
         </w:rPr>
-        <w:t>static-libgcc-static-libstdc</w:t>
+        <w:t>static-libgcc</w:t>
       </w:r>
       <w:proofErr w:type="spellEnd"/>
       <w:r>
         <w:rPr>
           <w:rFonts w:ascii="Times New Roman" w:hAnsi="Times New Roman" w:cs="Times New Roman"/>
         </w:rPr>
-        <w:t xml:space="preserve">++, lo que garantiza una portabilidad más extensa ya que no requiere la instalación de entornos C++ externos. </w:t>
+        <w:t xml:space="preserve"> y -</w:t>
+      </w:r>
+      <w:proofErr w:type="spellStart"/>
+      <w:r>
+        <w:rPr>
+          <w:rFonts w:ascii="Times New Roman" w:hAnsi="Times New Roman" w:cs="Times New Roman"/>
+        </w:rPr>
+        <w:t>static-libstdc</w:t>
+      </w:r>
+      <w:proofErr w:type="spellEnd"/>
+      <w:r>
+        <w:rPr>
+          <w:rFonts w:ascii="Times New Roman" w:hAnsi="Times New Roman" w:cs="Times New Roman"/>
+        </w:rPr>
+        <w:t xml:space="preserve">++, reduciendo la dependencia de librerías externas del </w:t>
+      </w:r>
+      <w:proofErr w:type="spellStart"/>
+      <w:r>
+        <w:rPr>
+          <w:rFonts w:ascii="Times New Roman" w:hAnsi="Times New Roman" w:cs="Times New Roman"/>
+        </w:rPr>
+        <w:t>runtime</w:t>
+      </w:r>
+      <w:proofErr w:type="spellEnd"/>
+      <w:r>
+        <w:rPr>
+          <w:rFonts w:ascii="Times New Roman" w:hAnsi="Times New Roman" w:cs="Times New Roman"/>
+        </w:rPr>
+        <w:t xml:space="preserve"> en C++.</w:t>
+      </w:r>
+      <w:r>
+        <w:rPr>
+          <w:rFonts w:ascii="Times New Roman" w:hAnsi="Times New Roman" w:cs="Times New Roman"/>
+        </w:rPr>
+        <w:t xml:space="preserve"> </w:t>
       </w:r>
     </w:p>
     <w:p>
@@ -12954,7 +13251,7 @@
           <w:rFonts w:ascii="Times New Roman" w:hAnsi="Times New Roman" w:cs="Times New Roman"/>
         </w:rPr>
       </w:pPr>
-      <w:bookmarkStart w:id="50" w:name="_Toc240658323"/>
+      <w:bookmarkStart w:id="50" w:name="_Toc240661431"/>
       <w:r>
         <w:rPr>
           <w:rFonts w:ascii="Times New Roman" w:hAnsi="Times New Roman" w:cs="Times New Roman"/>
@@ -13052,6 +13349,7 @@
           <w:rFonts w:ascii="Times New Roman" w:hAnsi="Times New Roman" w:cs="Times New Roman"/>
           <w:noProof/>
         </w:rPr>
+        <w:lastRenderedPageBreak/>
         <w:drawing>
           <wp:anchor distT="0" distB="0" distL="114300" distR="114300" simplePos="0" relativeHeight="251728896" behindDoc="0" locked="0" layoutInCell="1" allowOverlap="1" wp14:anchorId="5A3562CF" wp14:editId="4D1C7717">
             <wp:simplePos x="0" y="0"/>
@@ -13149,7 +13447,7 @@
           <w:rFonts w:ascii="Times New Roman" w:hAnsi="Times New Roman" w:cs="Times New Roman"/>
         </w:rPr>
       </w:pPr>
-      <w:bookmarkStart w:id="51" w:name="_Toc240658324"/>
+      <w:bookmarkStart w:id="51" w:name="_Toc240661432"/>
       <w:r>
         <w:rPr>
           <w:rFonts w:ascii="Times New Roman" w:hAnsi="Times New Roman" w:cs="Times New Roman"/>
@@ -13522,7 +13820,7 @@
           <w:rFonts w:ascii="Times New Roman" w:hAnsi="Times New Roman" w:cs="Times New Roman"/>
         </w:rPr>
       </w:pPr>
-      <w:bookmarkStart w:id="52" w:name="_Toc240658325"/>
+      <w:bookmarkStart w:id="52" w:name="_Toc240661433"/>
       <w:r>
         <w:rPr>
           <w:rFonts w:ascii="Times New Roman" w:hAnsi="Times New Roman" w:cs="Times New Roman"/>
@@ -13831,7 +14129,7 @@
           <w:rFonts w:ascii="Times New Roman" w:hAnsi="Times New Roman" w:cs="Times New Roman"/>
         </w:rPr>
       </w:pPr>
-      <w:bookmarkStart w:id="53" w:name="_Toc240658326"/>
+      <w:bookmarkStart w:id="53" w:name="_Toc240661434"/>
       <w:r>
         <w:rPr>
           <w:rFonts w:ascii="Times New Roman" w:hAnsi="Times New Roman" w:cs="Times New Roman"/>
@@ -13849,7 +14147,7 @@
           <w:rFonts w:ascii="Times New Roman" w:hAnsi="Times New Roman" w:cs="Times New Roman"/>
         </w:rPr>
       </w:pPr>
-      <w:bookmarkStart w:id="54" w:name="_Toc240658327"/>
+      <w:bookmarkStart w:id="54" w:name="_Toc240661435"/>
       <w:r>
         <w:rPr>
           <w:rFonts w:ascii="Times New Roman" w:hAnsi="Times New Roman" w:cs="Times New Roman"/>
@@ -13954,7 +14252,19 @@
         <w:rPr>
           <w:rFonts w:ascii="Times New Roman" w:hAnsi="Times New Roman" w:cs="Times New Roman"/>
         </w:rPr>
-        <w:t>) mediante las ventanas nativas del explorador de Windows. El proceso se guarda en el historial como “Copia” de tipo “Binario”. Implementado para comprobar que el sistema no corrompe los archivos en su lectura.</w:t>
+        <w:t xml:space="preserve">) mediante </w:t>
+      </w:r>
+      <w:r>
+        <w:rPr>
+          <w:rFonts w:ascii="Times New Roman" w:hAnsi="Times New Roman" w:cs="Times New Roman"/>
+        </w:rPr>
+        <w:t>el selector de archivos nativo del sistema operativo</w:t>
+      </w:r>
+      <w:r>
+        <w:rPr>
+          <w:rFonts w:ascii="Times New Roman" w:hAnsi="Times New Roman" w:cs="Times New Roman"/>
+        </w:rPr>
+        <w:t>. El proceso se guarda en el historial como “Copia” de tipo “Binario”. Implementado para comprobar que el sistema no corrompe los archivos en su lectura.</w:t>
       </w:r>
     </w:p>
     <w:p>
@@ -14056,7 +14366,7 @@
           <w:rFonts w:ascii="Times New Roman" w:hAnsi="Times New Roman" w:cs="Times New Roman"/>
         </w:rPr>
       </w:pPr>
-      <w:bookmarkStart w:id="55" w:name="_Toc240658328"/>
+      <w:bookmarkStart w:id="55" w:name="_Toc240661436"/>
       <w:r>
         <w:rPr>
           <w:rFonts w:ascii="Times New Roman" w:hAnsi="Times New Roman" w:cs="Times New Roman"/>
@@ -14076,7 +14386,19 @@
         <w:rPr>
           <w:rFonts w:ascii="Times New Roman" w:hAnsi="Times New Roman" w:cs="Times New Roman"/>
         </w:rPr>
-        <w:t xml:space="preserve">Permite cifrar o descifrar archivos con el algoritmo que el usuario seleccione. Se le solicita al usuario escoger un algoritmo, un tipo de acción y para los tres métodos ingresar una clave (para César se aceptan números del 1 al 255 por temas de binario). Se abre la interfaz gráfica, que es la ventana del explorador de Windows, para seleccionar el archivo y la dirección/nombre y formato en el que quiere que se guarde. La confirmación exitosa se muestra en verde, si algo falla al abrir el archivo o donde se guardara se muestra en rojo. </w:t>
+        <w:t xml:space="preserve">Permite cifrar o descifrar archivos con el algoritmo que el usuario seleccione. Se le solicita al usuario escoger un algoritmo, un tipo de acción y para los tres métodos ingresar una clave (para César se aceptan números del 1 al 255 por temas de binario). </w:t>
+      </w:r>
+      <w:r>
+        <w:rPr>
+          <w:rFonts w:ascii="Times New Roman" w:hAnsi="Times New Roman" w:cs="Times New Roman"/>
+        </w:rPr>
+        <w:t>En Windows se abre el explorador nativo para seleccionar el archivo y la ubicación donde se guardará. En otros sistemas operativos se solicita la ruta mediante consola.</w:t>
+      </w:r>
+      <w:r>
+        <w:rPr>
+          <w:rFonts w:ascii="Times New Roman" w:hAnsi="Times New Roman" w:cs="Times New Roman"/>
+        </w:rPr>
+        <w:t xml:space="preserve"> La confirmación exitosa se muestra en verde, si algo falla al abrir el archivo o donde se guardara se muestra en rojo. </w:t>
       </w:r>
     </w:p>
     <w:p>
@@ -14210,7 +14532,7 @@
           <w:rFonts w:ascii="Times New Roman" w:hAnsi="Times New Roman" w:cs="Times New Roman"/>
         </w:rPr>
       </w:pPr>
-      <w:bookmarkStart w:id="56" w:name="_Toc240658329"/>
+      <w:bookmarkStart w:id="56" w:name="_Toc240661437"/>
       <w:r>
         <w:rPr>
           <w:rFonts w:ascii="Times New Roman" w:hAnsi="Times New Roman" w:cs="Times New Roman"/>
@@ -14268,6 +14590,7 @@
         <w:rPr>
           <w:rFonts w:ascii="Times New Roman" w:hAnsi="Times New Roman" w:cs="Times New Roman"/>
         </w:rPr>
+        <w:lastRenderedPageBreak/>
         <w:t>Ordenar historial por fecha: Aplica el ordenamiento burbuja sobre todos los registros guardados y los ordena según su fecha de realización.</w:t>
       </w:r>
     </w:p>
@@ -14287,7 +14610,6 @@
         <w:rPr>
           <w:rFonts w:ascii="Times New Roman" w:hAnsi="Times New Roman" w:cs="Times New Roman"/>
         </w:rPr>
-        <w:lastRenderedPageBreak/>
         <w:t>Buscar operaciones por usuario: Filtra y despliega únicamente las operaciones realizadas por un usuario. Si el usuario ingresado no existe se mostrará el error en pantalla en color rojo.</w:t>
       </w:r>
     </w:p>
@@ -14451,7 +14773,7 @@
           <w:rFonts w:ascii="Times New Roman" w:hAnsi="Times New Roman" w:cs="Times New Roman"/>
         </w:rPr>
       </w:pPr>
-      <w:bookmarkStart w:id="57" w:name="_Toc240658330"/>
+      <w:bookmarkStart w:id="57" w:name="_Toc240661438"/>
       <w:r>
         <w:rPr>
           <w:rFonts w:ascii="Times New Roman" w:hAnsi="Times New Roman" w:cs="Times New Roman"/>
@@ -14476,7 +14798,13 @@
         <w:rPr>
           <w:rFonts w:ascii="Times New Roman" w:hAnsi="Times New Roman" w:cs="Times New Roman"/>
         </w:rPr>
-        <w:t>Cancelación del explorador: Si al momento de seleccionar una de las opciones que abren el explorador de Windows y seleccionas cancelar, el programa no tronará, en pantalla se mostrará un mensaje en rojo indicando que la operación se canceló (debido a que no se seleccionó nada).</w:t>
+        <w:t xml:space="preserve">Cancelación </w:t>
+      </w:r>
+      <w:r>
+        <w:rPr>
+          <w:rFonts w:ascii="Times New Roman" w:hAnsi="Times New Roman" w:cs="Times New Roman"/>
+        </w:rPr>
+        <w:t>de selección de archivo: Si al momento de seleccionar una de las opciones se cancela la selección del archivo, el programa no tronará y mostrará un mensaje en rojo indicando que la operación fue cancelada.</w:t>
       </w:r>
     </w:p>
     <w:p>
@@ -14673,12 +15001,11 @@
           <w:rFonts w:ascii="Times New Roman" w:hAnsi="Times New Roman" w:cs="Times New Roman"/>
         </w:rPr>
       </w:pPr>
-      <w:bookmarkStart w:id="58" w:name="_Toc240658331"/>
-      <w:r>
-        <w:rPr>
-          <w:rFonts w:ascii="Times New Roman" w:hAnsi="Times New Roman" w:cs="Times New Roman"/>
-        </w:rPr>
-        <w:lastRenderedPageBreak/>
+      <w:bookmarkStart w:id="58" w:name="_Toc240661439"/>
+      <w:r>
+        <w:rPr>
+          <w:rFonts w:ascii="Times New Roman" w:hAnsi="Times New Roman" w:cs="Times New Roman"/>
+        </w:rPr>
         <w:t>Conclusiones</w:t>
       </w:r>
       <w:bookmarkEnd w:id="58"/>
@@ -14808,7 +15135,7 @@
           <w:rFonts w:ascii="Times New Roman" w:hAnsi="Times New Roman" w:cs="Times New Roman"/>
         </w:rPr>
       </w:pPr>
-      <w:bookmarkStart w:id="59" w:name="_Toc240658332"/>
+      <w:bookmarkStart w:id="59" w:name="_Toc240661440"/>
       <w:r>
         <w:rPr>
           <w:rFonts w:ascii="Times New Roman" w:hAnsi="Times New Roman" w:cs="Times New Roman"/>
@@ -15225,12 +15552,11 @@
           <w:rFonts w:ascii="Times New Roman" w:hAnsi="Times New Roman" w:cs="Times New Roman"/>
         </w:rPr>
       </w:pPr>
-      <w:bookmarkStart w:id="60" w:name="_Toc240658333"/>
-      <w:r>
-        <w:rPr>
-          <w:rFonts w:ascii="Times New Roman" w:hAnsi="Times New Roman" w:cs="Times New Roman"/>
-        </w:rPr>
-        <w:lastRenderedPageBreak/>
+      <w:bookmarkStart w:id="60" w:name="_Toc240661441"/>
+      <w:r>
+        <w:rPr>
+          <w:rFonts w:ascii="Times New Roman" w:hAnsi="Times New Roman" w:cs="Times New Roman"/>
+        </w:rPr>
         <w:t>Anexos</w:t>
       </w:r>
       <w:bookmarkEnd w:id="60"/>

</xml_diff>